<commit_message>
Remove the screen and add the filled college forms
- Firmware: drop the OLED display module; emoji faces are shown only in
  the web dashboard and Android app; button plays the mood melody
- Docs, wiring diagram and Word guides updated without the screen
- Add docs/forms: filled forms 1-3 (proposal, plan with UML/ERD/
  relational model/normalization/wiring/prototype, submission)

Co-Authored-By: Claude Opus 5.5 <noreply@anthropic.com>
Claude-Session: https://claude.ai/code/session_01LUEXdLPnpgGnWTyNRXft8r
</commit_message>
<xml_diff>
--- a/rayy/docs/Rayy-Build-Guide.docx
+++ b/rayy/docs/Rayy-Build-Guide.docx
@@ -2611,7 +2611,7 @@
                 <w:sz w:val="18"/>
                 <w:szCs w:val="18"/>
               </w:rPr>
-              <w:t xml:space="preserve">Dashboard shows the same emoji as the OLED, badge “Online”</w:t>
+              <w:t xml:space="preserve">Dashboard shows the plant’s emoji, badge “Online”</w:t>
             </w:r>
           </w:p>
         </w:tc>
@@ -3252,7 +3252,7 @@
           <w:sz w:val="20"/>
           <w:szCs w:val="20"/>
         </w:rPr>
-        <w:t xml:space="preserve"> (Arabic + English names, quantities, expected prices ≈ 190–350 SAR). Important: capacitive soil sensor, </w:t>
+        <w:t xml:space="preserve"> (Arabic + English names, quantities, expected prices ≈ 175–312 SAR). Important: capacitive soil sensor, </w:t>
       </w:r>
       <w:r>
         <w:rPr>
@@ -3270,7 +3270,7 @@
           <w:sz w:val="20"/>
           <w:szCs w:val="20"/>
         </w:rPr>
-        <w:t xml:space="preserve"> buzzer, 4-pin I2C OLED, </w:t>
+        <w:t xml:space="preserve"> buzzer, </w:t>
       </w:r>
       <w:r>
         <w:rPr>
@@ -3612,24 +3612,6 @@
           <w:szCs w:val="20"/>
         </w:rPr>
         <w:t xml:space="preserve"> → install </w:t>
-      </w:r>
-      <w:r>
-        <w:rPr>
-          <w:rFonts w:ascii="Arial" w:cs="Arial" w:eastAsia="Arial" w:hAnsi="Arial"/>
-          <w:b/>
-          <w:bCs/>
-          <w:sz w:val="20"/>
-          <w:szCs w:val="20"/>
-        </w:rPr>
-        <w:t xml:space="preserve">Adafruit SSD1306</w:t>
-      </w:r>
-      <w:r>
-        <w:rPr>
-          <w:rFonts w:ascii="Arial" w:cs="Arial" w:eastAsia="Arial" w:hAnsi="Arial"/>
-          <w:sz w:val="20"/>
-          <w:szCs w:val="20"/>
-        </w:rPr>
-        <w:t xml:space="preserve">, </w:t>
       </w:r>
       <w:r>
         <w:rPr>
@@ -4736,7 +4718,7 @@
                 <w:sz w:val="18"/>
                 <w:szCs w:val="18"/>
               </w:rPr>
-              <w:t xml:space="preserve">OLED SSD1306</w:t>
+              <w:t xml:space="preserve">Passive buzzer</w:t>
             </w:r>
           </w:p>
         </w:tc>
@@ -4765,7 +4747,7 @@
                 <w:sz w:val="18"/>
                 <w:szCs w:val="18"/>
               </w:rPr>
-              <w:t xml:space="preserve">VCC → 3V3 · GND → GND · SDA → </w:t>
+              <w:t xml:space="preserve">(+) → </w:t>
             </w:r>
             <w:r>
               <w:rPr>
@@ -4775,15 +4757,15 @@
                 <w:sz w:val="18"/>
                 <w:szCs w:val="18"/>
               </w:rPr>
-              <w:t xml:space="preserve">GPIO21</w:t>
-            </w:r>
-            <w:r>
-              <w:rPr>
-                <w:rFonts w:ascii="Arial" w:cs="Arial" w:eastAsia="Arial" w:hAnsi="Arial"/>
-                <w:sz w:val="18"/>
-                <w:szCs w:val="18"/>
-              </w:rPr>
-              <w:t xml:space="preserve"> · SCL → </w:t>
+              <w:t xml:space="preserve">100 Ω</w:t>
+            </w:r>
+            <w:r>
+              <w:rPr>
+                <w:rFonts w:ascii="Arial" w:cs="Arial" w:eastAsia="Arial" w:hAnsi="Arial"/>
+                <w:sz w:val="18"/>
+                <w:szCs w:val="18"/>
+              </w:rPr>
+              <w:t xml:space="preserve"> → </w:t>
             </w:r>
             <w:r>
               <w:rPr>
@@ -4793,7 +4775,15 @@
                 <w:sz w:val="18"/>
                 <w:szCs w:val="18"/>
               </w:rPr>
-              <w:t xml:space="preserve">GPIO22</w:t>
+              <w:t xml:space="preserve">GPIO25</w:t>
+            </w:r>
+            <w:r>
+              <w:rPr>
+                <w:rFonts w:ascii="Arial" w:cs="Arial" w:eastAsia="Arial" w:hAnsi="Arial"/>
+                <w:sz w:val="18"/>
+                <w:szCs w:val="18"/>
+              </w:rPr>
+              <w:t xml:space="preserve"> · (−) → GND</w:t>
             </w:r>
           </w:p>
         </w:tc>
@@ -4826,7 +4816,7 @@
                 <w:sz w:val="18"/>
                 <w:szCs w:val="18"/>
               </w:rPr>
-              <w:t xml:space="preserve">Passive buzzer</w:t>
+              <w:t xml:space="preserve">Push button</w:t>
             </w:r>
           </w:p>
         </w:tc>
@@ -4854,7 +4844,7 @@
                 <w:sz w:val="18"/>
                 <w:szCs w:val="18"/>
               </w:rPr>
-              <w:t xml:space="preserve">(+) → </w:t>
+              <w:t xml:space="preserve">one leg → </w:t>
             </w:r>
             <w:r>
               <w:rPr>
@@ -4864,33 +4854,15 @@
                 <w:sz w:val="18"/>
                 <w:szCs w:val="18"/>
               </w:rPr>
-              <w:t xml:space="preserve">100 Ω</w:t>
-            </w:r>
-            <w:r>
-              <w:rPr>
-                <w:rFonts w:ascii="Arial" w:cs="Arial" w:eastAsia="Arial" w:hAnsi="Arial"/>
-                <w:sz w:val="18"/>
-                <w:szCs w:val="18"/>
-              </w:rPr>
-              <w:t xml:space="preserve"> → </w:t>
-            </w:r>
-            <w:r>
-              <w:rPr>
-                <w:rFonts w:ascii="Arial" w:cs="Arial" w:eastAsia="Arial" w:hAnsi="Arial"/>
-                <w:b/>
-                <w:bCs/>
-                <w:sz w:val="18"/>
-                <w:szCs w:val="18"/>
-              </w:rPr>
-              <w:t xml:space="preserve">GPIO25</w:t>
-            </w:r>
-            <w:r>
-              <w:rPr>
-                <w:rFonts w:ascii="Arial" w:cs="Arial" w:eastAsia="Arial" w:hAnsi="Arial"/>
-                <w:sz w:val="18"/>
-                <w:szCs w:val="18"/>
-              </w:rPr>
-              <w:t xml:space="preserve"> · (−) → GND</w:t>
+              <w:t xml:space="preserve">GPIO13</w:t>
+            </w:r>
+            <w:r>
+              <w:rPr>
+                <w:rFonts w:ascii="Arial" w:cs="Arial" w:eastAsia="Arial" w:hAnsi="Arial"/>
+                <w:sz w:val="18"/>
+                <w:szCs w:val="18"/>
+              </w:rPr>
+              <w:t xml:space="preserve"> · other leg → GND</w:t>
             </w:r>
           </w:p>
         </w:tc>
@@ -4924,7 +4896,7 @@
                 <w:sz w:val="18"/>
                 <w:szCs w:val="18"/>
               </w:rPr>
-              <w:t xml:space="preserve">Push button</w:t>
+              <w:t xml:space="preserve">Power</w:t>
             </w:r>
           </w:p>
         </w:tc>
@@ -4938,85 +4910,6 @@
               <w:right w:val="single" w:color="B7C9BC" w:sz="4"/>
             </w:tcBorders>
             <w:shd w:fill="F5F9F5" w:color="auto" w:val="clear"/>
-            <w:tcMar>
-              <w:top w:type="dxa" w:w="60"/>
-              <w:left w:type="dxa" w:w="100"/>
-              <w:bottom w:type="dxa" w:w="60"/>
-              <w:right w:type="dxa" w:w="100"/>
-            </w:tcMar>
-            <w:vAlign w:val="center"/>
-          </w:tcPr>
-          <w:p>
-            <w:r>
-              <w:rPr>
-                <w:rFonts w:ascii="Arial" w:cs="Arial" w:eastAsia="Arial" w:hAnsi="Arial"/>
-                <w:sz w:val="18"/>
-                <w:szCs w:val="18"/>
-              </w:rPr>
-              <w:t xml:space="preserve">one leg → </w:t>
-            </w:r>
-            <w:r>
-              <w:rPr>
-                <w:rFonts w:ascii="Arial" w:cs="Arial" w:eastAsia="Arial" w:hAnsi="Arial"/>
-                <w:b/>
-                <w:bCs/>
-                <w:sz w:val="18"/>
-                <w:szCs w:val="18"/>
-              </w:rPr>
-              <w:t xml:space="preserve">GPIO13</w:t>
-            </w:r>
-            <w:r>
-              <w:rPr>
-                <w:rFonts w:ascii="Arial" w:cs="Arial" w:eastAsia="Arial" w:hAnsi="Arial"/>
-                <w:sz w:val="18"/>
-                <w:szCs w:val="18"/>
-              </w:rPr>
-              <w:t xml:space="preserve"> · other leg → GND</w:t>
-            </w:r>
-          </w:p>
-        </w:tc>
-      </w:tr>
-      <w:tr>
-        <w:trPr>
-          <w:cantSplit/>
-        </w:trPr>
-        <w:tc>
-          <w:tcPr>
-            <w:tcW w:type="dxa" w:w="2600"/>
-            <w:tcBorders>
-              <w:top w:val="single" w:color="B7C9BC" w:sz="4"/>
-              <w:left w:val="single" w:color="B7C9BC" w:sz="4"/>
-              <w:bottom w:val="single" w:color="B7C9BC" w:sz="4"/>
-              <w:right w:val="single" w:color="B7C9BC" w:sz="4"/>
-            </w:tcBorders>
-            <w:tcMar>
-              <w:top w:type="dxa" w:w="60"/>
-              <w:left w:type="dxa" w:w="100"/>
-              <w:bottom w:type="dxa" w:w="60"/>
-              <w:right w:type="dxa" w:w="100"/>
-            </w:tcMar>
-            <w:vAlign w:val="center"/>
-          </w:tcPr>
-          <w:p>
-            <w:r>
-              <w:rPr>
-                <w:rFonts w:ascii="Arial" w:cs="Arial" w:eastAsia="Arial" w:hAnsi="Arial"/>
-                <w:sz w:val="18"/>
-                <w:szCs w:val="18"/>
-              </w:rPr>
-              <w:t xml:space="preserve">Power</w:t>
-            </w:r>
-          </w:p>
-        </w:tc>
-        <w:tc>
-          <w:tcPr>
-            <w:tcW w:type="dxa" w:w="7306"/>
-            <w:tcBorders>
-              <w:top w:val="single" w:color="B7C9BC" w:sz="4"/>
-              <w:left w:val="single" w:color="B7C9BC" w:sz="4"/>
-              <w:bottom w:val="single" w:color="B7C9BC" w:sz="4"/>
-              <w:right w:val="single" w:color="B7C9BC" w:sz="4"/>
-            </w:tcBorders>
             <w:tcMar>
               <w:top w:type="dxa" w:w="60"/>
               <w:left w:type="dxa" w:w="100"/>
@@ -5423,7 +5316,7 @@
           <w:sz w:val="20"/>
           <w:szCs w:val="20"/>
         </w:rPr>
-        <w:t xml:space="preserve"> you hear the “hello” melody, the OLED shows the emoji face, the Serial Monitor shows </w:t>
+        <w:t xml:space="preserve"> you hear the “hello” melody, the Serial Monitor shows </w:t>
       </w:r>
       <w:r>
         <w:rPr>
@@ -5930,7 +5823,7 @@
           <w:sz w:val="20"/>
           <w:szCs w:val="20"/>
         </w:rPr>
-        <w:t xml:space="preserve"> shows the same emoji as the OLED and the badge says </w:t>
+        <w:t xml:space="preserve"> shows the plant’s emoji (there is no screen on the plant) and the badge says </w:t>
       </w:r>
       <w:r>
         <w:rPr>
@@ -6466,7 +6359,7 @@
           <w:sz w:val="20"/>
           <w:szCs w:val="20"/>
         </w:rPr>
-        <w:t xml:space="preserve">Move the circuit to a small perfboard or mini breadboard inside a box fixed to the pot: OLED behind a window, holes for the buzzer and the USB cable; DHT22 and BH1750 outside the box.</w:t>
+        <w:t xml:space="preserve">Move the circuit to a small perfboard or mini breadboard inside a box fixed to the pot: holes for the buzzer and the USB cable; DHT22 and BH1750 outside the box.</w:t>
       </w:r>
     </w:p>
     <w:p>
@@ -7836,24 +7729,7 @@
                 <w:sz w:val="18"/>
                 <w:szCs w:val="18"/>
               </w:rPr>
-              <w:t xml:space="preserve">display.h</w:t>
-            </w:r>
-            <w:r>
-              <w:rPr>
-                <w:rFonts w:ascii="Arial" w:cs="Arial" w:eastAsia="Arial" w:hAnsi="Arial"/>
-                <w:sz w:val="18"/>
-                <w:szCs w:val="18"/>
-              </w:rPr>
-              <w:t xml:space="preserve"> / </w:t>
-            </w:r>
-            <w:r>
-              <w:rPr>
-                <w:rFonts w:ascii="Consolas" w:cs="Consolas" w:eastAsia="Consolas" w:hAnsi="Consolas"/>
-                <w:color w:val="1D4F7A"/>
-                <w:sz w:val="18"/>
-                <w:szCs w:val="18"/>
-              </w:rPr>
-              <w:t xml:space="preserve">display.cpp</w:t>
+              <w:t xml:space="preserve">status.h</w:t>
             </w:r>
           </w:p>
         </w:tc>
@@ -7882,7 +7758,7 @@
                 <w:sz w:val="18"/>
                 <w:szCs w:val="18"/>
               </w:rPr>
-              <w:t xml:space="preserve">Draws the 7 animated emoji faces and the data screen on the OLED</w:t>
+              <w:t xml:space="preserve">The current plant state (readings, mood, Wi-Fi) shared with the cloud upload</w:t>
             </w:r>
           </w:p>
         </w:tc>
@@ -7911,7 +7787,7 @@
                 <w:sz w:val="18"/>
                 <w:szCs w:val="18"/>
               </w:rPr>
-              <w:t xml:space="preserve">Maybe (faces)</w:t>
+              <w:t xml:space="preserve">No</w:t>
             </w:r>
           </w:p>
         </w:tc>

</xml_diff>

<commit_message>
Add solar power part and prepare for future AI
- Firmware: power module (battery and panel voltage, battery %, charging,
  power-saving mode below 15 %), SOLAR_ENABLED switch in config.h
- Web and Android: battery and solar cards, battery line in history chart
- Firebase rules: reserve plants/<id>/ai for the future AI part
- Docs: new chapters 11 (solar power) and 12 (future AI); all chapters,
  Word guides, components file (separate solar table), forms, wiring,
  UML, ERD and relational diagrams updated
- Tests: 47 checks including the solar calculations

Co-Authored-By: Claude Opus 5.5 <noreply@anthropic.com>
Claude-Session: https://claude.ai/code/session_01LUEXdLPnpgGnWTyNRXft8r
</commit_message>
<xml_diff>
--- a/rayy/docs/Rayy-Build-Guide.docx
+++ b/rayy/docs/Rayy-Build-Guide.docx
@@ -31,7 +31,7 @@
           <w:sz w:val="26"/>
           <w:szCs w:val="26"/>
         </w:rPr>
-        <w:t xml:space="preserve">Smart IoT plant that shows its feelings with emoji and sound</w:t>
+        <w:t xml:space="preserve">Solar-powered smart IoT plant that shows its feelings with emoji and sound</w:t>
       </w:r>
     </w:p>
     <w:p>
@@ -200,7 +200,25 @@
           <w:sz w:val="20"/>
           <w:szCs w:val="20"/>
         </w:rPr>
-        <w:t xml:space="preserve">. They do not talk to each other directly: everything goes through </w:t>
+        <w:t xml:space="preserve"> plus a </w:t>
+      </w:r>
+      <w:r>
+        <w:rPr>
+          <w:rFonts w:ascii="Arial" w:cs="Arial" w:eastAsia="Arial" w:hAnsi="Arial"/>
+          <w:b/>
+          <w:bCs/>
+          <w:sz w:val="20"/>
+          <w:szCs w:val="20"/>
+        </w:rPr>
+        <w:t xml:space="preserve">solar power part</w:t>
+      </w:r>
+      <w:r>
+        <w:rPr>
+          <w:rFonts w:ascii="Arial" w:cs="Arial" w:eastAsia="Arial" w:hAnsi="Arial"/>
+          <w:sz w:val="20"/>
+          <w:szCs w:val="20"/>
+        </w:rPr>
+        <w:t xml:space="preserve"> that powers the plant device. They do not talk to each other directly: everything goes through </w:t>
       </w:r>
       <w:r>
         <w:rPr>
@@ -485,7 +503,7 @@
                 <w:sz w:val="18"/>
                 <w:szCs w:val="18"/>
               </w:rPr>
-              <w:t xml:space="preserve">Reads the sensors, shows the emoji face, plays melodies, sends data to Firebase</w:t>
+              <w:t xml:space="preserve">Reads the sensors and the battery/solar voltages, decides the mood, plays melodies, sends data to Firebase</w:t>
             </w:r>
           </w:p>
         </w:tc>
@@ -519,7 +537,7 @@
                 <w:sz w:val="18"/>
                 <w:szCs w:val="18"/>
               </w:rPr>
-              <w:t xml:space="preserve">Cloud database</w:t>
+              <w:t xml:space="preserve">Solar power part</w:t>
             </w:r>
           </w:p>
         </w:tc>
@@ -549,7 +567,7 @@
                 <w:sz w:val="18"/>
                 <w:szCs w:val="18"/>
               </w:rPr>
-              <w:t xml:space="preserve">firebase/</w:t>
+              <w:t xml:space="preserve">docs/11-solar-power.md</w:t>
             </w:r>
             <w:r>
               <w:rPr>
@@ -566,7 +584,7 @@
                 <w:sz w:val="18"/>
                 <w:szCs w:val="18"/>
               </w:rPr>
-              <w:t xml:space="preserve">firebase.json</w:t>
+              <w:t xml:space="preserve">firmware/Rayy/power.*</w:t>
             </w:r>
           </w:p>
         </w:tc>
@@ -595,7 +613,7 @@
                 <w:sz w:val="18"/>
                 <w:szCs w:val="18"/>
               </w:rPr>
-              <w:t xml:space="preserve">Google Firebase (internet)</w:t>
+              <w:t xml:space="preserve">Solar panel + charger + 18650 batteries + 5 V boost</w:t>
             </w:r>
           </w:p>
         </w:tc>
@@ -624,7 +642,7 @@
                 <w:sz w:val="18"/>
                 <w:szCs w:val="18"/>
               </w:rPr>
-              <w:t xml:space="preserve">Stores the live data, history, diary and settings; checks logins</w:t>
+              <w:t xml:space="preserve">Powers the ESP32 day and night; its battery level is shown in the apps</w:t>
             </w:r>
           </w:p>
         </w:tc>
@@ -657,7 +675,7 @@
                 <w:sz w:val="18"/>
                 <w:szCs w:val="18"/>
               </w:rPr>
-              <w:t xml:space="preserve">Web dashboard</w:t>
+              <w:t xml:space="preserve">Cloud database</w:t>
             </w:r>
           </w:p>
         </w:tc>
@@ -686,7 +704,24 @@
                 <w:sz w:val="18"/>
                 <w:szCs w:val="18"/>
               </w:rPr>
-              <w:t xml:space="preserve">web/</w:t>
+              <w:t xml:space="preserve">firebase/</w:t>
+            </w:r>
+            <w:r>
+              <w:rPr>
+                <w:rFonts w:ascii="Arial" w:cs="Arial" w:eastAsia="Arial" w:hAnsi="Arial"/>
+                <w:sz w:val="18"/>
+                <w:szCs w:val="18"/>
+              </w:rPr>
+              <w:t xml:space="preserve"> + </w:t>
+            </w:r>
+            <w:r>
+              <w:rPr>
+                <w:rFonts w:ascii="Consolas" w:cs="Consolas" w:eastAsia="Consolas" w:hAnsi="Consolas"/>
+                <w:color w:val="1D4F7A"/>
+                <w:sz w:val="18"/>
+                <w:szCs w:val="18"/>
+              </w:rPr>
+              <w:t xml:space="preserve">firebase.json</w:t>
             </w:r>
           </w:p>
         </w:tc>
@@ -714,7 +749,7 @@
                 <w:sz w:val="18"/>
                 <w:szCs w:val="18"/>
               </w:rPr>
-              <w:t xml:space="preserve">Any browser (Firebase Hosting)</w:t>
+              <w:t xml:space="preserve">Google Firebase (internet)</w:t>
             </w:r>
           </w:p>
         </w:tc>
@@ -742,7 +777,7 @@
                 <w:sz w:val="18"/>
                 <w:szCs w:val="18"/>
               </w:rPr>
-              <w:t xml:space="preserve">Shows the data, charts and diary; changes settings; plays a sound</w:t>
+              <w:t xml:space="preserve">Stores the live data, history, diary and settings; checks logins</w:t>
             </w:r>
           </w:p>
         </w:tc>
@@ -776,7 +811,7 @@
                 <w:sz w:val="18"/>
                 <w:szCs w:val="18"/>
               </w:rPr>
-              <w:t xml:space="preserve">Android app</w:t>
+              <w:t xml:space="preserve">Web dashboard</w:t>
             </w:r>
           </w:p>
         </w:tc>
@@ -806,6 +841,126 @@
                 <w:sz w:val="18"/>
                 <w:szCs w:val="18"/>
               </w:rPr>
+              <w:t xml:space="preserve">web/</w:t>
+            </w:r>
+          </w:p>
+        </w:tc>
+        <w:tc>
+          <w:tcPr>
+            <w:tcW w:type="dxa" w:w="2300"/>
+            <w:tcBorders>
+              <w:top w:val="single" w:color="B7C9BC" w:sz="4"/>
+              <w:left w:val="single" w:color="B7C9BC" w:sz="4"/>
+              <w:bottom w:val="single" w:color="B7C9BC" w:sz="4"/>
+              <w:right w:val="single" w:color="B7C9BC" w:sz="4"/>
+            </w:tcBorders>
+            <w:shd w:fill="F5F9F5" w:color="auto" w:val="clear"/>
+            <w:tcMar>
+              <w:top w:type="dxa" w:w="60"/>
+              <w:left w:type="dxa" w:w="100"/>
+              <w:bottom w:type="dxa" w:w="60"/>
+              <w:right w:type="dxa" w:w="100"/>
+            </w:tcMar>
+            <w:vAlign w:val="center"/>
+          </w:tcPr>
+          <w:p>
+            <w:r>
+              <w:rPr>
+                <w:rFonts w:ascii="Arial" w:cs="Arial" w:eastAsia="Arial" w:hAnsi="Arial"/>
+                <w:sz w:val="18"/>
+                <w:szCs w:val="18"/>
+              </w:rPr>
+              <w:t xml:space="preserve">Any browser (Firebase Hosting)</w:t>
+            </w:r>
+          </w:p>
+        </w:tc>
+        <w:tc>
+          <w:tcPr>
+            <w:tcW w:type="dxa" w:w="3506"/>
+            <w:tcBorders>
+              <w:top w:val="single" w:color="B7C9BC" w:sz="4"/>
+              <w:left w:val="single" w:color="B7C9BC" w:sz="4"/>
+              <w:bottom w:val="single" w:color="B7C9BC" w:sz="4"/>
+              <w:right w:val="single" w:color="B7C9BC" w:sz="4"/>
+            </w:tcBorders>
+            <w:shd w:fill="F5F9F5" w:color="auto" w:val="clear"/>
+            <w:tcMar>
+              <w:top w:type="dxa" w:w="60"/>
+              <w:left w:type="dxa" w:w="100"/>
+              <w:bottom w:type="dxa" w:w="60"/>
+              <w:right w:type="dxa" w:w="100"/>
+            </w:tcMar>
+            <w:vAlign w:val="center"/>
+          </w:tcPr>
+          <w:p>
+            <w:r>
+              <w:rPr>
+                <w:rFonts w:ascii="Arial" w:cs="Arial" w:eastAsia="Arial" w:hAnsi="Arial"/>
+                <w:sz w:val="18"/>
+                <w:szCs w:val="18"/>
+              </w:rPr>
+              <w:t xml:space="preserve">Shows the data, charts and diary; changes settings; plays a sound</w:t>
+            </w:r>
+          </w:p>
+        </w:tc>
+      </w:tr>
+      <w:tr>
+        <w:trPr>
+          <w:cantSplit/>
+        </w:trPr>
+        <w:tc>
+          <w:tcPr>
+            <w:tcW w:type="dxa" w:w="1800"/>
+            <w:tcBorders>
+              <w:top w:val="single" w:color="B7C9BC" w:sz="4"/>
+              <w:left w:val="single" w:color="B7C9BC" w:sz="4"/>
+              <w:bottom w:val="single" w:color="B7C9BC" w:sz="4"/>
+              <w:right w:val="single" w:color="B7C9BC" w:sz="4"/>
+            </w:tcBorders>
+            <w:tcMar>
+              <w:top w:type="dxa" w:w="60"/>
+              <w:left w:type="dxa" w:w="100"/>
+              <w:bottom w:type="dxa" w:w="60"/>
+              <w:right w:type="dxa" w:w="100"/>
+            </w:tcMar>
+            <w:vAlign w:val="center"/>
+          </w:tcPr>
+          <w:p>
+            <w:r>
+              <w:rPr>
+                <w:rFonts w:ascii="Arial" w:cs="Arial" w:eastAsia="Arial" w:hAnsi="Arial"/>
+                <w:sz w:val="18"/>
+                <w:szCs w:val="18"/>
+              </w:rPr>
+              <w:t xml:space="preserve">Android app</w:t>
+            </w:r>
+          </w:p>
+        </w:tc>
+        <w:tc>
+          <w:tcPr>
+            <w:tcW w:type="dxa" w:w="2300"/>
+            <w:tcBorders>
+              <w:top w:val="single" w:color="B7C9BC" w:sz="4"/>
+              <w:left w:val="single" w:color="B7C9BC" w:sz="4"/>
+              <w:bottom w:val="single" w:color="B7C9BC" w:sz="4"/>
+              <w:right w:val="single" w:color="B7C9BC" w:sz="4"/>
+            </w:tcBorders>
+            <w:tcMar>
+              <w:top w:type="dxa" w:w="60"/>
+              <w:left w:type="dxa" w:w="100"/>
+              <w:bottom w:type="dxa" w:w="60"/>
+              <w:right w:type="dxa" w:w="100"/>
+            </w:tcMar>
+            <w:vAlign w:val="center"/>
+          </w:tcPr>
+          <w:p>
+            <w:r>
+              <w:rPr>
+                <w:rFonts w:ascii="Consolas" w:cs="Consolas" w:eastAsia="Consolas" w:hAnsi="Consolas"/>
+                <w:color w:val="1D4F7A"/>
+                <w:sz w:val="18"/>
+                <w:szCs w:val="18"/>
+              </w:rPr>
               <w:t xml:space="preserve">android/Rayy/</w:t>
             </w:r>
           </w:p>
@@ -819,7 +974,6 @@
               <w:bottom w:val="single" w:color="B7C9BC" w:sz="4"/>
               <w:right w:val="single" w:color="B7C9BC" w:sz="4"/>
             </w:tcBorders>
-            <w:shd w:fill="F5F9F5" w:color="auto" w:val="clear"/>
             <w:tcMar>
               <w:top w:type="dxa" w:w="60"/>
               <w:left w:type="dxa" w:w="100"/>
@@ -848,7 +1002,6 @@
               <w:bottom w:val="single" w:color="B7C9BC" w:sz="4"/>
               <w:right w:val="single" w:color="B7C9BC" w:sz="4"/>
             </w:tcBorders>
-            <w:shd w:fill="F5F9F5" w:color="auto" w:val="clear"/>
             <w:tcMar>
               <w:top w:type="dxa" w:w="60"/>
               <w:left w:type="dxa" w:w="100"/>
@@ -968,7 +1121,7 @@
           <w:sz w:val="20"/>
           <w:szCs w:val="20"/>
         </w:rPr>
-        <w:t xml:space="preserve">, so you can see the face and readings at once.</w:t>
+        <w:t xml:space="preserve">, so you can hear the melodies and see the readings at once.</w:t>
       </w:r>
     </w:p>
     <w:p>
@@ -1016,7 +1169,80 @@
           <w:sz w:val="20"/>
           <w:szCs w:val="20"/>
         </w:rPr>
+        <w:t xml:space="preserve">The solar part comes after everything works on a USB power bank</w:t>
+      </w:r>
+      <w:r>
+        <w:rPr>
+          <w:rFonts w:ascii="Arial" w:cs="Arial" w:eastAsia="Arial" w:hAnsi="Arial"/>
+          <w:sz w:val="20"/>
+          <w:szCs w:val="20"/>
+        </w:rPr>
+        <w:t xml:space="preserve">, so a power problem never hides a code problem.</w:t>
+      </w:r>
+    </w:p>
+    <w:p>
+      <w:pPr>
+        <w:pStyle w:val="ListParagraph"/>
+        <w:numPr>
+          <w:ilvl w:val="0"/>
+          <w:numId w:val="2"/>
+        </w:numPr>
+        <w:spacing w:after="30" w:before="30"/>
+      </w:pPr>
+      <w:r>
+        <w:rPr>
+          <w:rFonts w:ascii="Arial" w:cs="Arial" w:eastAsia="Arial" w:hAnsi="Arial"/>
+          <w:b/>
+          <w:bCs/>
+          <w:sz w:val="20"/>
+          <w:szCs w:val="20"/>
+        </w:rPr>
         <w:t xml:space="preserve">Calibration and testing come after everything works together.</w:t>
+      </w:r>
+    </w:p>
+    <w:p>
+      <w:pPr>
+        <w:pStyle w:val="ListParagraph"/>
+        <w:numPr>
+          <w:ilvl w:val="0"/>
+          <w:numId w:val="2"/>
+        </w:numPr>
+        <w:spacing w:after="30" w:before="30"/>
+      </w:pPr>
+      <w:r>
+        <w:rPr>
+          <w:rFonts w:ascii="Arial" w:cs="Arial" w:eastAsia="Arial" w:hAnsi="Arial"/>
+          <w:b/>
+          <w:bCs/>
+          <w:sz w:val="20"/>
+          <w:szCs w:val="20"/>
+        </w:rPr>
+        <w:t xml:space="preserve">AI is future work</w:t>
+      </w:r>
+      <w:r>
+        <w:rPr>
+          <w:rFonts w:ascii="Arial" w:cs="Arial" w:eastAsia="Arial" w:hAnsi="Arial"/>
+          <w:sz w:val="20"/>
+          <w:szCs w:val="20"/>
+        </w:rPr>
+        <w:t xml:space="preserve"> (</w:t>
+      </w:r>
+      <w:r>
+        <w:rPr>
+          <w:rFonts w:ascii="Consolas" w:cs="Consolas" w:eastAsia="Consolas" w:hAnsi="Consolas"/>
+          <w:color w:val="1D4F7A"/>
+          <w:sz w:val="20"/>
+          <w:szCs w:val="20"/>
+        </w:rPr>
+        <w:t xml:space="preserve">docs/12-future-ai.md</w:t>
+      </w:r>
+      <w:r>
+        <w:rPr>
+          <w:rFonts w:ascii="Arial" w:cs="Arial" w:eastAsia="Arial" w:hAnsi="Arial"/>
+          <w:sz w:val="20"/>
+          <w:szCs w:val="20"/>
+        </w:rPr>
+        <w:t xml:space="preserve">): the project already stores the history it will need.</w:t>
       </w:r>
     </w:p>
     <w:p>
@@ -1277,7 +1503,7 @@
                 <w:sz w:val="18"/>
                 <w:szCs w:val="18"/>
               </w:rPr>
-              <w:t xml:space="preserve">Buy the components</w:t>
+              <w:t xml:space="preserve">Buy the components (main + solar part)</w:t>
             </w:r>
           </w:p>
         </w:tc>
@@ -1333,7 +1559,7 @@
                 <w:sz w:val="18"/>
                 <w:szCs w:val="18"/>
               </w:rPr>
-              <w:t xml:space="preserve">All 14 items on the table (see the components Word file)</w:t>
+              <w:t xml:space="preserve">All items of both tables (see the components Word file)</w:t>
             </w:r>
           </w:p>
         </w:tc>
@@ -2281,7 +2507,7 @@
                 <w:sz w:val="18"/>
                 <w:szCs w:val="18"/>
               </w:rPr>
-              <w:t xml:space="preserve">“hello” melody, emoji face, Serial Monitor: “signed in to Firebase”</w:t>
+              <w:t xml:space="preserve">“hello” melody, Serial Monitor: “signed in to Firebase”</w:t>
             </w:r>
           </w:p>
         </w:tc>
@@ -2894,7 +3120,7 @@
                 <w:sz w:val="18"/>
                 <w:szCs w:val="18"/>
               </w:rPr>
-              <w:t xml:space="preserve">Test everything</w:t>
+              <w:t xml:space="preserve">Build the solar part</w:t>
             </w:r>
           </w:p>
         </w:tc>
@@ -2922,7 +3148,7 @@
                 <w:sz w:val="18"/>
                 <w:szCs w:val="18"/>
               </w:rPr>
-              <w:t xml:space="preserve">Steps 7–10</w:t>
+              <w:t xml:space="preserve">Steps 1, 7</w:t>
             </w:r>
           </w:p>
         </w:tc>
@@ -2950,7 +3176,7 @@
                 <w:sz w:val="18"/>
                 <w:szCs w:val="18"/>
               </w:rPr>
-              <w:t xml:space="preserve">All tests in the test table pass</w:t>
+              <w:t xml:space="preserve">Apps show 🔋 battery % and “Charging from the sun ☀️”</w:t>
             </w:r>
           </w:p>
         </w:tc>
@@ -2979,7 +3205,32 @@
                 <w:sz w:val="18"/>
                 <w:szCs w:val="18"/>
               </w:rPr>
-              <w:t xml:space="preserve">docs/08-testing-calibration.md</w:t>
+              <w:t xml:space="preserve">docs/11-solar-power.md</w:t>
+            </w:r>
+            <w:r>
+              <w:rPr>
+                <w:rFonts w:ascii="Arial" w:cs="Arial" w:eastAsia="Arial" w:hAnsi="Arial"/>
+                <w:sz w:val="18"/>
+                <w:szCs w:val="18"/>
+              </w:rPr>
+              <w:t xml:space="preserve">, </w:t>
+            </w:r>
+            <w:r>
+              <w:rPr>
+                <w:rFonts w:ascii="Consolas" w:cs="Consolas" w:eastAsia="Consolas" w:hAnsi="Consolas"/>
+                <w:color w:val="1D4F7A"/>
+                <w:sz w:val="18"/>
+                <w:szCs w:val="18"/>
+              </w:rPr>
+              <w:t xml:space="preserve">firmware/Rayy/config.h</w:t>
+            </w:r>
+            <w:r>
+              <w:rPr>
+                <w:rFonts w:ascii="Arial" w:cs="Arial" w:eastAsia="Arial" w:hAnsi="Arial"/>
+                <w:sz w:val="18"/>
+                <w:szCs w:val="18"/>
+              </w:rPr>
+              <w:t xml:space="preserve"> (SOLAR_ENABLED)</w:t>
             </w:r>
           </w:p>
         </w:tc>
@@ -3042,6 +3293,155 @@
                 <w:sz w:val="18"/>
                 <w:szCs w:val="18"/>
               </w:rPr>
+              <w:t xml:space="preserve">Test everything</w:t>
+            </w:r>
+          </w:p>
+        </w:tc>
+        <w:tc>
+          <w:tcPr>
+            <w:tcW w:type="dxa" w:w="2300"/>
+            <w:tcBorders>
+              <w:top w:val="single" w:color="B7C9BC" w:sz="4"/>
+              <w:left w:val="single" w:color="B7C9BC" w:sz="4"/>
+              <w:bottom w:val="single" w:color="B7C9BC" w:sz="4"/>
+              <w:right w:val="single" w:color="B7C9BC" w:sz="4"/>
+            </w:tcBorders>
+            <w:shd w:fill="F5F9F5" w:color="auto" w:val="clear"/>
+            <w:tcMar>
+              <w:top w:type="dxa" w:w="60"/>
+              <w:left w:type="dxa" w:w="100"/>
+              <w:bottom w:type="dxa" w:w="60"/>
+              <w:right w:type="dxa" w:w="100"/>
+            </w:tcMar>
+            <w:vAlign w:val="center"/>
+          </w:tcPr>
+          <w:p>
+            <w:r>
+              <w:rPr>
+                <w:rFonts w:ascii="Arial" w:cs="Arial" w:eastAsia="Arial" w:hAnsi="Arial"/>
+                <w:sz w:val="18"/>
+                <w:szCs w:val="18"/>
+              </w:rPr>
+              <w:t xml:space="preserve">Steps 7–11</w:t>
+            </w:r>
+          </w:p>
+        </w:tc>
+        <w:tc>
+          <w:tcPr>
+            <w:tcW w:type="dxa" w:w="2300"/>
+            <w:tcBorders>
+              <w:top w:val="single" w:color="B7C9BC" w:sz="4"/>
+              <w:left w:val="single" w:color="B7C9BC" w:sz="4"/>
+              <w:bottom w:val="single" w:color="B7C9BC" w:sz="4"/>
+              <w:right w:val="single" w:color="B7C9BC" w:sz="4"/>
+            </w:tcBorders>
+            <w:shd w:fill="F5F9F5" w:color="auto" w:val="clear"/>
+            <w:tcMar>
+              <w:top w:type="dxa" w:w="60"/>
+              <w:left w:type="dxa" w:w="100"/>
+              <w:bottom w:type="dxa" w:w="60"/>
+              <w:right w:type="dxa" w:w="100"/>
+            </w:tcMar>
+            <w:vAlign w:val="center"/>
+          </w:tcPr>
+          <w:p>
+            <w:r>
+              <w:rPr>
+                <w:rFonts w:ascii="Arial" w:cs="Arial" w:eastAsia="Arial" w:hAnsi="Arial"/>
+                <w:sz w:val="18"/>
+                <w:szCs w:val="18"/>
+              </w:rPr>
+              <w:t xml:space="preserve">All tests in the test table pass</w:t>
+            </w:r>
+          </w:p>
+        </w:tc>
+        <w:tc>
+          <w:tcPr>
+            <w:tcW w:type="dxa" w:w="2706"/>
+            <w:tcBorders>
+              <w:top w:val="single" w:color="B7C9BC" w:sz="4"/>
+              <w:left w:val="single" w:color="B7C9BC" w:sz="4"/>
+              <w:bottom w:val="single" w:color="B7C9BC" w:sz="4"/>
+              <w:right w:val="single" w:color="B7C9BC" w:sz="4"/>
+            </w:tcBorders>
+            <w:shd w:fill="F5F9F5" w:color="auto" w:val="clear"/>
+            <w:tcMar>
+              <w:top w:type="dxa" w:w="60"/>
+              <w:left w:type="dxa" w:w="100"/>
+              <w:bottom w:type="dxa" w:w="60"/>
+              <w:right w:type="dxa" w:w="100"/>
+            </w:tcMar>
+            <w:vAlign w:val="center"/>
+          </w:tcPr>
+          <w:p>
+            <w:r>
+              <w:rPr>
+                <w:rFonts w:ascii="Consolas" w:cs="Consolas" w:eastAsia="Consolas" w:hAnsi="Consolas"/>
+                <w:color w:val="1D4F7A"/>
+                <w:sz w:val="18"/>
+                <w:szCs w:val="18"/>
+              </w:rPr>
+              <w:t xml:space="preserve">docs/08-testing-calibration.md</w:t>
+            </w:r>
+          </w:p>
+        </w:tc>
+      </w:tr>
+      <w:tr>
+        <w:trPr>
+          <w:cantSplit/>
+        </w:trPr>
+        <w:tc>
+          <w:tcPr>
+            <w:tcW w:type="dxa" w:w="500"/>
+            <w:tcBorders>
+              <w:top w:val="single" w:color="B7C9BC" w:sz="4"/>
+              <w:left w:val="single" w:color="B7C9BC" w:sz="4"/>
+              <w:bottom w:val="single" w:color="B7C9BC" w:sz="4"/>
+              <w:right w:val="single" w:color="B7C9BC" w:sz="4"/>
+            </w:tcBorders>
+            <w:tcMar>
+              <w:top w:type="dxa" w:w="60"/>
+              <w:left w:type="dxa" w:w="100"/>
+              <w:bottom w:type="dxa" w:w="60"/>
+              <w:right w:type="dxa" w:w="100"/>
+            </w:tcMar>
+            <w:vAlign w:val="center"/>
+          </w:tcPr>
+          <w:p>
+            <w:r>
+              <w:rPr>
+                <w:rFonts w:ascii="Arial" w:cs="Arial" w:eastAsia="Arial" w:hAnsi="Arial"/>
+                <w:sz w:val="18"/>
+                <w:szCs w:val="18"/>
+              </w:rPr>
+              <w:t xml:space="preserve">13</w:t>
+            </w:r>
+          </w:p>
+        </w:tc>
+        <w:tc>
+          <w:tcPr>
+            <w:tcW w:type="dxa" w:w="2100"/>
+            <w:tcBorders>
+              <w:top w:val="single" w:color="B7C9BC" w:sz="4"/>
+              <w:left w:val="single" w:color="B7C9BC" w:sz="4"/>
+              <w:bottom w:val="single" w:color="B7C9BC" w:sz="4"/>
+              <w:right w:val="single" w:color="B7C9BC" w:sz="4"/>
+            </w:tcBorders>
+            <w:tcMar>
+              <w:top w:type="dxa" w:w="60"/>
+              <w:left w:type="dxa" w:w="100"/>
+              <w:bottom w:type="dxa" w:w="60"/>
+              <w:right w:type="dxa" w:w="100"/>
+            </w:tcMar>
+            <w:vAlign w:val="center"/>
+          </w:tcPr>
+          <w:p>
+            <w:r>
+              <w:rPr>
+                <w:rFonts w:ascii="Arial" w:cs="Arial" w:eastAsia="Arial" w:hAnsi="Arial"/>
+                <w:sz w:val="18"/>
+                <w:szCs w:val="18"/>
+              </w:rPr>
               <w:t xml:space="preserve">Final assembly, report, presentation</w:t>
             </w:r>
           </w:p>
@@ -3055,23 +3455,22 @@
               <w:bottom w:val="single" w:color="B7C9BC" w:sz="4"/>
               <w:right w:val="single" w:color="B7C9BC" w:sz="4"/>
             </w:tcBorders>
-            <w:shd w:fill="F5F9F5" w:color="auto" w:val="clear"/>
-            <w:tcMar>
-              <w:top w:type="dxa" w:w="60"/>
-              <w:left w:type="dxa" w:w="100"/>
-              <w:bottom w:type="dxa" w:w="60"/>
-              <w:right w:type="dxa" w:w="100"/>
-            </w:tcMar>
-            <w:vAlign w:val="center"/>
-          </w:tcPr>
-          <w:p>
-            <w:r>
-              <w:rPr>
-                <w:rFonts w:ascii="Arial" w:cs="Arial" w:eastAsia="Arial" w:hAnsi="Arial"/>
-                <w:sz w:val="18"/>
-                <w:szCs w:val="18"/>
-              </w:rPr>
-              <w:t xml:space="preserve">Step 11</w:t>
+            <w:tcMar>
+              <w:top w:type="dxa" w:w="60"/>
+              <w:left w:type="dxa" w:w="100"/>
+              <w:bottom w:type="dxa" w:w="60"/>
+              <w:right w:type="dxa" w:w="100"/>
+            </w:tcMar>
+            <w:vAlign w:val="center"/>
+          </w:tcPr>
+          <w:p>
+            <w:r>
+              <w:rPr>
+                <w:rFonts w:ascii="Arial" w:cs="Arial" w:eastAsia="Arial" w:hAnsi="Arial"/>
+                <w:sz w:val="18"/>
+                <w:szCs w:val="18"/>
+              </w:rPr>
+              <w:t xml:space="preserve">Step 12</w:t>
             </w:r>
           </w:p>
         </w:tc>
@@ -3084,23 +3483,22 @@
               <w:bottom w:val="single" w:color="B7C9BC" w:sz="4"/>
               <w:right w:val="single" w:color="B7C9BC" w:sz="4"/>
             </w:tcBorders>
-            <w:shd w:fill="F5F9F5" w:color="auto" w:val="clear"/>
-            <w:tcMar>
-              <w:top w:type="dxa" w:w="60"/>
-              <w:left w:type="dxa" w:w="100"/>
-              <w:bottom w:type="dxa" w:w="60"/>
-              <w:right w:type="dxa" w:w="100"/>
-            </w:tcMar>
-            <w:vAlign w:val="center"/>
-          </w:tcPr>
-          <w:p>
-            <w:r>
-              <w:rPr>
-                <w:rFonts w:ascii="Arial" w:cs="Arial" w:eastAsia="Arial" w:hAnsi="Arial"/>
-                <w:sz w:val="18"/>
-                <w:szCs w:val="18"/>
-              </w:rPr>
-              <w:t xml:space="preserve">Box on the pot, report written, demo rehearsed</w:t>
+            <w:tcMar>
+              <w:top w:type="dxa" w:w="60"/>
+              <w:left w:type="dxa" w:w="100"/>
+              <w:bottom w:type="dxa" w:w="60"/>
+              <w:right w:type="dxa" w:w="100"/>
+            </w:tcMar>
+            <w:vAlign w:val="center"/>
+          </w:tcPr>
+          <w:p>
+            <w:r>
+              <w:rPr>
+                <w:rFonts w:ascii="Arial" w:cs="Arial" w:eastAsia="Arial" w:hAnsi="Arial"/>
+                <w:sz w:val="18"/>
+                <w:szCs w:val="18"/>
+              </w:rPr>
+              <w:t xml:space="preserve">Box on the pot, panel in the sun, report written, demo rehearsed</w:t>
             </w:r>
           </w:p>
         </w:tc>
@@ -3113,7 +3511,6 @@
               <w:bottom w:val="single" w:color="B7C9BC" w:sz="4"/>
               <w:right w:val="single" w:color="B7C9BC" w:sz="4"/>
             </w:tcBorders>
-            <w:shd w:fill="F5F9F5" w:color="auto" w:val="clear"/>
             <w:tcMar>
               <w:top w:type="dxa" w:w="60"/>
               <w:left w:type="dxa" w:w="100"/>
@@ -3186,7 +3583,7 @@
           <w:sz w:val="20"/>
           <w:szCs w:val="20"/>
         </w:rPr>
-        <w:t xml:space="preserve"> by different team members. Steps 9 (web) and 10 (Android) can also be done in parallel once Firebase is ready.</w:t>
+        <w:t xml:space="preserve"> by different team members. Steps 9 (web) and 10 (Android) can also be done in parallel once Firebase is ready. The solar part (step 11) can be prepared in parallel but is connected last.</w:t>
       </w:r>
     </w:p>
     <w:p>
@@ -3252,7 +3649,7 @@
           <w:sz w:val="20"/>
           <w:szCs w:val="20"/>
         </w:rPr>
-        <w:t xml:space="preserve"> (Arabic + English names, quantities, expected prices ≈ 175–312 SAR). Important: capacitive soil sensor, </w:t>
+        <w:t xml:space="preserve"> (Arabic + English names, part codes, quantities, prices, buy links). It has two tables: </w:t>
       </w:r>
       <w:r>
         <w:rPr>
@@ -3262,15 +3659,15 @@
           <w:sz w:val="20"/>
           <w:szCs w:val="20"/>
         </w:rPr>
-        <w:t xml:space="preserve">passive</w:t>
-      </w:r>
-      <w:r>
-        <w:rPr>
-          <w:rFonts w:ascii="Arial" w:cs="Arial" w:eastAsia="Arial" w:hAnsi="Arial"/>
-          <w:sz w:val="20"/>
-          <w:szCs w:val="20"/>
-        </w:rPr>
-        <w:t xml:space="preserve"> buzzer, </w:t>
+        <w:t xml:space="preserve">Part 1 main components</w:t>
+      </w:r>
+      <w:r>
+        <w:rPr>
+          <w:rFonts w:ascii="Arial" w:cs="Arial" w:eastAsia="Arial" w:hAnsi="Arial"/>
+          <w:sz w:val="20"/>
+          <w:szCs w:val="20"/>
+        </w:rPr>
+        <w:t xml:space="preserve"> (≈ 140–317 SAR) and </w:t>
       </w:r>
       <w:r>
         <w:rPr>
@@ -3280,6 +3677,42 @@
           <w:sz w:val="20"/>
           <w:szCs w:val="20"/>
         </w:rPr>
+        <w:t xml:space="preserve">Part 2 solar components</w:t>
+      </w:r>
+      <w:r>
+        <w:rPr>
+          <w:rFonts w:ascii="Arial" w:cs="Arial" w:eastAsia="Arial" w:hAnsi="Arial"/>
+          <w:sz w:val="20"/>
+          <w:szCs w:val="20"/>
+        </w:rPr>
+        <w:t xml:space="preserve"> (≈ 121–184 SAR). Important: capacitive soil sensor, </w:t>
+      </w:r>
+      <w:r>
+        <w:rPr>
+          <w:rFonts w:ascii="Arial" w:cs="Arial" w:eastAsia="Arial" w:hAnsi="Arial"/>
+          <w:b/>
+          <w:bCs/>
+          <w:sz w:val="20"/>
+          <w:szCs w:val="20"/>
+        </w:rPr>
+        <w:t xml:space="preserve">passive</w:t>
+      </w:r>
+      <w:r>
+        <w:rPr>
+          <w:rFonts w:ascii="Arial" w:cs="Arial" w:eastAsia="Arial" w:hAnsi="Arial"/>
+          <w:sz w:val="20"/>
+          <w:szCs w:val="20"/>
+        </w:rPr>
+        <w:t xml:space="preserve"> buzzer, </w:t>
+      </w:r>
+      <w:r>
+        <w:rPr>
+          <w:rFonts w:ascii="Arial" w:cs="Arial" w:eastAsia="Arial" w:hAnsi="Arial"/>
+          <w:b/>
+          <w:bCs/>
+          <w:sz w:val="20"/>
+          <w:szCs w:val="20"/>
+        </w:rPr>
         <w:t xml:space="preserve">data</w:t>
       </w:r>
       <w:r>
@@ -3288,7 +3721,43 @@
           <w:sz w:val="20"/>
           <w:szCs w:val="20"/>
         </w:rPr>
-        <w:t xml:space="preserve"> USB cable.</w:t>
+        <w:t xml:space="preserve"> USB cable, </w:t>
+      </w:r>
+      <w:r>
+        <w:rPr>
+          <w:rFonts w:ascii="Arial" w:cs="Arial" w:eastAsia="Arial" w:hAnsi="Arial"/>
+          <w:b/>
+          <w:bCs/>
+          <w:sz w:val="20"/>
+          <w:szCs w:val="20"/>
+        </w:rPr>
+        <w:t xml:space="preserve">protected</w:t>
+      </w:r>
+      <w:r>
+        <w:rPr>
+          <w:rFonts w:ascii="Arial" w:cs="Arial" w:eastAsia="Arial" w:hAnsi="Arial"/>
+          <w:sz w:val="20"/>
+          <w:szCs w:val="20"/>
+        </w:rPr>
+        <w:t xml:space="preserve"> 18650 batteries, the </w:t>
+      </w:r>
+      <w:r>
+        <w:rPr>
+          <w:rFonts w:ascii="Arial" w:cs="Arial" w:eastAsia="Arial" w:hAnsi="Arial"/>
+          <w:b/>
+          <w:bCs/>
+          <w:sz w:val="20"/>
+          <w:szCs w:val="20"/>
+        </w:rPr>
+        <w:t xml:space="preserve">6 V</w:t>
+      </w:r>
+      <w:r>
+        <w:rPr>
+          <w:rFonts w:ascii="Arial" w:cs="Arial" w:eastAsia="Arial" w:hAnsi="Arial"/>
+          <w:sz w:val="20"/>
+          <w:szCs w:val="20"/>
+        </w:rPr>
+        <w:t xml:space="preserve"> CN3791 charger, and a multimeter.</w:t>
       </w:r>
     </w:p>
     <w:p>
@@ -4896,7 +5365,7 @@
                 <w:sz w:val="18"/>
                 <w:szCs w:val="18"/>
               </w:rPr>
-              <w:t xml:space="preserve">Power</w:t>
+              <w:t xml:space="preserve">Power (while building)</w:t>
             </w:r>
           </w:p>
         </w:tc>
@@ -4925,7 +5394,7 @@
                 <w:sz w:val="18"/>
                 <w:szCs w:val="18"/>
               </w:rPr>
-              <w:t xml:space="preserve">5 V USB power bank / charger → ESP32 USB port</w:t>
+              <w:t xml:space="preserve">5 V USB power bank / charger → ESP32 USB port (the solar part is added in step 11)</w:t>
             </w:r>
           </w:p>
         </w:tc>
@@ -5298,6 +5767,41 @@
     </w:p>
     <w:p>
       <w:pPr>
+        <w:pBdr>
+          <w:left w:val="single" w:color="C77700" w:sz="18" w:space="8"/>
+        </w:pBdr>
+        <w:shd w:fill="FFF4E0" w:color="auto" w:val="clear"/>
+        <w:spacing w:after="100" w:before="100"/>
+        <w:ind w:left="200"/>
+      </w:pPr>
+      <w:r>
+        <w:rPr>
+          <w:rFonts w:ascii="Arial" w:cs="Arial" w:eastAsia="Arial" w:hAnsi="Arial"/>
+          <w:sz w:val="20"/>
+          <w:szCs w:val="20"/>
+        </w:rPr>
+        <w:t xml:space="preserve">For now keep </w:t>
+      </w:r>
+      <w:r>
+        <w:rPr>
+          <w:rFonts w:ascii="Consolas" w:cs="Consolas" w:eastAsia="Consolas" w:hAnsi="Consolas"/>
+          <w:color w:val="1D4F7A"/>
+          <w:sz w:val="20"/>
+          <w:szCs w:val="20"/>
+        </w:rPr>
+        <w:t xml:space="preserve">#define SOLAR_ENABLED 0</w:t>
+      </w:r>
+      <w:r>
+        <w:rPr>
+          <w:rFonts w:ascii="Arial" w:cs="Arial" w:eastAsia="Arial" w:hAnsi="Arial"/>
+          <w:sz w:val="20"/>
+          <w:szCs w:val="20"/>
+        </w:rPr>
+        <w:t xml:space="preserve"> in config.h (power bank). You change it to 1 in step 11.</w:t>
+      </w:r>
+    </w:p>
+    <w:p>
+      <w:pPr>
         <w:spacing w:after="60" w:before="60"/>
       </w:pPr>
       <w:r>
@@ -6217,7 +6721,911 @@
           <w:sz w:val="26"/>
           <w:szCs w:val="26"/>
         </w:rPr>
-        <w:t xml:space="preserve">Step 11: Test everything</w:t>
+        <w:t xml:space="preserve">Step 11: Build the solar part</w:t>
+      </w:r>
+    </w:p>
+    <w:p>
+      <w:pPr>
+        <w:spacing w:after="60" w:before="60"/>
+      </w:pPr>
+      <w:r>
+        <w:rPr>
+          <w:rFonts w:ascii="Arial" w:cs="Arial" w:eastAsia="Arial" w:hAnsi="Arial"/>
+          <w:sz w:val="20"/>
+          <w:szCs w:val="20"/>
+        </w:rPr>
+        <w:t xml:space="preserve">Follow </w:t>
+      </w:r>
+      <w:r>
+        <w:rPr>
+          <w:rFonts w:ascii="Consolas" w:cs="Consolas" w:eastAsia="Consolas" w:hAnsi="Consolas"/>
+          <w:color w:val="1D4F7A"/>
+          <w:sz w:val="20"/>
+          <w:szCs w:val="20"/>
+        </w:rPr>
+        <w:t xml:space="preserve">docs/11-solar-power.md</w:t>
+      </w:r>
+      <w:r>
+        <w:rPr>
+          <w:rFonts w:ascii="Arial" w:cs="Arial" w:eastAsia="Arial" w:hAnsi="Arial"/>
+          <w:sz w:val="20"/>
+          <w:szCs w:val="20"/>
+        </w:rPr>
+        <w:t xml:space="preserve"> and the solar part of the wiring diagram.</w:t>
+      </w:r>
+    </w:p>
+    <w:tbl>
+      <w:tblPr>
+        <w:tblW w:type="dxa" w:w="9906"/>
+        <w:tblBorders>
+          <w:top w:val="single" w:color="auto" w:sz="4"/>
+          <w:left w:val="single" w:color="auto" w:sz="4"/>
+          <w:bottom w:val="single" w:color="auto" w:sz="4"/>
+          <w:right w:val="single" w:color="auto" w:sz="4"/>
+          <w:insideH w:val="single" w:color="auto" w:sz="4"/>
+          <w:insideV w:val="single" w:color="auto" w:sz="4"/>
+        </w:tblBorders>
+      </w:tblPr>
+      <w:tblGrid>
+        <w:gridCol w:w="2600"/>
+        <w:gridCol w:w="7306"/>
+      </w:tblGrid>
+      <w:tr>
+        <w:trPr>
+          <w:tblHeader/>
+        </w:trPr>
+        <w:tc>
+          <w:tcPr>
+            <w:tcW w:type="dxa" w:w="2600"/>
+            <w:tcBorders>
+              <w:top w:val="single" w:color="B7C9BC" w:sz="4"/>
+              <w:left w:val="single" w:color="B7C9BC" w:sz="4"/>
+              <w:bottom w:val="single" w:color="B7C9BC" w:sz="4"/>
+              <w:right w:val="single" w:color="B7C9BC" w:sz="4"/>
+            </w:tcBorders>
+            <w:shd w:fill="2F7D4F" w:color="auto" w:val="clear"/>
+            <w:tcMar>
+              <w:top w:type="dxa" w:w="60"/>
+              <w:left w:type="dxa" w:w="100"/>
+              <w:bottom w:type="dxa" w:w="60"/>
+              <w:right w:type="dxa" w:w="100"/>
+            </w:tcMar>
+            <w:vAlign w:val="center"/>
+          </w:tcPr>
+          <w:p>
+            <w:r>
+              <w:rPr>
+                <w:rFonts w:ascii="Arial" w:cs="Arial" w:eastAsia="Arial" w:hAnsi="Arial"/>
+                <w:b/>
+                <w:bCs/>
+                <w:color w:val="FFFFFF"/>
+                <w:sz w:val="18"/>
+                <w:szCs w:val="18"/>
+              </w:rPr>
+              <w:t xml:space="preserve">Connection</w:t>
+            </w:r>
+          </w:p>
+        </w:tc>
+        <w:tc>
+          <w:tcPr>
+            <w:tcW w:type="dxa" w:w="7306"/>
+            <w:tcBorders>
+              <w:top w:val="single" w:color="B7C9BC" w:sz="4"/>
+              <w:left w:val="single" w:color="B7C9BC" w:sz="4"/>
+              <w:bottom w:val="single" w:color="B7C9BC" w:sz="4"/>
+              <w:right w:val="single" w:color="B7C9BC" w:sz="4"/>
+            </w:tcBorders>
+            <w:shd w:fill="2F7D4F" w:color="auto" w:val="clear"/>
+            <w:tcMar>
+              <w:top w:type="dxa" w:w="60"/>
+              <w:left w:type="dxa" w:w="100"/>
+              <w:bottom w:type="dxa" w:w="60"/>
+              <w:right w:type="dxa" w:w="100"/>
+            </w:tcMar>
+            <w:vAlign w:val="center"/>
+          </w:tcPr>
+          <w:p>
+            <w:r>
+              <w:rPr>
+                <w:rFonts w:ascii="Arial" w:cs="Arial" w:eastAsia="Arial" w:hAnsi="Arial"/>
+                <w:b/>
+                <w:bCs/>
+                <w:color w:val="FFFFFF"/>
+                <w:sz w:val="18"/>
+                <w:szCs w:val="18"/>
+              </w:rPr>
+              <w:t xml:space="preserve">Details</w:t>
+            </w:r>
+          </w:p>
+        </w:tc>
+      </w:tr>
+      <w:tr>
+        <w:trPr>
+          <w:cantSplit/>
+        </w:trPr>
+        <w:tc>
+          <w:tcPr>
+            <w:tcW w:type="dxa" w:w="2600"/>
+            <w:tcBorders>
+              <w:top w:val="single" w:color="B7C9BC" w:sz="4"/>
+              <w:left w:val="single" w:color="B7C9BC" w:sz="4"/>
+              <w:bottom w:val="single" w:color="B7C9BC" w:sz="4"/>
+              <w:right w:val="single" w:color="B7C9BC" w:sz="4"/>
+            </w:tcBorders>
+            <w:tcMar>
+              <w:top w:type="dxa" w:w="60"/>
+              <w:left w:type="dxa" w:w="100"/>
+              <w:bottom w:type="dxa" w:w="60"/>
+              <w:right w:type="dxa" w:w="100"/>
+            </w:tcMar>
+            <w:vAlign w:val="center"/>
+          </w:tcPr>
+          <w:p>
+            <w:r>
+              <w:rPr>
+                <w:rFonts w:ascii="Arial" w:cs="Arial" w:eastAsia="Arial" w:hAnsi="Arial"/>
+                <w:sz w:val="18"/>
+                <w:szCs w:val="18"/>
+              </w:rPr>
+              <w:t xml:space="preserve">Panel → charger</w:t>
+            </w:r>
+          </w:p>
+        </w:tc>
+        <w:tc>
+          <w:tcPr>
+            <w:tcW w:type="dxa" w:w="7306"/>
+            <w:tcBorders>
+              <w:top w:val="single" w:color="B7C9BC" w:sz="4"/>
+              <w:left w:val="single" w:color="B7C9BC" w:sz="4"/>
+              <w:bottom w:val="single" w:color="B7C9BC" w:sz="4"/>
+              <w:right w:val="single" w:color="B7C9BC" w:sz="4"/>
+            </w:tcBorders>
+            <w:tcMar>
+              <w:top w:type="dxa" w:w="60"/>
+              <w:left w:type="dxa" w:w="100"/>
+              <w:bottom w:type="dxa" w:w="60"/>
+              <w:right w:type="dxa" w:w="100"/>
+            </w:tcMar>
+            <w:vAlign w:val="center"/>
+          </w:tcPr>
+          <w:p>
+            <w:r>
+              <w:rPr>
+                <w:rFonts w:ascii="Arial" w:cs="Arial" w:eastAsia="Arial" w:hAnsi="Arial"/>
+                <w:sz w:val="18"/>
+                <w:szCs w:val="18"/>
+              </w:rPr>
+              <w:t xml:space="preserve">Solar panel (+)/(−) → CN3791 </w:t>
+            </w:r>
+            <w:r>
+              <w:rPr>
+                <w:rFonts w:ascii="Arial" w:cs="Arial" w:eastAsia="Arial" w:hAnsi="Arial"/>
+                <w:b/>
+                <w:bCs/>
+                <w:sz w:val="18"/>
+                <w:szCs w:val="18"/>
+              </w:rPr>
+              <w:t xml:space="preserve">IN+ / IN−</w:t>
+            </w:r>
+          </w:p>
+        </w:tc>
+      </w:tr>
+      <w:tr>
+        <w:trPr>
+          <w:cantSplit/>
+        </w:trPr>
+        <w:tc>
+          <w:tcPr>
+            <w:tcW w:type="dxa" w:w="2600"/>
+            <w:tcBorders>
+              <w:top w:val="single" w:color="B7C9BC" w:sz="4"/>
+              <w:left w:val="single" w:color="B7C9BC" w:sz="4"/>
+              <w:bottom w:val="single" w:color="B7C9BC" w:sz="4"/>
+              <w:right w:val="single" w:color="B7C9BC" w:sz="4"/>
+            </w:tcBorders>
+            <w:shd w:fill="F5F9F5" w:color="auto" w:val="clear"/>
+            <w:tcMar>
+              <w:top w:type="dxa" w:w="60"/>
+              <w:left w:type="dxa" w:w="100"/>
+              <w:bottom w:type="dxa" w:w="60"/>
+              <w:right w:type="dxa" w:w="100"/>
+            </w:tcMar>
+            <w:vAlign w:val="center"/>
+          </w:tcPr>
+          <w:p>
+            <w:r>
+              <w:rPr>
+                <w:rFonts w:ascii="Arial" w:cs="Arial" w:eastAsia="Arial" w:hAnsi="Arial"/>
+                <w:sz w:val="18"/>
+                <w:szCs w:val="18"/>
+              </w:rPr>
+              <w:t xml:space="preserve">Charger → battery</w:t>
+            </w:r>
+          </w:p>
+        </w:tc>
+        <w:tc>
+          <w:tcPr>
+            <w:tcW w:type="dxa" w:w="7306"/>
+            <w:tcBorders>
+              <w:top w:val="single" w:color="B7C9BC" w:sz="4"/>
+              <w:left w:val="single" w:color="B7C9BC" w:sz="4"/>
+              <w:bottom w:val="single" w:color="B7C9BC" w:sz="4"/>
+              <w:right w:val="single" w:color="B7C9BC" w:sz="4"/>
+            </w:tcBorders>
+            <w:shd w:fill="F5F9F5" w:color="auto" w:val="clear"/>
+            <w:tcMar>
+              <w:top w:type="dxa" w:w="60"/>
+              <w:left w:type="dxa" w:w="100"/>
+              <w:bottom w:type="dxa" w:w="60"/>
+              <w:right w:type="dxa" w:w="100"/>
+            </w:tcMar>
+            <w:vAlign w:val="center"/>
+          </w:tcPr>
+          <w:p>
+            <w:r>
+              <w:rPr>
+                <w:rFonts w:ascii="Arial" w:cs="Arial" w:eastAsia="Arial" w:hAnsi="Arial"/>
+                <w:sz w:val="18"/>
+                <w:szCs w:val="18"/>
+              </w:rPr>
+              <w:t xml:space="preserve">CN3791 </w:t>
+            </w:r>
+            <w:r>
+              <w:rPr>
+                <w:rFonts w:ascii="Arial" w:cs="Arial" w:eastAsia="Arial" w:hAnsi="Arial"/>
+                <w:b/>
+                <w:bCs/>
+                <w:sz w:val="18"/>
+                <w:szCs w:val="18"/>
+              </w:rPr>
+              <w:t xml:space="preserve">BAT+ / BAT−</w:t>
+            </w:r>
+            <w:r>
+              <w:rPr>
+                <w:rFonts w:ascii="Arial" w:cs="Arial" w:eastAsia="Arial" w:hAnsi="Arial"/>
+                <w:sz w:val="18"/>
+                <w:szCs w:val="18"/>
+              </w:rPr>
+              <w:t xml:space="preserve"> → 2 × 18650 holder (parallel)</w:t>
+            </w:r>
+          </w:p>
+        </w:tc>
+      </w:tr>
+      <w:tr>
+        <w:trPr>
+          <w:cantSplit/>
+        </w:trPr>
+        <w:tc>
+          <w:tcPr>
+            <w:tcW w:type="dxa" w:w="2600"/>
+            <w:tcBorders>
+              <w:top w:val="single" w:color="B7C9BC" w:sz="4"/>
+              <w:left w:val="single" w:color="B7C9BC" w:sz="4"/>
+              <w:bottom w:val="single" w:color="B7C9BC" w:sz="4"/>
+              <w:right w:val="single" w:color="B7C9BC" w:sz="4"/>
+            </w:tcBorders>
+            <w:tcMar>
+              <w:top w:type="dxa" w:w="60"/>
+              <w:left w:type="dxa" w:w="100"/>
+              <w:bottom w:type="dxa" w:w="60"/>
+              <w:right w:type="dxa" w:w="100"/>
+            </w:tcMar>
+            <w:vAlign w:val="center"/>
+          </w:tcPr>
+          <w:p>
+            <w:r>
+              <w:rPr>
+                <w:rFonts w:ascii="Arial" w:cs="Arial" w:eastAsia="Arial" w:hAnsi="Arial"/>
+                <w:sz w:val="18"/>
+                <w:szCs w:val="18"/>
+              </w:rPr>
+              <w:t xml:space="preserve">Battery → boost</w:t>
+            </w:r>
+          </w:p>
+        </w:tc>
+        <w:tc>
+          <w:tcPr>
+            <w:tcW w:type="dxa" w:w="7306"/>
+            <w:tcBorders>
+              <w:top w:val="single" w:color="B7C9BC" w:sz="4"/>
+              <w:left w:val="single" w:color="B7C9BC" w:sz="4"/>
+              <w:bottom w:val="single" w:color="B7C9BC" w:sz="4"/>
+              <w:right w:val="single" w:color="B7C9BC" w:sz="4"/>
+            </w:tcBorders>
+            <w:tcMar>
+              <w:top w:type="dxa" w:w="60"/>
+              <w:left w:type="dxa" w:w="100"/>
+              <w:bottom w:type="dxa" w:w="60"/>
+              <w:right w:type="dxa" w:w="100"/>
+            </w:tcMar>
+            <w:vAlign w:val="center"/>
+          </w:tcPr>
+          <w:p>
+            <w:r>
+              <w:rPr>
+                <w:rFonts w:ascii="Arial" w:cs="Arial" w:eastAsia="Arial" w:hAnsi="Arial"/>
+                <w:sz w:val="18"/>
+                <w:szCs w:val="18"/>
+              </w:rPr>
+              <w:t xml:space="preserve">Battery (+) → </w:t>
+            </w:r>
+            <w:r>
+              <w:rPr>
+                <w:rFonts w:ascii="Arial" w:cs="Arial" w:eastAsia="Arial" w:hAnsi="Arial"/>
+                <w:b/>
+                <w:bCs/>
+                <w:sz w:val="18"/>
+                <w:szCs w:val="18"/>
+              </w:rPr>
+              <w:t xml:space="preserve">switch</w:t>
+            </w:r>
+            <w:r>
+              <w:rPr>
+                <w:rFonts w:ascii="Arial" w:cs="Arial" w:eastAsia="Arial" w:hAnsi="Arial"/>
+                <w:sz w:val="18"/>
+                <w:szCs w:val="18"/>
+              </w:rPr>
+              <w:t xml:space="preserve"> → MT3608 </w:t>
+            </w:r>
+            <w:r>
+              <w:rPr>
+                <w:rFonts w:ascii="Arial" w:cs="Arial" w:eastAsia="Arial" w:hAnsi="Arial"/>
+                <w:b/>
+                <w:bCs/>
+                <w:sz w:val="18"/>
+                <w:szCs w:val="18"/>
+              </w:rPr>
+              <w:t xml:space="preserve">VIN+</w:t>
+            </w:r>
+            <w:r>
+              <w:rPr>
+                <w:rFonts w:ascii="Arial" w:cs="Arial" w:eastAsia="Arial" w:hAnsi="Arial"/>
+                <w:sz w:val="18"/>
+                <w:szCs w:val="18"/>
+              </w:rPr>
+              <w:t xml:space="preserve"> · battery (−) → </w:t>
+            </w:r>
+            <w:r>
+              <w:rPr>
+                <w:rFonts w:ascii="Arial" w:cs="Arial" w:eastAsia="Arial" w:hAnsi="Arial"/>
+                <w:b/>
+                <w:bCs/>
+                <w:sz w:val="18"/>
+                <w:szCs w:val="18"/>
+              </w:rPr>
+              <w:t xml:space="preserve">VIN−</w:t>
+            </w:r>
+          </w:p>
+        </w:tc>
+      </w:tr>
+      <w:tr>
+        <w:trPr>
+          <w:cantSplit/>
+        </w:trPr>
+        <w:tc>
+          <w:tcPr>
+            <w:tcW w:type="dxa" w:w="2600"/>
+            <w:tcBorders>
+              <w:top w:val="single" w:color="B7C9BC" w:sz="4"/>
+              <w:left w:val="single" w:color="B7C9BC" w:sz="4"/>
+              <w:bottom w:val="single" w:color="B7C9BC" w:sz="4"/>
+              <w:right w:val="single" w:color="B7C9BC" w:sz="4"/>
+            </w:tcBorders>
+            <w:shd w:fill="F5F9F5" w:color="auto" w:val="clear"/>
+            <w:tcMar>
+              <w:top w:type="dxa" w:w="60"/>
+              <w:left w:type="dxa" w:w="100"/>
+              <w:bottom w:type="dxa" w:w="60"/>
+              <w:right w:type="dxa" w:w="100"/>
+            </w:tcMar>
+            <w:vAlign w:val="center"/>
+          </w:tcPr>
+          <w:p>
+            <w:r>
+              <w:rPr>
+                <w:rFonts w:ascii="Arial" w:cs="Arial" w:eastAsia="Arial" w:hAnsi="Arial"/>
+                <w:sz w:val="18"/>
+                <w:szCs w:val="18"/>
+              </w:rPr>
+              <w:t xml:space="preserve">Boost → ESP32</w:t>
+            </w:r>
+          </w:p>
+        </w:tc>
+        <w:tc>
+          <w:tcPr>
+            <w:tcW w:type="dxa" w:w="7306"/>
+            <w:tcBorders>
+              <w:top w:val="single" w:color="B7C9BC" w:sz="4"/>
+              <w:left w:val="single" w:color="B7C9BC" w:sz="4"/>
+              <w:bottom w:val="single" w:color="B7C9BC" w:sz="4"/>
+              <w:right w:val="single" w:color="B7C9BC" w:sz="4"/>
+            </w:tcBorders>
+            <w:shd w:fill="F5F9F5" w:color="auto" w:val="clear"/>
+            <w:tcMar>
+              <w:top w:type="dxa" w:w="60"/>
+              <w:left w:type="dxa" w:w="100"/>
+              <w:bottom w:type="dxa" w:w="60"/>
+              <w:right w:type="dxa" w:w="100"/>
+            </w:tcMar>
+            <w:vAlign w:val="center"/>
+          </w:tcPr>
+          <w:p>
+            <w:r>
+              <w:rPr>
+                <w:rFonts w:ascii="Arial" w:cs="Arial" w:eastAsia="Arial" w:hAnsi="Arial"/>
+                <w:sz w:val="18"/>
+                <w:szCs w:val="18"/>
+              </w:rPr>
+              <w:t xml:space="preserve">MT3608 </w:t>
+            </w:r>
+            <w:r>
+              <w:rPr>
+                <w:rFonts w:ascii="Arial" w:cs="Arial" w:eastAsia="Arial" w:hAnsi="Arial"/>
+                <w:b/>
+                <w:bCs/>
+                <w:sz w:val="18"/>
+                <w:szCs w:val="18"/>
+              </w:rPr>
+              <w:t xml:space="preserve">VOUT+ (5.1 V)</w:t>
+            </w:r>
+            <w:r>
+              <w:rPr>
+                <w:rFonts w:ascii="Arial" w:cs="Arial" w:eastAsia="Arial" w:hAnsi="Arial"/>
+                <w:sz w:val="18"/>
+                <w:szCs w:val="18"/>
+              </w:rPr>
+              <w:t xml:space="preserve"> → ESP32 </w:t>
+            </w:r>
+            <w:r>
+              <w:rPr>
+                <w:rFonts w:ascii="Arial" w:cs="Arial" w:eastAsia="Arial" w:hAnsi="Arial"/>
+                <w:b/>
+                <w:bCs/>
+                <w:sz w:val="18"/>
+                <w:szCs w:val="18"/>
+              </w:rPr>
+              <w:t xml:space="preserve">VIN</w:t>
+            </w:r>
+            <w:r>
+              <w:rPr>
+                <w:rFonts w:ascii="Arial" w:cs="Arial" w:eastAsia="Arial" w:hAnsi="Arial"/>
+                <w:sz w:val="18"/>
+                <w:szCs w:val="18"/>
+              </w:rPr>
+              <w:t xml:space="preserve"> · </w:t>
+            </w:r>
+            <w:r>
+              <w:rPr>
+                <w:rFonts w:ascii="Arial" w:cs="Arial" w:eastAsia="Arial" w:hAnsi="Arial"/>
+                <w:b/>
+                <w:bCs/>
+                <w:sz w:val="18"/>
+                <w:szCs w:val="18"/>
+              </w:rPr>
+              <w:t xml:space="preserve">VOUT−</w:t>
+            </w:r>
+            <w:r>
+              <w:rPr>
+                <w:rFonts w:ascii="Arial" w:cs="Arial" w:eastAsia="Arial" w:hAnsi="Arial"/>
+                <w:sz w:val="18"/>
+                <w:szCs w:val="18"/>
+              </w:rPr>
+              <w:t xml:space="preserve"> → GND</w:t>
+            </w:r>
+          </w:p>
+        </w:tc>
+      </w:tr>
+      <w:tr>
+        <w:trPr>
+          <w:cantSplit/>
+        </w:trPr>
+        <w:tc>
+          <w:tcPr>
+            <w:tcW w:type="dxa" w:w="2600"/>
+            <w:tcBorders>
+              <w:top w:val="single" w:color="B7C9BC" w:sz="4"/>
+              <w:left w:val="single" w:color="B7C9BC" w:sz="4"/>
+              <w:bottom w:val="single" w:color="B7C9BC" w:sz="4"/>
+              <w:right w:val="single" w:color="B7C9BC" w:sz="4"/>
+            </w:tcBorders>
+            <w:tcMar>
+              <w:top w:type="dxa" w:w="60"/>
+              <w:left w:type="dxa" w:w="100"/>
+              <w:bottom w:type="dxa" w:w="60"/>
+              <w:right w:type="dxa" w:w="100"/>
+            </w:tcMar>
+            <w:vAlign w:val="center"/>
+          </w:tcPr>
+          <w:p>
+            <w:r>
+              <w:rPr>
+                <w:rFonts w:ascii="Arial" w:cs="Arial" w:eastAsia="Arial" w:hAnsi="Arial"/>
+                <w:sz w:val="18"/>
+                <w:szCs w:val="18"/>
+              </w:rPr>
+              <w:t xml:space="preserve">Battery sensing</w:t>
+            </w:r>
+          </w:p>
+        </w:tc>
+        <w:tc>
+          <w:tcPr>
+            <w:tcW w:type="dxa" w:w="7306"/>
+            <w:tcBorders>
+              <w:top w:val="single" w:color="B7C9BC" w:sz="4"/>
+              <w:left w:val="single" w:color="B7C9BC" w:sz="4"/>
+              <w:bottom w:val="single" w:color="B7C9BC" w:sz="4"/>
+              <w:right w:val="single" w:color="B7C9BC" w:sz="4"/>
+            </w:tcBorders>
+            <w:tcMar>
+              <w:top w:type="dxa" w:w="60"/>
+              <w:left w:type="dxa" w:w="100"/>
+              <w:bottom w:type="dxa" w:w="60"/>
+              <w:right w:type="dxa" w:w="100"/>
+            </w:tcMar>
+            <w:vAlign w:val="center"/>
+          </w:tcPr>
+          <w:p>
+            <w:r>
+              <w:rPr>
+                <w:rFonts w:ascii="Arial" w:cs="Arial" w:eastAsia="Arial" w:hAnsi="Arial"/>
+                <w:sz w:val="18"/>
+                <w:szCs w:val="18"/>
+              </w:rPr>
+              <w:t xml:space="preserve">Battery (+) → 100 kΩ → </w:t>
+            </w:r>
+            <w:r>
+              <w:rPr>
+                <w:rFonts w:ascii="Arial" w:cs="Arial" w:eastAsia="Arial" w:hAnsi="Arial"/>
+                <w:b/>
+                <w:bCs/>
+                <w:sz w:val="18"/>
+                <w:szCs w:val="18"/>
+              </w:rPr>
+              <w:t xml:space="preserve">GPIO35</w:t>
+            </w:r>
+            <w:r>
+              <w:rPr>
+                <w:rFonts w:ascii="Arial" w:cs="Arial" w:eastAsia="Arial" w:hAnsi="Arial"/>
+                <w:sz w:val="18"/>
+                <w:szCs w:val="18"/>
+              </w:rPr>
+              <w:t xml:space="preserve"> → 100 kΩ → GND</w:t>
+            </w:r>
+          </w:p>
+        </w:tc>
+      </w:tr>
+      <w:tr>
+        <w:trPr>
+          <w:cantSplit/>
+        </w:trPr>
+        <w:tc>
+          <w:tcPr>
+            <w:tcW w:type="dxa" w:w="2600"/>
+            <w:tcBorders>
+              <w:top w:val="single" w:color="B7C9BC" w:sz="4"/>
+              <w:left w:val="single" w:color="B7C9BC" w:sz="4"/>
+              <w:bottom w:val="single" w:color="B7C9BC" w:sz="4"/>
+              <w:right w:val="single" w:color="B7C9BC" w:sz="4"/>
+            </w:tcBorders>
+            <w:shd w:fill="F5F9F5" w:color="auto" w:val="clear"/>
+            <w:tcMar>
+              <w:top w:type="dxa" w:w="60"/>
+              <w:left w:type="dxa" w:w="100"/>
+              <w:bottom w:type="dxa" w:w="60"/>
+              <w:right w:type="dxa" w:w="100"/>
+            </w:tcMar>
+            <w:vAlign w:val="center"/>
+          </w:tcPr>
+          <w:p>
+            <w:r>
+              <w:rPr>
+                <w:rFonts w:ascii="Arial" w:cs="Arial" w:eastAsia="Arial" w:hAnsi="Arial"/>
+                <w:sz w:val="18"/>
+                <w:szCs w:val="18"/>
+              </w:rPr>
+              <w:t xml:space="preserve">Panel sensing</w:t>
+            </w:r>
+          </w:p>
+        </w:tc>
+        <w:tc>
+          <w:tcPr>
+            <w:tcW w:type="dxa" w:w="7306"/>
+            <w:tcBorders>
+              <w:top w:val="single" w:color="B7C9BC" w:sz="4"/>
+              <w:left w:val="single" w:color="B7C9BC" w:sz="4"/>
+              <w:bottom w:val="single" w:color="B7C9BC" w:sz="4"/>
+              <w:right w:val="single" w:color="B7C9BC" w:sz="4"/>
+            </w:tcBorders>
+            <w:shd w:fill="F5F9F5" w:color="auto" w:val="clear"/>
+            <w:tcMar>
+              <w:top w:type="dxa" w:w="60"/>
+              <w:left w:type="dxa" w:w="100"/>
+              <w:bottom w:type="dxa" w:w="60"/>
+              <w:right w:type="dxa" w:w="100"/>
+            </w:tcMar>
+            <w:vAlign w:val="center"/>
+          </w:tcPr>
+          <w:p>
+            <w:r>
+              <w:rPr>
+                <w:rFonts w:ascii="Arial" w:cs="Arial" w:eastAsia="Arial" w:hAnsi="Arial"/>
+                <w:sz w:val="18"/>
+                <w:szCs w:val="18"/>
+              </w:rPr>
+              <w:t xml:space="preserve">Panel (+) → 100 kΩ → 100 kΩ → </w:t>
+            </w:r>
+            <w:r>
+              <w:rPr>
+                <w:rFonts w:ascii="Arial" w:cs="Arial" w:eastAsia="Arial" w:hAnsi="Arial"/>
+                <w:b/>
+                <w:bCs/>
+                <w:sz w:val="18"/>
+                <w:szCs w:val="18"/>
+              </w:rPr>
+              <w:t xml:space="preserve">GPIO39 (VN)</w:t>
+            </w:r>
+            <w:r>
+              <w:rPr>
+                <w:rFonts w:ascii="Arial" w:cs="Arial" w:eastAsia="Arial" w:hAnsi="Arial"/>
+                <w:sz w:val="18"/>
+                <w:szCs w:val="18"/>
+              </w:rPr>
+              <w:t xml:space="preserve"> → 100 kΩ → GND</w:t>
+            </w:r>
+          </w:p>
+        </w:tc>
+      </w:tr>
+    </w:tbl>
+    <w:p>
+      <w:pPr>
+        <w:pStyle w:val="ListParagraph"/>
+        <w:numPr>
+          <w:ilvl w:val="0"/>
+          <w:numId w:val="12"/>
+        </w:numPr>
+        <w:spacing w:after="40" w:before="40"/>
+      </w:pPr>
+      <w:r>
+        <w:rPr>
+          <w:rFonts w:ascii="Arial" w:cs="Arial" w:eastAsia="Arial" w:hAnsi="Arial"/>
+          <w:sz w:val="20"/>
+          <w:szCs w:val="20"/>
+        </w:rPr>
+        <w:t xml:space="preserve">Connect </w:t>
+      </w:r>
+      <w:r>
+        <w:rPr>
+          <w:rFonts w:ascii="Arial" w:cs="Arial" w:eastAsia="Arial" w:hAnsi="Arial"/>
+          <w:b/>
+          <w:bCs/>
+          <w:sz w:val="20"/>
+          <w:szCs w:val="20"/>
+        </w:rPr>
+        <w:t xml:space="preserve">only the batteries</w:t>
+      </w:r>
+      <w:r>
+        <w:rPr>
+          <w:rFonts w:ascii="Arial" w:cs="Arial" w:eastAsia="Arial" w:hAnsi="Arial"/>
+          <w:sz w:val="20"/>
+          <w:szCs w:val="20"/>
+        </w:rPr>
+        <w:t xml:space="preserve"> to the MT3608 and turn its small screw until the multimeter shows </w:t>
+      </w:r>
+      <w:r>
+        <w:rPr>
+          <w:rFonts w:ascii="Arial" w:cs="Arial" w:eastAsia="Arial" w:hAnsi="Arial"/>
+          <w:b/>
+          <w:bCs/>
+          <w:sz w:val="20"/>
+          <w:szCs w:val="20"/>
+        </w:rPr>
+        <w:t xml:space="preserve">5.1 V</w:t>
+      </w:r>
+      <w:r>
+        <w:rPr>
+          <w:rFonts w:ascii="Arial" w:cs="Arial" w:eastAsia="Arial" w:hAnsi="Arial"/>
+          <w:sz w:val="20"/>
+          <w:szCs w:val="20"/>
+        </w:rPr>
+        <w:t xml:space="preserve"> at VOUT.</w:t>
+      </w:r>
+    </w:p>
+    <w:p>
+      <w:pPr>
+        <w:pStyle w:val="ListParagraph"/>
+        <w:numPr>
+          <w:ilvl w:val="0"/>
+          <w:numId w:val="12"/>
+        </w:numPr>
+        <w:spacing w:after="40" w:before="40"/>
+      </w:pPr>
+      <w:r>
+        <w:rPr>
+          <w:rFonts w:ascii="Arial" w:cs="Arial" w:eastAsia="Arial" w:hAnsi="Arial"/>
+          <w:sz w:val="20"/>
+          <w:szCs w:val="20"/>
+        </w:rPr>
+        <w:t xml:space="preserve">Wire the panel, charger, batteries, switch and the two dividers as in the table.</w:t>
+      </w:r>
+    </w:p>
+    <w:p>
+      <w:pPr>
+        <w:pStyle w:val="ListParagraph"/>
+        <w:numPr>
+          <w:ilvl w:val="0"/>
+          <w:numId w:val="12"/>
+        </w:numPr>
+        <w:spacing w:after="40" w:before="40"/>
+      </w:pPr>
+      <w:r>
+        <w:rPr>
+          <w:rFonts w:ascii="Arial" w:cs="Arial" w:eastAsia="Arial" w:hAnsi="Arial"/>
+          <w:sz w:val="20"/>
+          <w:szCs w:val="20"/>
+        </w:rPr>
+        <w:t xml:space="preserve">In </w:t>
+      </w:r>
+      <w:r>
+        <w:rPr>
+          <w:rFonts w:ascii="Consolas" w:cs="Consolas" w:eastAsia="Consolas" w:hAnsi="Consolas"/>
+          <w:color w:val="1D4F7A"/>
+          <w:sz w:val="20"/>
+          <w:szCs w:val="20"/>
+        </w:rPr>
+        <w:t xml:space="preserve">config.h</w:t>
+      </w:r>
+      <w:r>
+        <w:rPr>
+          <w:rFonts w:ascii="Arial" w:cs="Arial" w:eastAsia="Arial" w:hAnsi="Arial"/>
+          <w:sz w:val="20"/>
+          <w:szCs w:val="20"/>
+        </w:rPr>
+        <w:t xml:space="preserve"> set </w:t>
+      </w:r>
+      <w:r>
+        <w:rPr>
+          <w:rFonts w:ascii="Consolas" w:cs="Consolas" w:eastAsia="Consolas" w:hAnsi="Consolas"/>
+          <w:color w:val="1D4F7A"/>
+          <w:sz w:val="20"/>
+          <w:szCs w:val="20"/>
+        </w:rPr>
+        <w:t xml:space="preserve">#define SOLAR_ENABLED 1</w:t>
+      </w:r>
+      <w:r>
+        <w:rPr>
+          <w:rFonts w:ascii="Arial" w:cs="Arial" w:eastAsia="Arial" w:hAnsi="Arial"/>
+          <w:sz w:val="20"/>
+          <w:szCs w:val="20"/>
+        </w:rPr>
+        <w:t xml:space="preserve"> and upload with the USB cable. </w:t>
+      </w:r>
+      <w:r>
+        <w:rPr>
+          <w:rFonts w:ascii="Arial" w:cs="Arial" w:eastAsia="Arial" w:hAnsi="Arial"/>
+          <w:b/>
+          <w:bCs/>
+          <w:sz w:val="20"/>
+          <w:szCs w:val="20"/>
+        </w:rPr>
+        <w:t xml:space="preserve">Unplug the USB cable</w:t>
+      </w:r>
+      <w:r>
+        <w:rPr>
+          <w:rFonts w:ascii="Arial" w:cs="Arial" w:eastAsia="Arial" w:hAnsi="Arial"/>
+          <w:sz w:val="20"/>
+          <w:szCs w:val="20"/>
+        </w:rPr>
+        <w:t xml:space="preserve">, then connect the MT3608 to VIN/GND and switch on.</w:t>
+      </w:r>
+    </w:p>
+    <w:p>
+      <w:pPr>
+        <w:pStyle w:val="ListParagraph"/>
+        <w:numPr>
+          <w:ilvl w:val="0"/>
+          <w:numId w:val="12"/>
+        </w:numPr>
+        <w:spacing w:after="40" w:before="40"/>
+      </w:pPr>
+      <w:r>
+        <w:rPr>
+          <w:rFonts w:ascii="Arial" w:cs="Arial" w:eastAsia="Arial" w:hAnsi="Arial"/>
+          <w:sz w:val="20"/>
+          <w:szCs w:val="20"/>
+        </w:rPr>
+        <w:t xml:space="preserve">Compare the battery voltage on the multimeter with the Serial Monitor line </w:t>
+      </w:r>
+      <w:r>
+        <w:rPr>
+          <w:rFonts w:ascii="Consolas" w:cs="Consolas" w:eastAsia="Consolas" w:hAnsi="Consolas"/>
+          <w:color w:val="1D4F7A"/>
+          <w:sz w:val="20"/>
+          <w:szCs w:val="20"/>
+        </w:rPr>
+        <w:t xml:space="preserve">power: battery=…</w:t>
+      </w:r>
+      <w:r>
+        <w:rPr>
+          <w:rFonts w:ascii="Arial" w:cs="Arial" w:eastAsia="Arial" w:hAnsi="Arial"/>
+          <w:sz w:val="20"/>
+          <w:szCs w:val="20"/>
+        </w:rPr>
+        <w:t xml:space="preserve">. If it differs by more than 0.05 V, adjust </w:t>
+      </w:r>
+      <w:r>
+        <w:rPr>
+          <w:rFonts w:ascii="Consolas" w:cs="Consolas" w:eastAsia="Consolas" w:hAnsi="Consolas"/>
+          <w:color w:val="1D4F7A"/>
+          <w:sz w:val="20"/>
+          <w:szCs w:val="20"/>
+        </w:rPr>
+        <w:t xml:space="preserve">BATTERY_DIVIDER</w:t>
+      </w:r>
+      <w:r>
+        <w:rPr>
+          <w:rFonts w:ascii="Arial" w:cs="Arial" w:eastAsia="Arial" w:hAnsi="Arial"/>
+          <w:sz w:val="20"/>
+          <w:szCs w:val="20"/>
+        </w:rPr>
+        <w:t xml:space="preserve">.</w:t>
+      </w:r>
+    </w:p>
+    <w:p>
+      <w:pPr>
+        <w:pBdr>
+          <w:left w:val="single" w:color="C77700" w:sz="18" w:space="8"/>
+        </w:pBdr>
+        <w:shd w:fill="FFF4E0" w:color="auto" w:val="clear"/>
+        <w:spacing w:after="100" w:before="100"/>
+        <w:ind w:left="200"/>
+      </w:pPr>
+      <w:r>
+        <w:rPr>
+          <w:rFonts w:ascii="Arial" w:cs="Arial" w:eastAsia="Arial" w:hAnsi="Arial"/>
+          <w:sz w:val="20"/>
+          <w:szCs w:val="20"/>
+        </w:rPr>
+        <w:t xml:space="preserve">Never connect the USB cable and the MT3608 at the same time. Use protected 18650 cells and keep the charger and batteries inside the box.</w:t>
+      </w:r>
+    </w:p>
+    <w:p>
+      <w:pPr>
+        <w:spacing w:after="60" w:before="60"/>
+      </w:pPr>
+      <w:r>
+        <w:rPr>
+          <w:rFonts w:ascii="Arial" w:cs="Arial" w:eastAsia="Arial" w:hAnsi="Arial"/>
+          <w:b/>
+          <w:bCs/>
+          <w:sz w:val="20"/>
+          <w:szCs w:val="20"/>
+        </w:rPr>
+        <w:t xml:space="preserve">Check:</w:t>
+      </w:r>
+      <w:r>
+        <w:rPr>
+          <w:rFonts w:ascii="Arial" w:cs="Arial" w:eastAsia="Arial" w:hAnsi="Arial"/>
+          <w:sz w:val="20"/>
+          <w:szCs w:val="20"/>
+        </w:rPr>
+        <w:t xml:space="preserve"> in the sun the apps show 🔋 battery % and “Charging from the sun ☀️”; covering the panel shows “Not charging now”.</w:t>
+      </w:r>
+    </w:p>
+    <w:p>
+      <w:pPr>
+        <w:pStyle w:val="Heading2"/>
+        <w:spacing w:after="100" w:before="240"/>
+      </w:pPr>
+      <w:r>
+        <w:rPr>
+          <w:rFonts w:ascii="Arial" w:cs="Arial" w:eastAsia="Arial" w:hAnsi="Arial"/>
+          <w:b/>
+          <w:bCs/>
+          <w:color w:val="2F7D4F"/>
+          <w:sz w:val="26"/>
+          <w:szCs w:val="26"/>
+        </w:rPr>
+        <w:t xml:space="preserve">Step 12: Test everything</w:t>
       </w:r>
     </w:p>
     <w:p>
@@ -6289,7 +7697,7 @@
           <w:sz w:val="20"/>
           <w:szCs w:val="20"/>
         </w:rPr>
-        <w:t xml:space="preserve">Turn the Wi-Fi off → the face and melodies still work; the apps show “Offline”.</w:t>
+        <w:t xml:space="preserve">Turn the Wi-Fi off → the melodies still work; the apps show “Offline”.</w:t>
       </w:r>
     </w:p>
     <w:p>
@@ -6307,41 +7715,7 @@
           <w:sz w:val="20"/>
           <w:szCs w:val="20"/>
         </w:rPr>
-        <w:t xml:space="preserve">Full test table: </w:t>
-      </w:r>
-      <w:r>
-        <w:rPr>
-          <w:rFonts w:ascii="Consolas" w:cs="Consolas" w:eastAsia="Consolas" w:hAnsi="Consolas"/>
-          <w:color w:val="1D4F7A"/>
-          <w:sz w:val="20"/>
-          <w:szCs w:val="20"/>
-        </w:rPr>
-        <w:t xml:space="preserve">docs/08-testing-calibration.md</w:t>
-      </w:r>
-      <w:r>
-        <w:rPr>
-          <w:rFonts w:ascii="Arial" w:cs="Arial" w:eastAsia="Arial" w:hAnsi="Arial"/>
-          <w:sz w:val="20"/>
-          <w:szCs w:val="20"/>
-        </w:rPr>
-        <w:t xml:space="preserve">.</w:t>
-      </w:r>
-    </w:p>
-    <w:p>
-      <w:pPr>
-        <w:pStyle w:val="Heading2"/>
-        <w:spacing w:after="100" w:before="240"/>
-      </w:pPr>
-      <w:r>
-        <w:rPr>
-          <w:rFonts w:ascii="Arial" w:cs="Arial" w:eastAsia="Arial" w:hAnsi="Arial"/>
-          <w:b/>
-          <w:bCs/>
-          <w:color w:val="2F7D4F"/>
-          <w:sz w:val="26"/>
-          <w:szCs w:val="26"/>
-        </w:rPr>
-        <w:t xml:space="preserve">Step 12: Final assembly, report and presentation</w:t>
+        <w:t xml:space="preserve">Cover the solar panel → the apps show “Not charging now”; leave it outside for 24 h → battery chart rises in the day.</w:t>
       </w:r>
     </w:p>
     <w:p>
@@ -6359,7 +7733,41 @@
           <w:sz w:val="20"/>
           <w:szCs w:val="20"/>
         </w:rPr>
-        <w:t xml:space="preserve">Move the circuit to a small perfboard or mini breadboard inside a box fixed to the pot: holes for the buzzer and the USB cable; DHT22 and BH1750 outside the box.</w:t>
+        <w:t xml:space="preserve">Full test table: </w:t>
+      </w:r>
+      <w:r>
+        <w:rPr>
+          <w:rFonts w:ascii="Consolas" w:cs="Consolas" w:eastAsia="Consolas" w:hAnsi="Consolas"/>
+          <w:color w:val="1D4F7A"/>
+          <w:sz w:val="20"/>
+          <w:szCs w:val="20"/>
+        </w:rPr>
+        <w:t xml:space="preserve">docs/08-testing-calibration.md</w:t>
+      </w:r>
+      <w:r>
+        <w:rPr>
+          <w:rFonts w:ascii="Arial" w:cs="Arial" w:eastAsia="Arial" w:hAnsi="Arial"/>
+          <w:sz w:val="20"/>
+          <w:szCs w:val="20"/>
+        </w:rPr>
+        <w:t xml:space="preserve">.</w:t>
+      </w:r>
+    </w:p>
+    <w:p>
+      <w:pPr>
+        <w:pStyle w:val="Heading2"/>
+        <w:spacing w:after="100" w:before="240"/>
+      </w:pPr>
+      <w:r>
+        <w:rPr>
+          <w:rFonts w:ascii="Arial" w:cs="Arial" w:eastAsia="Arial" w:hAnsi="Arial"/>
+          <w:b/>
+          <w:bCs/>
+          <w:color w:val="2F7D4F"/>
+          <w:sz w:val="26"/>
+          <w:szCs w:val="26"/>
+        </w:rPr>
+        <w:t xml:space="preserve">Step 13: Final assembly, report and presentation</w:t>
       </w:r>
     </w:p>
     <w:p>
@@ -6377,7 +7785,25 @@
           <w:sz w:val="20"/>
           <w:szCs w:val="20"/>
         </w:rPr>
-        <w:t xml:space="preserve">Power it from the power bank (≈ 2–3 days with 10,000 mAh) or a USB phone charger.</w:t>
+        <w:t xml:space="preserve">Move the circuit to a small perfboard or mini breadboard inside a box fixed to the pot, together with the charger, batteries and boost converter; DHT22 and BH1750 outside the box.</w:t>
+      </w:r>
+    </w:p>
+    <w:p>
+      <w:pPr>
+        <w:pStyle w:val="ListParagraph"/>
+        <w:numPr>
+          <w:ilvl w:val="0"/>
+          <w:numId w:val="2"/>
+        </w:numPr>
+        <w:spacing w:after="30" w:before="30"/>
+      </w:pPr>
+      <w:r>
+        <w:rPr>
+          <w:rFonts w:ascii="Arial" w:cs="Arial" w:eastAsia="Arial" w:hAnsi="Arial"/>
+          <w:sz w:val="20"/>
+          <w:szCs w:val="20"/>
+        </w:rPr>
+        <w:t xml:space="preserve">Place the solar panel outside the box, facing the sun. The battery runs the plant ≈ 39 hours without sun.</w:t>
       </w:r>
     </w:p>
     <w:p>
@@ -7237,7 +8663,7 @@
                 <w:sz w:val="18"/>
                 <w:szCs w:val="18"/>
               </w:rPr>
-              <w:t xml:space="preserve"> starts the screen, sensors, buzzer and Wi-Fi. </w:t>
+              <w:t xml:space="preserve"> starts the sensors, the power monitor, the buzzer and Wi-Fi. </w:t>
             </w:r>
             <w:r>
               <w:rPr>
@@ -7254,7 +8680,7 @@
                 <w:sz w:val="18"/>
                 <w:szCs w:val="18"/>
               </w:rPr>
-              <w:t xml:space="preserve"> reads sensors every 2 s, decides the mood, plays melodies, uploads to Firebase every 30 s, draws the face, handles the button</w:t>
+              <w:t xml:space="preserve"> reads the sensors and the battery every 2 s, decides the mood, plays melodies, uploads to Firebase every 30 s (2 min in power-saving mode), handles the button</w:t>
             </w:r>
           </w:p>
         </w:tc>
@@ -7356,7 +8782,25 @@
                 <w:sz w:val="18"/>
                 <w:szCs w:val="18"/>
               </w:rPr>
-              <w:t xml:space="preserve">: Wi-Fi name/password, Firebase API key, database URL, device account, PLANT_ID, timing, soil calibration, time zone</w:t>
+              <w:t xml:space="preserve">: Wi-Fi name/password, Firebase API key, database URL, device account, PLANT_ID, timing, soil calibration, </w:t>
+            </w:r>
+            <w:r>
+              <w:rPr>
+                <w:rFonts w:ascii="Arial" w:cs="Arial" w:eastAsia="Arial" w:hAnsi="Arial"/>
+                <w:b/>
+                <w:bCs/>
+                <w:sz w:val="18"/>
+                <w:szCs w:val="18"/>
+              </w:rPr>
+              <w:t xml:space="preserve">solar settings</w:t>
+            </w:r>
+            <w:r>
+              <w:rPr>
+                <w:rFonts w:ascii="Arial" w:cs="Arial" w:eastAsia="Arial" w:hAnsi="Arial"/>
+                <w:sz w:val="18"/>
+                <w:szCs w:val="18"/>
+              </w:rPr>
+              <w:t xml:space="preserve"> (SOLAR_ENABLED, dividers, low-battery level), time zone</w:t>
             </w:r>
           </w:p>
         </w:tc>
@@ -7449,7 +8893,7 @@
                 <w:sz w:val="18"/>
                 <w:szCs w:val="18"/>
               </w:rPr>
-              <w:t xml:space="preserve">Which ESP32 pin each module uses (soil 34, DHT 4, buzzer 25, button 13, I2C 21/22)</w:t>
+              <w:t xml:space="preserve">Which ESP32 pin each module uses (soil 34, battery 35, panel 39, DHT 4, buzzer 25, button 13, I2C 21/22)</w:t>
             </w:r>
           </w:p>
         </w:tc>
@@ -7758,7 +9202,217 @@
                 <w:sz w:val="18"/>
                 <w:szCs w:val="18"/>
               </w:rPr>
-              <w:t xml:space="preserve">The current plant state (readings, mood, Wi-Fi) shared with the cloud upload</w:t>
+              <w:t xml:space="preserve">The current plant state (readings, power, mood, Wi-Fi) shared with the cloud upload</w:t>
+            </w:r>
+          </w:p>
+        </w:tc>
+        <w:tc>
+          <w:tcPr>
+            <w:tcW w:type="dxa" w:w="1600"/>
+            <w:tcBorders>
+              <w:top w:val="single" w:color="B7C9BC" w:sz="4"/>
+              <w:left w:val="single" w:color="B7C9BC" w:sz="4"/>
+              <w:bottom w:val="single" w:color="B7C9BC" w:sz="4"/>
+              <w:right w:val="single" w:color="B7C9BC" w:sz="4"/>
+            </w:tcBorders>
+            <w:shd w:fill="F5F9F5" w:color="auto" w:val="clear"/>
+            <w:tcMar>
+              <w:top w:type="dxa" w:w="60"/>
+              <w:left w:type="dxa" w:w="100"/>
+              <w:bottom w:type="dxa" w:w="60"/>
+              <w:right w:type="dxa" w:w="100"/>
+            </w:tcMar>
+            <w:vAlign w:val="center"/>
+          </w:tcPr>
+          <w:p>
+            <w:r>
+              <w:rPr>
+                <w:rFonts w:ascii="Arial" w:cs="Arial" w:eastAsia="Arial" w:hAnsi="Arial"/>
+                <w:sz w:val="18"/>
+                <w:szCs w:val="18"/>
+              </w:rPr>
+              <w:t xml:space="preserve">No</w:t>
+            </w:r>
+          </w:p>
+        </w:tc>
+      </w:tr>
+      <w:tr>
+        <w:trPr>
+          <w:cantSplit/>
+        </w:trPr>
+        <w:tc>
+          <w:tcPr>
+            <w:tcW w:type="dxa" w:w="2300"/>
+            <w:tcBorders>
+              <w:top w:val="single" w:color="B7C9BC" w:sz="4"/>
+              <w:left w:val="single" w:color="B7C9BC" w:sz="4"/>
+              <w:bottom w:val="single" w:color="B7C9BC" w:sz="4"/>
+              <w:right w:val="single" w:color="B7C9BC" w:sz="4"/>
+            </w:tcBorders>
+            <w:tcMar>
+              <w:top w:type="dxa" w:w="60"/>
+              <w:left w:type="dxa" w:w="100"/>
+              <w:bottom w:type="dxa" w:w="60"/>
+              <w:right w:type="dxa" w:w="100"/>
+            </w:tcMar>
+            <w:vAlign w:val="center"/>
+          </w:tcPr>
+          <w:p>
+            <w:r>
+              <w:rPr>
+                <w:rFonts w:ascii="Consolas" w:cs="Consolas" w:eastAsia="Consolas" w:hAnsi="Consolas"/>
+                <w:color w:val="1D4F7A"/>
+                <w:sz w:val="18"/>
+                <w:szCs w:val="18"/>
+              </w:rPr>
+              <w:t xml:space="preserve">power.h</w:t>
+            </w:r>
+            <w:r>
+              <w:rPr>
+                <w:rFonts w:ascii="Arial" w:cs="Arial" w:eastAsia="Arial" w:hAnsi="Arial"/>
+                <w:sz w:val="18"/>
+                <w:szCs w:val="18"/>
+              </w:rPr>
+              <w:t xml:space="preserve"> / </w:t>
+            </w:r>
+            <w:r>
+              <w:rPr>
+                <w:rFonts w:ascii="Consolas" w:cs="Consolas" w:eastAsia="Consolas" w:hAnsi="Consolas"/>
+                <w:color w:val="1D4F7A"/>
+                <w:sz w:val="18"/>
+                <w:szCs w:val="18"/>
+              </w:rPr>
+              <w:t xml:space="preserve">power.cpp</w:t>
+            </w:r>
+          </w:p>
+        </w:tc>
+        <w:tc>
+          <w:tcPr>
+            <w:tcW w:type="dxa" w:w="6006"/>
+            <w:tcBorders>
+              <w:top w:val="single" w:color="B7C9BC" w:sz="4"/>
+              <w:left w:val="single" w:color="B7C9BC" w:sz="4"/>
+              <w:bottom w:val="single" w:color="B7C9BC" w:sz="4"/>
+              <w:right w:val="single" w:color="B7C9BC" w:sz="4"/>
+            </w:tcBorders>
+            <w:tcMar>
+              <w:top w:type="dxa" w:w="60"/>
+              <w:left w:type="dxa" w:w="100"/>
+              <w:bottom w:type="dxa" w:w="60"/>
+              <w:right w:type="dxa" w:w="100"/>
+            </w:tcMar>
+            <w:vAlign w:val="center"/>
+          </w:tcPr>
+          <w:p>
+            <w:r>
+              <w:rPr>
+                <w:rFonts w:ascii="Arial" w:cs="Arial" w:eastAsia="Arial" w:hAnsi="Arial"/>
+                <w:b/>
+                <w:bCs/>
+                <w:sz w:val="18"/>
+                <w:szCs w:val="18"/>
+              </w:rPr>
+              <w:t xml:space="preserve">Solar part:</w:t>
+            </w:r>
+            <w:r>
+              <w:rPr>
+                <w:rFonts w:ascii="Arial" w:cs="Arial" w:eastAsia="Arial" w:hAnsi="Arial"/>
+                <w:sz w:val="18"/>
+                <w:szCs w:val="18"/>
+              </w:rPr>
+              <w:t xml:space="preserve"> reads the battery voltage (GPIO35) and the panel voltage (GPIO39) through the dividers</w:t>
+            </w:r>
+          </w:p>
+        </w:tc>
+        <w:tc>
+          <w:tcPr>
+            <w:tcW w:type="dxa" w:w="1600"/>
+            <w:tcBorders>
+              <w:top w:val="single" w:color="B7C9BC" w:sz="4"/>
+              <w:left w:val="single" w:color="B7C9BC" w:sz="4"/>
+              <w:bottom w:val="single" w:color="B7C9BC" w:sz="4"/>
+              <w:right w:val="single" w:color="B7C9BC" w:sz="4"/>
+            </w:tcBorders>
+            <w:tcMar>
+              <w:top w:type="dxa" w:w="60"/>
+              <w:left w:type="dxa" w:w="100"/>
+              <w:bottom w:type="dxa" w:w="60"/>
+              <w:right w:type="dxa" w:w="100"/>
+            </w:tcMar>
+            <w:vAlign w:val="center"/>
+          </w:tcPr>
+          <w:p>
+            <w:r>
+              <w:rPr>
+                <w:rFonts w:ascii="Arial" w:cs="Arial" w:eastAsia="Arial" w:hAnsi="Arial"/>
+                <w:sz w:val="18"/>
+                <w:szCs w:val="18"/>
+              </w:rPr>
+              <w:t xml:space="preserve">No</w:t>
+            </w:r>
+          </w:p>
+        </w:tc>
+      </w:tr>
+      <w:tr>
+        <w:trPr>
+          <w:cantSplit/>
+        </w:trPr>
+        <w:tc>
+          <w:tcPr>
+            <w:tcW w:type="dxa" w:w="2300"/>
+            <w:tcBorders>
+              <w:top w:val="single" w:color="B7C9BC" w:sz="4"/>
+              <w:left w:val="single" w:color="B7C9BC" w:sz="4"/>
+              <w:bottom w:val="single" w:color="B7C9BC" w:sz="4"/>
+              <w:right w:val="single" w:color="B7C9BC" w:sz="4"/>
+            </w:tcBorders>
+            <w:shd w:fill="F5F9F5" w:color="auto" w:val="clear"/>
+            <w:tcMar>
+              <w:top w:type="dxa" w:w="60"/>
+              <w:left w:type="dxa" w:w="100"/>
+              <w:bottom w:type="dxa" w:w="60"/>
+              <w:right w:type="dxa" w:w="100"/>
+            </w:tcMar>
+            <w:vAlign w:val="center"/>
+          </w:tcPr>
+          <w:p>
+            <w:r>
+              <w:rPr>
+                <w:rFonts w:ascii="Consolas" w:cs="Consolas" w:eastAsia="Consolas" w:hAnsi="Consolas"/>
+                <w:color w:val="1D4F7A"/>
+                <w:sz w:val="18"/>
+                <w:szCs w:val="18"/>
+              </w:rPr>
+              <w:t xml:space="preserve">power_calc.h</w:t>
+            </w:r>
+          </w:p>
+        </w:tc>
+        <w:tc>
+          <w:tcPr>
+            <w:tcW w:type="dxa" w:w="6006"/>
+            <w:tcBorders>
+              <w:top w:val="single" w:color="B7C9BC" w:sz="4"/>
+              <w:left w:val="single" w:color="B7C9BC" w:sz="4"/>
+              <w:bottom w:val="single" w:color="B7C9BC" w:sz="4"/>
+              <w:right w:val="single" w:color="B7C9BC" w:sz="4"/>
+            </w:tcBorders>
+            <w:shd w:fill="F5F9F5" w:color="auto" w:val="clear"/>
+            <w:tcMar>
+              <w:top w:type="dxa" w:w="60"/>
+              <w:left w:type="dxa" w:w="100"/>
+              <w:bottom w:type="dxa" w:w="60"/>
+              <w:right w:type="dxa" w:w="100"/>
+            </w:tcMar>
+            <w:vAlign w:val="center"/>
+          </w:tcPr>
+          <w:p>
+            <w:r>
+              <w:rPr>
+                <w:rFonts w:ascii="Arial" w:cs="Arial" w:eastAsia="Arial" w:hAnsi="Arial"/>
+                <w:sz w:val="18"/>
+                <w:szCs w:val="18"/>
+              </w:rPr>
+              <w:t xml:space="preserve">Battery % from voltage, “is charging”, power-saving mode below 15 % (tested on a PC)</w:t>
             </w:r>
           </w:p>
         </w:tc>
@@ -9972,7 +11626,7 @@
                 <w:sz w:val="18"/>
                 <w:szCs w:val="18"/>
               </w:rPr>
-              <w:t xml:space="preserve">Main screen with 3 tabs: Plant (emoji + values + Play/Mute), History (chart), Diary</w:t>
+              <w:t xml:space="preserve">Main screen with 3 tabs: Plant (emoji + values + battery/solar + Play/Mute), History (chart incl. battery), Diary</w:t>
             </w:r>
           </w:p>
         </w:tc>
@@ -10747,7 +12401,7 @@
                 <w:sz w:val="18"/>
                 <w:szCs w:val="18"/>
               </w:rPr>
-              <w:t xml:space="preserve">Automatic tests of the mood logic on a PC (33 checks)</w:t>
+              <w:t xml:space="preserve">Automatic tests of the mood logic and the solar battery calculations on a PC (47 checks)</w:t>
             </w:r>
           </w:p>
         </w:tc>
@@ -10919,7 +12573,7 @@
                 <w:sz w:val="18"/>
                 <w:szCs w:val="18"/>
               </w:rPr>
-              <w:t xml:space="preserve">docs/10</w:t>
+              <w:t xml:space="preserve">docs/12</w:t>
             </w:r>
             <w:r>
               <w:rPr>
@@ -10955,7 +12609,35 @@
                 <w:sz w:val="18"/>
                 <w:szCs w:val="18"/>
               </w:rPr>
-              <w:t xml:space="preserve">Chapters: requirements, components, wiring, Firebase, firmware, web, Android, testing, plan, report outline</w:t>
+              <w:t xml:space="preserve">Chapters: requirements, components, wiring, Firebase, firmware, web, Android, testing, plan, report outline, </w:t>
+            </w:r>
+            <w:r>
+              <w:rPr>
+                <w:rFonts w:ascii="Arial" w:cs="Arial" w:eastAsia="Arial" w:hAnsi="Arial"/>
+                <w:b/>
+                <w:bCs/>
+                <w:sz w:val="18"/>
+                <w:szCs w:val="18"/>
+              </w:rPr>
+              <w:t xml:space="preserve">solar power</w:t>
+            </w:r>
+            <w:r>
+              <w:rPr>
+                <w:rFonts w:ascii="Arial" w:cs="Arial" w:eastAsia="Arial" w:hAnsi="Arial"/>
+                <w:sz w:val="18"/>
+                <w:szCs w:val="18"/>
+              </w:rPr>
+              <w:t xml:space="preserve">, </w:t>
+            </w:r>
+            <w:r>
+              <w:rPr>
+                <w:rFonts w:ascii="Arial" w:cs="Arial" w:eastAsia="Arial" w:hAnsi="Arial"/>
+                <w:b/>
+                <w:bCs/>
+                <w:sz w:val="18"/>
+                <w:szCs w:val="18"/>
+              </w:rPr>
+              <w:t xml:space="preserve">future AI</w:t>
             </w:r>
           </w:p>
         </w:tc>
@@ -11138,7 +12820,7 @@
                 <w:sz w:val="18"/>
                 <w:szCs w:val="18"/>
               </w:rPr>
-              <w:t xml:space="preserve">Component list in Arabic + English with expected prices</w:t>
+              <w:t xml:space="preserve">Component lists (main part + separate solar part) in Arabic + English with codes, prices and buy links</w:t>
             </w:r>
           </w:p>
         </w:tc>
@@ -12371,7 +14053,7 @@
                 <w:sz w:val="18"/>
                 <w:szCs w:val="18"/>
               </w:rPr>
-              <w:t xml:space="preserve">Latest readings + mood + time</w:t>
+              <w:t xml:space="preserve">Latest readings + mood + battery / solar + time</w:t>
             </w:r>
           </w:p>
         </w:tc>
@@ -12852,6 +14534,128 @@
                 <w:szCs w:val="18"/>
               </w:rPr>
               <w:t xml:space="preserve">Melody number 1–9 to play</w:t>
+            </w:r>
+          </w:p>
+        </w:tc>
+      </w:tr>
+      <w:tr>
+        <w:trPr>
+          <w:cantSplit/>
+        </w:trPr>
+        <w:tc>
+          <w:tcPr>
+            <w:tcW w:type="dxa" w:w="2500"/>
+            <w:tcBorders>
+              <w:top w:val="single" w:color="B7C9BC" w:sz="4"/>
+              <w:left w:val="single" w:color="B7C9BC" w:sz="4"/>
+              <w:bottom w:val="single" w:color="B7C9BC" w:sz="4"/>
+              <w:right w:val="single" w:color="B7C9BC" w:sz="4"/>
+            </w:tcBorders>
+            <w:shd w:fill="F5F9F5" w:color="auto" w:val="clear"/>
+            <w:tcMar>
+              <w:top w:type="dxa" w:w="60"/>
+              <w:left w:type="dxa" w:w="100"/>
+              <w:bottom w:type="dxa" w:w="60"/>
+              <w:right w:type="dxa" w:w="100"/>
+            </w:tcMar>
+            <w:vAlign w:val="center"/>
+          </w:tcPr>
+          <w:p>
+            <w:r>
+              <w:rPr>
+                <w:rFonts w:ascii="Consolas" w:cs="Consolas" w:eastAsia="Consolas" w:hAnsi="Consolas"/>
+                <w:color w:val="1D4F7A"/>
+                <w:sz w:val="18"/>
+                <w:szCs w:val="18"/>
+              </w:rPr>
+              <w:t xml:space="preserve">plants/plant01/ai</w:t>
+            </w:r>
+          </w:p>
+        </w:tc>
+        <w:tc>
+          <w:tcPr>
+            <w:tcW w:type="dxa" w:w="2400"/>
+            <w:tcBorders>
+              <w:top w:val="single" w:color="B7C9BC" w:sz="4"/>
+              <w:left w:val="single" w:color="B7C9BC" w:sz="4"/>
+              <w:bottom w:val="single" w:color="B7C9BC" w:sz="4"/>
+              <w:right w:val="single" w:color="B7C9BC" w:sz="4"/>
+            </w:tcBorders>
+            <w:shd w:fill="F5F9F5" w:color="auto" w:val="clear"/>
+            <w:tcMar>
+              <w:top w:type="dxa" w:w="60"/>
+              <w:left w:type="dxa" w:w="100"/>
+              <w:bottom w:type="dxa" w:w="60"/>
+              <w:right w:type="dxa" w:w="100"/>
+            </w:tcMar>
+            <w:vAlign w:val="center"/>
+          </w:tcPr>
+          <w:p>
+            <w:r>
+              <w:rPr>
+                <w:rFonts w:ascii="Arial" w:cs="Arial" w:eastAsia="Arial" w:hAnsi="Arial"/>
+                <w:sz w:val="18"/>
+                <w:szCs w:val="18"/>
+              </w:rPr>
+              <w:t xml:space="preserve">Future AI part (chapter 12)</w:t>
+            </w:r>
+          </w:p>
+        </w:tc>
+        <w:tc>
+          <w:tcPr>
+            <w:tcW w:type="dxa" w:w="2400"/>
+            <w:tcBorders>
+              <w:top w:val="single" w:color="B7C9BC" w:sz="4"/>
+              <w:left w:val="single" w:color="B7C9BC" w:sz="4"/>
+              <w:bottom w:val="single" w:color="B7C9BC" w:sz="4"/>
+              <w:right w:val="single" w:color="B7C9BC" w:sz="4"/>
+            </w:tcBorders>
+            <w:shd w:fill="F5F9F5" w:color="auto" w:val="clear"/>
+            <w:tcMar>
+              <w:top w:type="dxa" w:w="60"/>
+              <w:left w:type="dxa" w:w="100"/>
+              <w:bottom w:type="dxa" w:w="60"/>
+              <w:right w:type="dxa" w:w="100"/>
+            </w:tcMar>
+            <w:vAlign w:val="center"/>
+          </w:tcPr>
+          <w:p>
+            <w:r>
+              <w:rPr>
+                <w:rFonts w:ascii="Arial" w:cs="Arial" w:eastAsia="Arial" w:hAnsi="Arial"/>
+                <w:sz w:val="18"/>
+                <w:szCs w:val="18"/>
+              </w:rPr>
+              <w:t xml:space="preserve">Web, Android (future)</w:t>
+            </w:r>
+          </w:p>
+        </w:tc>
+        <w:tc>
+          <w:tcPr>
+            <w:tcW w:type="dxa" w:w="2606"/>
+            <w:tcBorders>
+              <w:top w:val="single" w:color="B7C9BC" w:sz="4"/>
+              <w:left w:val="single" w:color="B7C9BC" w:sz="4"/>
+              <w:bottom w:val="single" w:color="B7C9BC" w:sz="4"/>
+              <w:right w:val="single" w:color="B7C9BC" w:sz="4"/>
+            </w:tcBorders>
+            <w:shd w:fill="F5F9F5" w:color="auto" w:val="clear"/>
+            <w:tcMar>
+              <w:top w:type="dxa" w:w="60"/>
+              <w:left w:type="dxa" w:w="100"/>
+              <w:bottom w:type="dxa" w:w="60"/>
+              <w:right w:type="dxa" w:w="100"/>
+            </w:tcMar>
+            <w:vAlign w:val="center"/>
+          </w:tcPr>
+          <w:p>
+            <w:r>
+              <w:rPr>
+                <w:rFonts w:ascii="Arial" w:cs="Arial" w:eastAsia="Arial" w:hAnsi="Arial"/>
+                <w:sz w:val="18"/>
+                <w:szCs w:val="18"/>
+              </w:rPr>
+              <w:t xml:space="preserve">Reserved: predictions and AI messages</w:t>
             </w:r>
           </w:p>
         </w:tc>
@@ -13192,6 +14996,18 @@
       </w:pPr>
     </w:lvl>
   </w:abstractNum>
+  <w:abstractNum w:abstractNumId="12" w15:restartNumberingAfterBreak="0">
+    <w:multiLevelType w:val="hybridMultilevel"/>
+    <w:lvl w:ilvl="0" w15:tentative="1">
+      <w:start w:val="1"/>
+      <w:numFmt w:val="decimal"/>
+      <w:lvlText w:val="%1."/>
+      <w:lvlJc w:val="left"/>
+      <w:pPr>
+        <w:ind w:left="500" w:hanging="300"/>
+      </w:pPr>
+    </w:lvl>
+  </w:abstractNum>
   <w:num w:numId="1">
     <w:abstractNumId w:val="1"/>
     <w:lvlOverride w:ilvl="0">
@@ -13254,6 +15070,12 @@
   </w:num>
   <w:num w:numId="11">
     <w:abstractNumId w:val="11"/>
+    <w:lvlOverride w:ilvl="0">
+      <w:startOverride w:val="1"/>
+    </w:lvlOverride>
+  </w:num>
+  <w:num w:numId="12">
+    <w:abstractNumId w:val="12"/>
     <w:lvlOverride w:ilvl="0">
       <w:startOverride w:val="1"/>
     </w:lvlOverride>

</xml_diff>

<commit_message>
Go back to the version without the solar panel
Revert the solar power update (power module, battery/solar cards,
solar chapters and diagrams). The project runs on a 5 V USB power bank.

Co-Authored-By: Claude Opus 5.5 <noreply@anthropic.com>
Claude-Session: https://claude.ai/code/session_01LUEXdLPnpgGnWTyNRXft8r
</commit_message>
<xml_diff>
--- a/rayy/docs/Rayy-Build-Guide.docx
+++ b/rayy/docs/Rayy-Build-Guide.docx
@@ -31,7 +31,7 @@
           <w:sz w:val="26"/>
           <w:szCs w:val="26"/>
         </w:rPr>
-        <w:t xml:space="preserve">Solar-powered smart IoT plant that shows its feelings with emoji and sound</w:t>
+        <w:t xml:space="preserve">Smart IoT plant that shows its feelings with emoji and sound</w:t>
       </w:r>
     </w:p>
     <w:p>
@@ -200,25 +200,7 @@
           <w:sz w:val="20"/>
           <w:szCs w:val="20"/>
         </w:rPr>
-        <w:t xml:space="preserve"> plus a </w:t>
-      </w:r>
-      <w:r>
-        <w:rPr>
-          <w:rFonts w:ascii="Arial" w:cs="Arial" w:eastAsia="Arial" w:hAnsi="Arial"/>
-          <w:b/>
-          <w:bCs/>
-          <w:sz w:val="20"/>
-          <w:szCs w:val="20"/>
-        </w:rPr>
-        <w:t xml:space="preserve">solar power part</w:t>
-      </w:r>
-      <w:r>
-        <w:rPr>
-          <w:rFonts w:ascii="Arial" w:cs="Arial" w:eastAsia="Arial" w:hAnsi="Arial"/>
-          <w:sz w:val="20"/>
-          <w:szCs w:val="20"/>
-        </w:rPr>
-        <w:t xml:space="preserve"> that powers the plant device. They do not talk to each other directly: everything goes through </w:t>
+        <w:t xml:space="preserve">. They do not talk to each other directly: everything goes through </w:t>
       </w:r>
       <w:r>
         <w:rPr>
@@ -503,7 +485,7 @@
                 <w:sz w:val="18"/>
                 <w:szCs w:val="18"/>
               </w:rPr>
-              <w:t xml:space="preserve">Reads the sensors and the battery/solar voltages, decides the mood, plays melodies, sends data to Firebase</w:t>
+              <w:t xml:space="preserve">Reads the sensors, shows the emoji face, plays melodies, sends data to Firebase</w:t>
             </w:r>
           </w:p>
         </w:tc>
@@ -537,7 +519,7 @@
                 <w:sz w:val="18"/>
                 <w:szCs w:val="18"/>
               </w:rPr>
-              <w:t xml:space="preserve">Solar power part</w:t>
+              <w:t xml:space="preserve">Cloud database</w:t>
             </w:r>
           </w:p>
         </w:tc>
@@ -567,7 +549,7 @@
                 <w:sz w:val="18"/>
                 <w:szCs w:val="18"/>
               </w:rPr>
-              <w:t xml:space="preserve">docs/11-solar-power.md</w:t>
+              <w:t xml:space="preserve">firebase/</w:t>
             </w:r>
             <w:r>
               <w:rPr>
@@ -584,7 +566,7 @@
                 <w:sz w:val="18"/>
                 <w:szCs w:val="18"/>
               </w:rPr>
-              <w:t xml:space="preserve">firmware/Rayy/power.*</w:t>
+              <w:t xml:space="preserve">firebase.json</w:t>
             </w:r>
           </w:p>
         </w:tc>
@@ -613,7 +595,7 @@
                 <w:sz w:val="18"/>
                 <w:szCs w:val="18"/>
               </w:rPr>
-              <w:t xml:space="preserve">Solar panel + charger + 18650 batteries + 5 V boost</w:t>
+              <w:t xml:space="preserve">Google Firebase (internet)</w:t>
             </w:r>
           </w:p>
         </w:tc>
@@ -642,7 +624,7 @@
                 <w:sz w:val="18"/>
                 <w:szCs w:val="18"/>
               </w:rPr>
-              <w:t xml:space="preserve">Powers the ESP32 day and night; its battery level is shown in the apps</w:t>
+              <w:t xml:space="preserve">Stores the live data, history, diary and settings; checks logins</w:t>
             </w:r>
           </w:p>
         </w:tc>
@@ -675,7 +657,7 @@
                 <w:sz w:val="18"/>
                 <w:szCs w:val="18"/>
               </w:rPr>
-              <w:t xml:space="preserve">Cloud database</w:t>
+              <w:t xml:space="preserve">Web dashboard</w:t>
             </w:r>
           </w:p>
         </w:tc>
@@ -704,24 +686,7 @@
                 <w:sz w:val="18"/>
                 <w:szCs w:val="18"/>
               </w:rPr>
-              <w:t xml:space="preserve">firebase/</w:t>
-            </w:r>
-            <w:r>
-              <w:rPr>
-                <w:rFonts w:ascii="Arial" w:cs="Arial" w:eastAsia="Arial" w:hAnsi="Arial"/>
-                <w:sz w:val="18"/>
-                <w:szCs w:val="18"/>
-              </w:rPr>
-              <w:t xml:space="preserve"> + </w:t>
-            </w:r>
-            <w:r>
-              <w:rPr>
-                <w:rFonts w:ascii="Consolas" w:cs="Consolas" w:eastAsia="Consolas" w:hAnsi="Consolas"/>
-                <w:color w:val="1D4F7A"/>
-                <w:sz w:val="18"/>
-                <w:szCs w:val="18"/>
-              </w:rPr>
-              <w:t xml:space="preserve">firebase.json</w:t>
+              <w:t xml:space="preserve">web/</w:t>
             </w:r>
           </w:p>
         </w:tc>
@@ -749,7 +714,7 @@
                 <w:sz w:val="18"/>
                 <w:szCs w:val="18"/>
               </w:rPr>
-              <w:t xml:space="preserve">Google Firebase (internet)</w:t>
+              <w:t xml:space="preserve">Any browser (Firebase Hosting)</w:t>
             </w:r>
           </w:p>
         </w:tc>
@@ -777,7 +742,7 @@
                 <w:sz w:val="18"/>
                 <w:szCs w:val="18"/>
               </w:rPr>
-              <w:t xml:space="preserve">Stores the live data, history, diary and settings; checks logins</w:t>
+              <w:t xml:space="preserve">Shows the data, charts and diary; changes settings; plays a sound</w:t>
             </w:r>
           </w:p>
         </w:tc>
@@ -811,7 +776,7 @@
                 <w:sz w:val="18"/>
                 <w:szCs w:val="18"/>
               </w:rPr>
-              <w:t xml:space="preserve">Web dashboard</w:t>
+              <w:t xml:space="preserve">Android app</w:t>
             </w:r>
           </w:p>
         </w:tc>
@@ -841,7 +806,7 @@
                 <w:sz w:val="18"/>
                 <w:szCs w:val="18"/>
               </w:rPr>
-              <w:t xml:space="preserve">web/</w:t>
+              <w:t xml:space="preserve">android/Rayy/</w:t>
             </w:r>
           </w:p>
         </w:tc>
@@ -870,7 +835,7 @@
                 <w:sz w:val="18"/>
                 <w:szCs w:val="18"/>
               </w:rPr>
-              <w:t xml:space="preserve">Any browser (Firebase Hosting)</w:t>
+              <w:t xml:space="preserve">Android phone (Kotlin)</w:t>
             </w:r>
           </w:p>
         </w:tc>
@@ -884,124 +849,6 @@
               <w:right w:val="single" w:color="B7C9BC" w:sz="4"/>
             </w:tcBorders>
             <w:shd w:fill="F5F9F5" w:color="auto" w:val="clear"/>
-            <w:tcMar>
-              <w:top w:type="dxa" w:w="60"/>
-              <w:left w:type="dxa" w:w="100"/>
-              <w:bottom w:type="dxa" w:w="60"/>
-              <w:right w:type="dxa" w:w="100"/>
-            </w:tcMar>
-            <w:vAlign w:val="center"/>
-          </w:tcPr>
-          <w:p>
-            <w:r>
-              <w:rPr>
-                <w:rFonts w:ascii="Arial" w:cs="Arial" w:eastAsia="Arial" w:hAnsi="Arial"/>
-                <w:sz w:val="18"/>
-                <w:szCs w:val="18"/>
-              </w:rPr>
-              <w:t xml:space="preserve">Shows the data, charts and diary; changes settings; plays a sound</w:t>
-            </w:r>
-          </w:p>
-        </w:tc>
-      </w:tr>
-      <w:tr>
-        <w:trPr>
-          <w:cantSplit/>
-        </w:trPr>
-        <w:tc>
-          <w:tcPr>
-            <w:tcW w:type="dxa" w:w="1800"/>
-            <w:tcBorders>
-              <w:top w:val="single" w:color="B7C9BC" w:sz="4"/>
-              <w:left w:val="single" w:color="B7C9BC" w:sz="4"/>
-              <w:bottom w:val="single" w:color="B7C9BC" w:sz="4"/>
-              <w:right w:val="single" w:color="B7C9BC" w:sz="4"/>
-            </w:tcBorders>
-            <w:tcMar>
-              <w:top w:type="dxa" w:w="60"/>
-              <w:left w:type="dxa" w:w="100"/>
-              <w:bottom w:type="dxa" w:w="60"/>
-              <w:right w:type="dxa" w:w="100"/>
-            </w:tcMar>
-            <w:vAlign w:val="center"/>
-          </w:tcPr>
-          <w:p>
-            <w:r>
-              <w:rPr>
-                <w:rFonts w:ascii="Arial" w:cs="Arial" w:eastAsia="Arial" w:hAnsi="Arial"/>
-                <w:sz w:val="18"/>
-                <w:szCs w:val="18"/>
-              </w:rPr>
-              <w:t xml:space="preserve">Android app</w:t>
-            </w:r>
-          </w:p>
-        </w:tc>
-        <w:tc>
-          <w:tcPr>
-            <w:tcW w:type="dxa" w:w="2300"/>
-            <w:tcBorders>
-              <w:top w:val="single" w:color="B7C9BC" w:sz="4"/>
-              <w:left w:val="single" w:color="B7C9BC" w:sz="4"/>
-              <w:bottom w:val="single" w:color="B7C9BC" w:sz="4"/>
-              <w:right w:val="single" w:color="B7C9BC" w:sz="4"/>
-            </w:tcBorders>
-            <w:tcMar>
-              <w:top w:type="dxa" w:w="60"/>
-              <w:left w:type="dxa" w:w="100"/>
-              <w:bottom w:type="dxa" w:w="60"/>
-              <w:right w:type="dxa" w:w="100"/>
-            </w:tcMar>
-            <w:vAlign w:val="center"/>
-          </w:tcPr>
-          <w:p>
-            <w:r>
-              <w:rPr>
-                <w:rFonts w:ascii="Consolas" w:cs="Consolas" w:eastAsia="Consolas" w:hAnsi="Consolas"/>
-                <w:color w:val="1D4F7A"/>
-                <w:sz w:val="18"/>
-                <w:szCs w:val="18"/>
-              </w:rPr>
-              <w:t xml:space="preserve">android/Rayy/</w:t>
-            </w:r>
-          </w:p>
-        </w:tc>
-        <w:tc>
-          <w:tcPr>
-            <w:tcW w:type="dxa" w:w="2300"/>
-            <w:tcBorders>
-              <w:top w:val="single" w:color="B7C9BC" w:sz="4"/>
-              <w:left w:val="single" w:color="B7C9BC" w:sz="4"/>
-              <w:bottom w:val="single" w:color="B7C9BC" w:sz="4"/>
-              <w:right w:val="single" w:color="B7C9BC" w:sz="4"/>
-            </w:tcBorders>
-            <w:tcMar>
-              <w:top w:type="dxa" w:w="60"/>
-              <w:left w:type="dxa" w:w="100"/>
-              <w:bottom w:type="dxa" w:w="60"/>
-              <w:right w:type="dxa" w:w="100"/>
-            </w:tcMar>
-            <w:vAlign w:val="center"/>
-          </w:tcPr>
-          <w:p>
-            <w:r>
-              <w:rPr>
-                <w:rFonts w:ascii="Arial" w:cs="Arial" w:eastAsia="Arial" w:hAnsi="Arial"/>
-                <w:sz w:val="18"/>
-                <w:szCs w:val="18"/>
-              </w:rPr>
-              <w:t xml:space="preserve">Android phone (Kotlin)</w:t>
-            </w:r>
-          </w:p>
-        </w:tc>
-        <w:tc>
-          <w:tcPr>
-            <w:tcW w:type="dxa" w:w="3506"/>
-            <w:tcBorders>
-              <w:top w:val="single" w:color="B7C9BC" w:sz="4"/>
-              <w:left w:val="single" w:color="B7C9BC" w:sz="4"/>
-              <w:bottom w:val="single" w:color="B7C9BC" w:sz="4"/>
-              <w:right w:val="single" w:color="B7C9BC" w:sz="4"/>
-            </w:tcBorders>
             <w:tcMar>
               <w:top w:type="dxa" w:w="60"/>
               <w:left w:type="dxa" w:w="100"/>
@@ -1121,7 +968,7 @@
           <w:sz w:val="20"/>
           <w:szCs w:val="20"/>
         </w:rPr>
-        <w:t xml:space="preserve">, so you can hear the melodies and see the readings at once.</w:t>
+        <w:t xml:space="preserve">, so you can see the face and readings at once.</w:t>
       </w:r>
     </w:p>
     <w:p>
@@ -1169,80 +1016,7 @@
           <w:sz w:val="20"/>
           <w:szCs w:val="20"/>
         </w:rPr>
-        <w:t xml:space="preserve">The solar part comes after everything works on a USB power bank</w:t>
-      </w:r>
-      <w:r>
-        <w:rPr>
-          <w:rFonts w:ascii="Arial" w:cs="Arial" w:eastAsia="Arial" w:hAnsi="Arial"/>
-          <w:sz w:val="20"/>
-          <w:szCs w:val="20"/>
-        </w:rPr>
-        <w:t xml:space="preserve">, so a power problem never hides a code problem.</w:t>
-      </w:r>
-    </w:p>
-    <w:p>
-      <w:pPr>
-        <w:pStyle w:val="ListParagraph"/>
-        <w:numPr>
-          <w:ilvl w:val="0"/>
-          <w:numId w:val="2"/>
-        </w:numPr>
-        <w:spacing w:after="30" w:before="30"/>
-      </w:pPr>
-      <w:r>
-        <w:rPr>
-          <w:rFonts w:ascii="Arial" w:cs="Arial" w:eastAsia="Arial" w:hAnsi="Arial"/>
-          <w:b/>
-          <w:bCs/>
-          <w:sz w:val="20"/>
-          <w:szCs w:val="20"/>
-        </w:rPr>
         <w:t xml:space="preserve">Calibration and testing come after everything works together.</w:t>
-      </w:r>
-    </w:p>
-    <w:p>
-      <w:pPr>
-        <w:pStyle w:val="ListParagraph"/>
-        <w:numPr>
-          <w:ilvl w:val="0"/>
-          <w:numId w:val="2"/>
-        </w:numPr>
-        <w:spacing w:after="30" w:before="30"/>
-      </w:pPr>
-      <w:r>
-        <w:rPr>
-          <w:rFonts w:ascii="Arial" w:cs="Arial" w:eastAsia="Arial" w:hAnsi="Arial"/>
-          <w:b/>
-          <w:bCs/>
-          <w:sz w:val="20"/>
-          <w:szCs w:val="20"/>
-        </w:rPr>
-        <w:t xml:space="preserve">AI is future work</w:t>
-      </w:r>
-      <w:r>
-        <w:rPr>
-          <w:rFonts w:ascii="Arial" w:cs="Arial" w:eastAsia="Arial" w:hAnsi="Arial"/>
-          <w:sz w:val="20"/>
-          <w:szCs w:val="20"/>
-        </w:rPr>
-        <w:t xml:space="preserve"> (</w:t>
-      </w:r>
-      <w:r>
-        <w:rPr>
-          <w:rFonts w:ascii="Consolas" w:cs="Consolas" w:eastAsia="Consolas" w:hAnsi="Consolas"/>
-          <w:color w:val="1D4F7A"/>
-          <w:sz w:val="20"/>
-          <w:szCs w:val="20"/>
-        </w:rPr>
-        <w:t xml:space="preserve">docs/12-future-ai.md</w:t>
-      </w:r>
-      <w:r>
-        <w:rPr>
-          <w:rFonts w:ascii="Arial" w:cs="Arial" w:eastAsia="Arial" w:hAnsi="Arial"/>
-          <w:sz w:val="20"/>
-          <w:szCs w:val="20"/>
-        </w:rPr>
-        <w:t xml:space="preserve">): the project already stores the history it will need.</w:t>
       </w:r>
     </w:p>
     <w:p>
@@ -1503,7 +1277,7 @@
                 <w:sz w:val="18"/>
                 <w:szCs w:val="18"/>
               </w:rPr>
-              <w:t xml:space="preserve">Buy the components (main + solar part)</w:t>
+              <w:t xml:space="preserve">Buy the components</w:t>
             </w:r>
           </w:p>
         </w:tc>
@@ -1559,7 +1333,7 @@
                 <w:sz w:val="18"/>
                 <w:szCs w:val="18"/>
               </w:rPr>
-              <w:t xml:space="preserve">All items of both tables (see the components Word file)</w:t>
+              <w:t xml:space="preserve">All 14 items on the table (see the components Word file)</w:t>
             </w:r>
           </w:p>
         </w:tc>
@@ -2507,7 +2281,7 @@
                 <w:sz w:val="18"/>
                 <w:szCs w:val="18"/>
               </w:rPr>
-              <w:t xml:space="preserve">“hello” melody, Serial Monitor: “signed in to Firebase”</w:t>
+              <w:t xml:space="preserve">“hello” melody, emoji face, Serial Monitor: “signed in to Firebase”</w:t>
             </w:r>
           </w:p>
         </w:tc>
@@ -3120,7 +2894,7 @@
                 <w:sz w:val="18"/>
                 <w:szCs w:val="18"/>
               </w:rPr>
-              <w:t xml:space="preserve">Build the solar part</w:t>
+              <w:t xml:space="preserve">Test everything</w:t>
             </w:r>
           </w:p>
         </w:tc>
@@ -3148,7 +2922,7 @@
                 <w:sz w:val="18"/>
                 <w:szCs w:val="18"/>
               </w:rPr>
-              <w:t xml:space="preserve">Steps 1, 7</w:t>
+              <w:t xml:space="preserve">Steps 7–10</w:t>
             </w:r>
           </w:p>
         </w:tc>
@@ -3176,7 +2950,7 @@
                 <w:sz w:val="18"/>
                 <w:szCs w:val="18"/>
               </w:rPr>
-              <w:t xml:space="preserve">Apps show 🔋 battery % and “Charging from the sun ☀️”</w:t>
+              <w:t xml:space="preserve">All tests in the test table pass</w:t>
             </w:r>
           </w:p>
         </w:tc>
@@ -3205,32 +2979,7 @@
                 <w:sz w:val="18"/>
                 <w:szCs w:val="18"/>
               </w:rPr>
-              <w:t xml:space="preserve">docs/11-solar-power.md</w:t>
-            </w:r>
-            <w:r>
-              <w:rPr>
-                <w:rFonts w:ascii="Arial" w:cs="Arial" w:eastAsia="Arial" w:hAnsi="Arial"/>
-                <w:sz w:val="18"/>
-                <w:szCs w:val="18"/>
-              </w:rPr>
-              <w:t xml:space="preserve">, </w:t>
-            </w:r>
-            <w:r>
-              <w:rPr>
-                <w:rFonts w:ascii="Consolas" w:cs="Consolas" w:eastAsia="Consolas" w:hAnsi="Consolas"/>
-                <w:color w:val="1D4F7A"/>
-                <w:sz w:val="18"/>
-                <w:szCs w:val="18"/>
-              </w:rPr>
-              <w:t xml:space="preserve">firmware/Rayy/config.h</w:t>
-            </w:r>
-            <w:r>
-              <w:rPr>
-                <w:rFonts w:ascii="Arial" w:cs="Arial" w:eastAsia="Arial" w:hAnsi="Arial"/>
-                <w:sz w:val="18"/>
-                <w:szCs w:val="18"/>
-              </w:rPr>
-              <w:t xml:space="preserve"> (SOLAR_ENABLED)</w:t>
+              <w:t xml:space="preserve">docs/08-testing-calibration.md</w:t>
             </w:r>
           </w:p>
         </w:tc>
@@ -3293,7 +3042,7 @@
                 <w:sz w:val="18"/>
                 <w:szCs w:val="18"/>
               </w:rPr>
-              <w:t xml:space="preserve">Test everything</w:t>
+              <w:t xml:space="preserve">Final assembly, report, presentation</w:t>
             </w:r>
           </w:p>
         </w:tc>
@@ -3322,7 +3071,7 @@
                 <w:sz w:val="18"/>
                 <w:szCs w:val="18"/>
               </w:rPr>
-              <w:t xml:space="preserve">Steps 7–11</w:t>
+              <w:t xml:space="preserve">Step 11</w:t>
             </w:r>
           </w:p>
         </w:tc>
@@ -3351,7 +3100,7 @@
                 <w:sz w:val="18"/>
                 <w:szCs w:val="18"/>
               </w:rPr>
-              <w:t xml:space="preserve">All tests in the test table pass</w:t>
+              <w:t xml:space="preserve">Box on the pot, report written, demo rehearsed</w:t>
             </w:r>
           </w:p>
         </w:tc>
@@ -3365,152 +3114,6 @@
               <w:right w:val="single" w:color="B7C9BC" w:sz="4"/>
             </w:tcBorders>
             <w:shd w:fill="F5F9F5" w:color="auto" w:val="clear"/>
-            <w:tcMar>
-              <w:top w:type="dxa" w:w="60"/>
-              <w:left w:type="dxa" w:w="100"/>
-              <w:bottom w:type="dxa" w:w="60"/>
-              <w:right w:type="dxa" w:w="100"/>
-            </w:tcMar>
-            <w:vAlign w:val="center"/>
-          </w:tcPr>
-          <w:p>
-            <w:r>
-              <w:rPr>
-                <w:rFonts w:ascii="Consolas" w:cs="Consolas" w:eastAsia="Consolas" w:hAnsi="Consolas"/>
-                <w:color w:val="1D4F7A"/>
-                <w:sz w:val="18"/>
-                <w:szCs w:val="18"/>
-              </w:rPr>
-              <w:t xml:space="preserve">docs/08-testing-calibration.md</w:t>
-            </w:r>
-          </w:p>
-        </w:tc>
-      </w:tr>
-      <w:tr>
-        <w:trPr>
-          <w:cantSplit/>
-        </w:trPr>
-        <w:tc>
-          <w:tcPr>
-            <w:tcW w:type="dxa" w:w="500"/>
-            <w:tcBorders>
-              <w:top w:val="single" w:color="B7C9BC" w:sz="4"/>
-              <w:left w:val="single" w:color="B7C9BC" w:sz="4"/>
-              <w:bottom w:val="single" w:color="B7C9BC" w:sz="4"/>
-              <w:right w:val="single" w:color="B7C9BC" w:sz="4"/>
-            </w:tcBorders>
-            <w:tcMar>
-              <w:top w:type="dxa" w:w="60"/>
-              <w:left w:type="dxa" w:w="100"/>
-              <w:bottom w:type="dxa" w:w="60"/>
-              <w:right w:type="dxa" w:w="100"/>
-            </w:tcMar>
-            <w:vAlign w:val="center"/>
-          </w:tcPr>
-          <w:p>
-            <w:r>
-              <w:rPr>
-                <w:rFonts w:ascii="Arial" w:cs="Arial" w:eastAsia="Arial" w:hAnsi="Arial"/>
-                <w:sz w:val="18"/>
-                <w:szCs w:val="18"/>
-              </w:rPr>
-              <w:t xml:space="preserve">13</w:t>
-            </w:r>
-          </w:p>
-        </w:tc>
-        <w:tc>
-          <w:tcPr>
-            <w:tcW w:type="dxa" w:w="2100"/>
-            <w:tcBorders>
-              <w:top w:val="single" w:color="B7C9BC" w:sz="4"/>
-              <w:left w:val="single" w:color="B7C9BC" w:sz="4"/>
-              <w:bottom w:val="single" w:color="B7C9BC" w:sz="4"/>
-              <w:right w:val="single" w:color="B7C9BC" w:sz="4"/>
-            </w:tcBorders>
-            <w:tcMar>
-              <w:top w:type="dxa" w:w="60"/>
-              <w:left w:type="dxa" w:w="100"/>
-              <w:bottom w:type="dxa" w:w="60"/>
-              <w:right w:type="dxa" w:w="100"/>
-            </w:tcMar>
-            <w:vAlign w:val="center"/>
-          </w:tcPr>
-          <w:p>
-            <w:r>
-              <w:rPr>
-                <w:rFonts w:ascii="Arial" w:cs="Arial" w:eastAsia="Arial" w:hAnsi="Arial"/>
-                <w:sz w:val="18"/>
-                <w:szCs w:val="18"/>
-              </w:rPr>
-              <w:t xml:space="preserve">Final assembly, report, presentation</w:t>
-            </w:r>
-          </w:p>
-        </w:tc>
-        <w:tc>
-          <w:tcPr>
-            <w:tcW w:type="dxa" w:w="2300"/>
-            <w:tcBorders>
-              <w:top w:val="single" w:color="B7C9BC" w:sz="4"/>
-              <w:left w:val="single" w:color="B7C9BC" w:sz="4"/>
-              <w:bottom w:val="single" w:color="B7C9BC" w:sz="4"/>
-              <w:right w:val="single" w:color="B7C9BC" w:sz="4"/>
-            </w:tcBorders>
-            <w:tcMar>
-              <w:top w:type="dxa" w:w="60"/>
-              <w:left w:type="dxa" w:w="100"/>
-              <w:bottom w:type="dxa" w:w="60"/>
-              <w:right w:type="dxa" w:w="100"/>
-            </w:tcMar>
-            <w:vAlign w:val="center"/>
-          </w:tcPr>
-          <w:p>
-            <w:r>
-              <w:rPr>
-                <w:rFonts w:ascii="Arial" w:cs="Arial" w:eastAsia="Arial" w:hAnsi="Arial"/>
-                <w:sz w:val="18"/>
-                <w:szCs w:val="18"/>
-              </w:rPr>
-              <w:t xml:space="preserve">Step 12</w:t>
-            </w:r>
-          </w:p>
-        </w:tc>
-        <w:tc>
-          <w:tcPr>
-            <w:tcW w:type="dxa" w:w="2300"/>
-            <w:tcBorders>
-              <w:top w:val="single" w:color="B7C9BC" w:sz="4"/>
-              <w:left w:val="single" w:color="B7C9BC" w:sz="4"/>
-              <w:bottom w:val="single" w:color="B7C9BC" w:sz="4"/>
-              <w:right w:val="single" w:color="B7C9BC" w:sz="4"/>
-            </w:tcBorders>
-            <w:tcMar>
-              <w:top w:type="dxa" w:w="60"/>
-              <w:left w:type="dxa" w:w="100"/>
-              <w:bottom w:type="dxa" w:w="60"/>
-              <w:right w:type="dxa" w:w="100"/>
-            </w:tcMar>
-            <w:vAlign w:val="center"/>
-          </w:tcPr>
-          <w:p>
-            <w:r>
-              <w:rPr>
-                <w:rFonts w:ascii="Arial" w:cs="Arial" w:eastAsia="Arial" w:hAnsi="Arial"/>
-                <w:sz w:val="18"/>
-                <w:szCs w:val="18"/>
-              </w:rPr>
-              <w:t xml:space="preserve">Box on the pot, panel in the sun, report written, demo rehearsed</w:t>
-            </w:r>
-          </w:p>
-        </w:tc>
-        <w:tc>
-          <w:tcPr>
-            <w:tcW w:type="dxa" w:w="2706"/>
-            <w:tcBorders>
-              <w:top w:val="single" w:color="B7C9BC" w:sz="4"/>
-              <w:left w:val="single" w:color="B7C9BC" w:sz="4"/>
-              <w:bottom w:val="single" w:color="B7C9BC" w:sz="4"/>
-              <w:right w:val="single" w:color="B7C9BC" w:sz="4"/>
-            </w:tcBorders>
             <w:tcMar>
               <w:top w:type="dxa" w:w="60"/>
               <w:left w:type="dxa" w:w="100"/>
@@ -3583,7 +3186,7 @@
           <w:sz w:val="20"/>
           <w:szCs w:val="20"/>
         </w:rPr>
-        <w:t xml:space="preserve"> by different team members. Steps 9 (web) and 10 (Android) can also be done in parallel once Firebase is ready. The solar part (step 11) can be prepared in parallel but is connected last.</w:t>
+        <w:t xml:space="preserve"> by different team members. Steps 9 (web) and 10 (Android) can also be done in parallel once Firebase is ready.</w:t>
       </w:r>
     </w:p>
     <w:p>
@@ -3649,7 +3252,7 @@
           <w:sz w:val="20"/>
           <w:szCs w:val="20"/>
         </w:rPr>
-        <w:t xml:space="preserve"> (Arabic + English names, part codes, quantities, prices, buy links). It has two tables: </w:t>
+        <w:t xml:space="preserve"> (Arabic + English names, quantities, expected prices ≈ 175–312 SAR). Important: capacitive soil sensor, </w:t>
       </w:r>
       <w:r>
         <w:rPr>
@@ -3659,15 +3262,15 @@
           <w:sz w:val="20"/>
           <w:szCs w:val="20"/>
         </w:rPr>
-        <w:t xml:space="preserve">Part 1 main components</w:t>
-      </w:r>
-      <w:r>
-        <w:rPr>
-          <w:rFonts w:ascii="Arial" w:cs="Arial" w:eastAsia="Arial" w:hAnsi="Arial"/>
-          <w:sz w:val="20"/>
-          <w:szCs w:val="20"/>
-        </w:rPr>
-        <w:t xml:space="preserve"> (≈ 140–317 SAR) and </w:t>
+        <w:t xml:space="preserve">passive</w:t>
+      </w:r>
+      <w:r>
+        <w:rPr>
+          <w:rFonts w:ascii="Arial" w:cs="Arial" w:eastAsia="Arial" w:hAnsi="Arial"/>
+          <w:sz w:val="20"/>
+          <w:szCs w:val="20"/>
+        </w:rPr>
+        <w:t xml:space="preserve"> buzzer, </w:t>
       </w:r>
       <w:r>
         <w:rPr>
@@ -3677,42 +3280,6 @@
           <w:sz w:val="20"/>
           <w:szCs w:val="20"/>
         </w:rPr>
-        <w:t xml:space="preserve">Part 2 solar components</w:t>
-      </w:r>
-      <w:r>
-        <w:rPr>
-          <w:rFonts w:ascii="Arial" w:cs="Arial" w:eastAsia="Arial" w:hAnsi="Arial"/>
-          <w:sz w:val="20"/>
-          <w:szCs w:val="20"/>
-        </w:rPr>
-        <w:t xml:space="preserve"> (≈ 121–184 SAR). Important: capacitive soil sensor, </w:t>
-      </w:r>
-      <w:r>
-        <w:rPr>
-          <w:rFonts w:ascii="Arial" w:cs="Arial" w:eastAsia="Arial" w:hAnsi="Arial"/>
-          <w:b/>
-          <w:bCs/>
-          <w:sz w:val="20"/>
-          <w:szCs w:val="20"/>
-        </w:rPr>
-        <w:t xml:space="preserve">passive</w:t>
-      </w:r>
-      <w:r>
-        <w:rPr>
-          <w:rFonts w:ascii="Arial" w:cs="Arial" w:eastAsia="Arial" w:hAnsi="Arial"/>
-          <w:sz w:val="20"/>
-          <w:szCs w:val="20"/>
-        </w:rPr>
-        <w:t xml:space="preserve"> buzzer, </w:t>
-      </w:r>
-      <w:r>
-        <w:rPr>
-          <w:rFonts w:ascii="Arial" w:cs="Arial" w:eastAsia="Arial" w:hAnsi="Arial"/>
-          <w:b/>
-          <w:bCs/>
-          <w:sz w:val="20"/>
-          <w:szCs w:val="20"/>
-        </w:rPr>
         <w:t xml:space="preserve">data</w:t>
       </w:r>
       <w:r>
@@ -3721,43 +3288,7 @@
           <w:sz w:val="20"/>
           <w:szCs w:val="20"/>
         </w:rPr>
-        <w:t xml:space="preserve"> USB cable, </w:t>
-      </w:r>
-      <w:r>
-        <w:rPr>
-          <w:rFonts w:ascii="Arial" w:cs="Arial" w:eastAsia="Arial" w:hAnsi="Arial"/>
-          <w:b/>
-          <w:bCs/>
-          <w:sz w:val="20"/>
-          <w:szCs w:val="20"/>
-        </w:rPr>
-        <w:t xml:space="preserve">protected</w:t>
-      </w:r>
-      <w:r>
-        <w:rPr>
-          <w:rFonts w:ascii="Arial" w:cs="Arial" w:eastAsia="Arial" w:hAnsi="Arial"/>
-          <w:sz w:val="20"/>
-          <w:szCs w:val="20"/>
-        </w:rPr>
-        <w:t xml:space="preserve"> 18650 batteries, the </w:t>
-      </w:r>
-      <w:r>
-        <w:rPr>
-          <w:rFonts w:ascii="Arial" w:cs="Arial" w:eastAsia="Arial" w:hAnsi="Arial"/>
-          <w:b/>
-          <w:bCs/>
-          <w:sz w:val="20"/>
-          <w:szCs w:val="20"/>
-        </w:rPr>
-        <w:t xml:space="preserve">6 V</w:t>
-      </w:r>
-      <w:r>
-        <w:rPr>
-          <w:rFonts w:ascii="Arial" w:cs="Arial" w:eastAsia="Arial" w:hAnsi="Arial"/>
-          <w:sz w:val="20"/>
-          <w:szCs w:val="20"/>
-        </w:rPr>
-        <w:t xml:space="preserve"> CN3791 charger, and a multimeter.</w:t>
+        <w:t xml:space="preserve"> USB cable.</w:t>
       </w:r>
     </w:p>
     <w:p>
@@ -5365,7 +4896,7 @@
                 <w:sz w:val="18"/>
                 <w:szCs w:val="18"/>
               </w:rPr>
-              <w:t xml:space="preserve">Power (while building)</w:t>
+              <w:t xml:space="preserve">Power</w:t>
             </w:r>
           </w:p>
         </w:tc>
@@ -5394,7 +4925,7 @@
                 <w:sz w:val="18"/>
                 <w:szCs w:val="18"/>
               </w:rPr>
-              <w:t xml:space="preserve">5 V USB power bank / charger → ESP32 USB port (the solar part is added in step 11)</w:t>
+              <w:t xml:space="preserve">5 V USB power bank / charger → ESP32 USB port</w:t>
             </w:r>
           </w:p>
         </w:tc>
@@ -5767,41 +5298,6 @@
     </w:p>
     <w:p>
       <w:pPr>
-        <w:pBdr>
-          <w:left w:val="single" w:color="C77700" w:sz="18" w:space="8"/>
-        </w:pBdr>
-        <w:shd w:fill="FFF4E0" w:color="auto" w:val="clear"/>
-        <w:spacing w:after="100" w:before="100"/>
-        <w:ind w:left="200"/>
-      </w:pPr>
-      <w:r>
-        <w:rPr>
-          <w:rFonts w:ascii="Arial" w:cs="Arial" w:eastAsia="Arial" w:hAnsi="Arial"/>
-          <w:sz w:val="20"/>
-          <w:szCs w:val="20"/>
-        </w:rPr>
-        <w:t xml:space="preserve">For now keep </w:t>
-      </w:r>
-      <w:r>
-        <w:rPr>
-          <w:rFonts w:ascii="Consolas" w:cs="Consolas" w:eastAsia="Consolas" w:hAnsi="Consolas"/>
-          <w:color w:val="1D4F7A"/>
-          <w:sz w:val="20"/>
-          <w:szCs w:val="20"/>
-        </w:rPr>
-        <w:t xml:space="preserve">#define SOLAR_ENABLED 0</w:t>
-      </w:r>
-      <w:r>
-        <w:rPr>
-          <w:rFonts w:ascii="Arial" w:cs="Arial" w:eastAsia="Arial" w:hAnsi="Arial"/>
-          <w:sz w:val="20"/>
-          <w:szCs w:val="20"/>
-        </w:rPr>
-        <w:t xml:space="preserve"> in config.h (power bank). You change it to 1 in step 11.</w:t>
-      </w:r>
-    </w:p>
-    <w:p>
-      <w:pPr>
         <w:spacing w:after="60" w:before="60"/>
       </w:pPr>
       <w:r>
@@ -6721,911 +6217,7 @@
           <w:sz w:val="26"/>
           <w:szCs w:val="26"/>
         </w:rPr>
-        <w:t xml:space="preserve">Step 11: Build the solar part</w:t>
-      </w:r>
-    </w:p>
-    <w:p>
-      <w:pPr>
-        <w:spacing w:after="60" w:before="60"/>
-      </w:pPr>
-      <w:r>
-        <w:rPr>
-          <w:rFonts w:ascii="Arial" w:cs="Arial" w:eastAsia="Arial" w:hAnsi="Arial"/>
-          <w:sz w:val="20"/>
-          <w:szCs w:val="20"/>
-        </w:rPr>
-        <w:t xml:space="preserve">Follow </w:t>
-      </w:r>
-      <w:r>
-        <w:rPr>
-          <w:rFonts w:ascii="Consolas" w:cs="Consolas" w:eastAsia="Consolas" w:hAnsi="Consolas"/>
-          <w:color w:val="1D4F7A"/>
-          <w:sz w:val="20"/>
-          <w:szCs w:val="20"/>
-        </w:rPr>
-        <w:t xml:space="preserve">docs/11-solar-power.md</w:t>
-      </w:r>
-      <w:r>
-        <w:rPr>
-          <w:rFonts w:ascii="Arial" w:cs="Arial" w:eastAsia="Arial" w:hAnsi="Arial"/>
-          <w:sz w:val="20"/>
-          <w:szCs w:val="20"/>
-        </w:rPr>
-        <w:t xml:space="preserve"> and the solar part of the wiring diagram.</w:t>
-      </w:r>
-    </w:p>
-    <w:tbl>
-      <w:tblPr>
-        <w:tblW w:type="dxa" w:w="9906"/>
-        <w:tblBorders>
-          <w:top w:val="single" w:color="auto" w:sz="4"/>
-          <w:left w:val="single" w:color="auto" w:sz="4"/>
-          <w:bottom w:val="single" w:color="auto" w:sz="4"/>
-          <w:right w:val="single" w:color="auto" w:sz="4"/>
-          <w:insideH w:val="single" w:color="auto" w:sz="4"/>
-          <w:insideV w:val="single" w:color="auto" w:sz="4"/>
-        </w:tblBorders>
-      </w:tblPr>
-      <w:tblGrid>
-        <w:gridCol w:w="2600"/>
-        <w:gridCol w:w="7306"/>
-      </w:tblGrid>
-      <w:tr>
-        <w:trPr>
-          <w:tblHeader/>
-        </w:trPr>
-        <w:tc>
-          <w:tcPr>
-            <w:tcW w:type="dxa" w:w="2600"/>
-            <w:tcBorders>
-              <w:top w:val="single" w:color="B7C9BC" w:sz="4"/>
-              <w:left w:val="single" w:color="B7C9BC" w:sz="4"/>
-              <w:bottom w:val="single" w:color="B7C9BC" w:sz="4"/>
-              <w:right w:val="single" w:color="B7C9BC" w:sz="4"/>
-            </w:tcBorders>
-            <w:shd w:fill="2F7D4F" w:color="auto" w:val="clear"/>
-            <w:tcMar>
-              <w:top w:type="dxa" w:w="60"/>
-              <w:left w:type="dxa" w:w="100"/>
-              <w:bottom w:type="dxa" w:w="60"/>
-              <w:right w:type="dxa" w:w="100"/>
-            </w:tcMar>
-            <w:vAlign w:val="center"/>
-          </w:tcPr>
-          <w:p>
-            <w:r>
-              <w:rPr>
-                <w:rFonts w:ascii="Arial" w:cs="Arial" w:eastAsia="Arial" w:hAnsi="Arial"/>
-                <w:b/>
-                <w:bCs/>
-                <w:color w:val="FFFFFF"/>
-                <w:sz w:val="18"/>
-                <w:szCs w:val="18"/>
-              </w:rPr>
-              <w:t xml:space="preserve">Connection</w:t>
-            </w:r>
-          </w:p>
-        </w:tc>
-        <w:tc>
-          <w:tcPr>
-            <w:tcW w:type="dxa" w:w="7306"/>
-            <w:tcBorders>
-              <w:top w:val="single" w:color="B7C9BC" w:sz="4"/>
-              <w:left w:val="single" w:color="B7C9BC" w:sz="4"/>
-              <w:bottom w:val="single" w:color="B7C9BC" w:sz="4"/>
-              <w:right w:val="single" w:color="B7C9BC" w:sz="4"/>
-            </w:tcBorders>
-            <w:shd w:fill="2F7D4F" w:color="auto" w:val="clear"/>
-            <w:tcMar>
-              <w:top w:type="dxa" w:w="60"/>
-              <w:left w:type="dxa" w:w="100"/>
-              <w:bottom w:type="dxa" w:w="60"/>
-              <w:right w:type="dxa" w:w="100"/>
-            </w:tcMar>
-            <w:vAlign w:val="center"/>
-          </w:tcPr>
-          <w:p>
-            <w:r>
-              <w:rPr>
-                <w:rFonts w:ascii="Arial" w:cs="Arial" w:eastAsia="Arial" w:hAnsi="Arial"/>
-                <w:b/>
-                <w:bCs/>
-                <w:color w:val="FFFFFF"/>
-                <w:sz w:val="18"/>
-                <w:szCs w:val="18"/>
-              </w:rPr>
-              <w:t xml:space="preserve">Details</w:t>
-            </w:r>
-          </w:p>
-        </w:tc>
-      </w:tr>
-      <w:tr>
-        <w:trPr>
-          <w:cantSplit/>
-        </w:trPr>
-        <w:tc>
-          <w:tcPr>
-            <w:tcW w:type="dxa" w:w="2600"/>
-            <w:tcBorders>
-              <w:top w:val="single" w:color="B7C9BC" w:sz="4"/>
-              <w:left w:val="single" w:color="B7C9BC" w:sz="4"/>
-              <w:bottom w:val="single" w:color="B7C9BC" w:sz="4"/>
-              <w:right w:val="single" w:color="B7C9BC" w:sz="4"/>
-            </w:tcBorders>
-            <w:tcMar>
-              <w:top w:type="dxa" w:w="60"/>
-              <w:left w:type="dxa" w:w="100"/>
-              <w:bottom w:type="dxa" w:w="60"/>
-              <w:right w:type="dxa" w:w="100"/>
-            </w:tcMar>
-            <w:vAlign w:val="center"/>
-          </w:tcPr>
-          <w:p>
-            <w:r>
-              <w:rPr>
-                <w:rFonts w:ascii="Arial" w:cs="Arial" w:eastAsia="Arial" w:hAnsi="Arial"/>
-                <w:sz w:val="18"/>
-                <w:szCs w:val="18"/>
-              </w:rPr>
-              <w:t xml:space="preserve">Panel → charger</w:t>
-            </w:r>
-          </w:p>
-        </w:tc>
-        <w:tc>
-          <w:tcPr>
-            <w:tcW w:type="dxa" w:w="7306"/>
-            <w:tcBorders>
-              <w:top w:val="single" w:color="B7C9BC" w:sz="4"/>
-              <w:left w:val="single" w:color="B7C9BC" w:sz="4"/>
-              <w:bottom w:val="single" w:color="B7C9BC" w:sz="4"/>
-              <w:right w:val="single" w:color="B7C9BC" w:sz="4"/>
-            </w:tcBorders>
-            <w:tcMar>
-              <w:top w:type="dxa" w:w="60"/>
-              <w:left w:type="dxa" w:w="100"/>
-              <w:bottom w:type="dxa" w:w="60"/>
-              <w:right w:type="dxa" w:w="100"/>
-            </w:tcMar>
-            <w:vAlign w:val="center"/>
-          </w:tcPr>
-          <w:p>
-            <w:r>
-              <w:rPr>
-                <w:rFonts w:ascii="Arial" w:cs="Arial" w:eastAsia="Arial" w:hAnsi="Arial"/>
-                <w:sz w:val="18"/>
-                <w:szCs w:val="18"/>
-              </w:rPr>
-              <w:t xml:space="preserve">Solar panel (+)/(−) → CN3791 </w:t>
-            </w:r>
-            <w:r>
-              <w:rPr>
-                <w:rFonts w:ascii="Arial" w:cs="Arial" w:eastAsia="Arial" w:hAnsi="Arial"/>
-                <w:b/>
-                <w:bCs/>
-                <w:sz w:val="18"/>
-                <w:szCs w:val="18"/>
-              </w:rPr>
-              <w:t xml:space="preserve">IN+ / IN−</w:t>
-            </w:r>
-          </w:p>
-        </w:tc>
-      </w:tr>
-      <w:tr>
-        <w:trPr>
-          <w:cantSplit/>
-        </w:trPr>
-        <w:tc>
-          <w:tcPr>
-            <w:tcW w:type="dxa" w:w="2600"/>
-            <w:tcBorders>
-              <w:top w:val="single" w:color="B7C9BC" w:sz="4"/>
-              <w:left w:val="single" w:color="B7C9BC" w:sz="4"/>
-              <w:bottom w:val="single" w:color="B7C9BC" w:sz="4"/>
-              <w:right w:val="single" w:color="B7C9BC" w:sz="4"/>
-            </w:tcBorders>
-            <w:shd w:fill="F5F9F5" w:color="auto" w:val="clear"/>
-            <w:tcMar>
-              <w:top w:type="dxa" w:w="60"/>
-              <w:left w:type="dxa" w:w="100"/>
-              <w:bottom w:type="dxa" w:w="60"/>
-              <w:right w:type="dxa" w:w="100"/>
-            </w:tcMar>
-            <w:vAlign w:val="center"/>
-          </w:tcPr>
-          <w:p>
-            <w:r>
-              <w:rPr>
-                <w:rFonts w:ascii="Arial" w:cs="Arial" w:eastAsia="Arial" w:hAnsi="Arial"/>
-                <w:sz w:val="18"/>
-                <w:szCs w:val="18"/>
-              </w:rPr>
-              <w:t xml:space="preserve">Charger → battery</w:t>
-            </w:r>
-          </w:p>
-        </w:tc>
-        <w:tc>
-          <w:tcPr>
-            <w:tcW w:type="dxa" w:w="7306"/>
-            <w:tcBorders>
-              <w:top w:val="single" w:color="B7C9BC" w:sz="4"/>
-              <w:left w:val="single" w:color="B7C9BC" w:sz="4"/>
-              <w:bottom w:val="single" w:color="B7C9BC" w:sz="4"/>
-              <w:right w:val="single" w:color="B7C9BC" w:sz="4"/>
-            </w:tcBorders>
-            <w:shd w:fill="F5F9F5" w:color="auto" w:val="clear"/>
-            <w:tcMar>
-              <w:top w:type="dxa" w:w="60"/>
-              <w:left w:type="dxa" w:w="100"/>
-              <w:bottom w:type="dxa" w:w="60"/>
-              <w:right w:type="dxa" w:w="100"/>
-            </w:tcMar>
-            <w:vAlign w:val="center"/>
-          </w:tcPr>
-          <w:p>
-            <w:r>
-              <w:rPr>
-                <w:rFonts w:ascii="Arial" w:cs="Arial" w:eastAsia="Arial" w:hAnsi="Arial"/>
-                <w:sz w:val="18"/>
-                <w:szCs w:val="18"/>
-              </w:rPr>
-              <w:t xml:space="preserve">CN3791 </w:t>
-            </w:r>
-            <w:r>
-              <w:rPr>
-                <w:rFonts w:ascii="Arial" w:cs="Arial" w:eastAsia="Arial" w:hAnsi="Arial"/>
-                <w:b/>
-                <w:bCs/>
-                <w:sz w:val="18"/>
-                <w:szCs w:val="18"/>
-              </w:rPr>
-              <w:t xml:space="preserve">BAT+ / BAT−</w:t>
-            </w:r>
-            <w:r>
-              <w:rPr>
-                <w:rFonts w:ascii="Arial" w:cs="Arial" w:eastAsia="Arial" w:hAnsi="Arial"/>
-                <w:sz w:val="18"/>
-                <w:szCs w:val="18"/>
-              </w:rPr>
-              <w:t xml:space="preserve"> → 2 × 18650 holder (parallel)</w:t>
-            </w:r>
-          </w:p>
-        </w:tc>
-      </w:tr>
-      <w:tr>
-        <w:trPr>
-          <w:cantSplit/>
-        </w:trPr>
-        <w:tc>
-          <w:tcPr>
-            <w:tcW w:type="dxa" w:w="2600"/>
-            <w:tcBorders>
-              <w:top w:val="single" w:color="B7C9BC" w:sz="4"/>
-              <w:left w:val="single" w:color="B7C9BC" w:sz="4"/>
-              <w:bottom w:val="single" w:color="B7C9BC" w:sz="4"/>
-              <w:right w:val="single" w:color="B7C9BC" w:sz="4"/>
-            </w:tcBorders>
-            <w:tcMar>
-              <w:top w:type="dxa" w:w="60"/>
-              <w:left w:type="dxa" w:w="100"/>
-              <w:bottom w:type="dxa" w:w="60"/>
-              <w:right w:type="dxa" w:w="100"/>
-            </w:tcMar>
-            <w:vAlign w:val="center"/>
-          </w:tcPr>
-          <w:p>
-            <w:r>
-              <w:rPr>
-                <w:rFonts w:ascii="Arial" w:cs="Arial" w:eastAsia="Arial" w:hAnsi="Arial"/>
-                <w:sz w:val="18"/>
-                <w:szCs w:val="18"/>
-              </w:rPr>
-              <w:t xml:space="preserve">Battery → boost</w:t>
-            </w:r>
-          </w:p>
-        </w:tc>
-        <w:tc>
-          <w:tcPr>
-            <w:tcW w:type="dxa" w:w="7306"/>
-            <w:tcBorders>
-              <w:top w:val="single" w:color="B7C9BC" w:sz="4"/>
-              <w:left w:val="single" w:color="B7C9BC" w:sz="4"/>
-              <w:bottom w:val="single" w:color="B7C9BC" w:sz="4"/>
-              <w:right w:val="single" w:color="B7C9BC" w:sz="4"/>
-            </w:tcBorders>
-            <w:tcMar>
-              <w:top w:type="dxa" w:w="60"/>
-              <w:left w:type="dxa" w:w="100"/>
-              <w:bottom w:type="dxa" w:w="60"/>
-              <w:right w:type="dxa" w:w="100"/>
-            </w:tcMar>
-            <w:vAlign w:val="center"/>
-          </w:tcPr>
-          <w:p>
-            <w:r>
-              <w:rPr>
-                <w:rFonts w:ascii="Arial" w:cs="Arial" w:eastAsia="Arial" w:hAnsi="Arial"/>
-                <w:sz w:val="18"/>
-                <w:szCs w:val="18"/>
-              </w:rPr>
-              <w:t xml:space="preserve">Battery (+) → </w:t>
-            </w:r>
-            <w:r>
-              <w:rPr>
-                <w:rFonts w:ascii="Arial" w:cs="Arial" w:eastAsia="Arial" w:hAnsi="Arial"/>
-                <w:b/>
-                <w:bCs/>
-                <w:sz w:val="18"/>
-                <w:szCs w:val="18"/>
-              </w:rPr>
-              <w:t xml:space="preserve">switch</w:t>
-            </w:r>
-            <w:r>
-              <w:rPr>
-                <w:rFonts w:ascii="Arial" w:cs="Arial" w:eastAsia="Arial" w:hAnsi="Arial"/>
-                <w:sz w:val="18"/>
-                <w:szCs w:val="18"/>
-              </w:rPr>
-              <w:t xml:space="preserve"> → MT3608 </w:t>
-            </w:r>
-            <w:r>
-              <w:rPr>
-                <w:rFonts w:ascii="Arial" w:cs="Arial" w:eastAsia="Arial" w:hAnsi="Arial"/>
-                <w:b/>
-                <w:bCs/>
-                <w:sz w:val="18"/>
-                <w:szCs w:val="18"/>
-              </w:rPr>
-              <w:t xml:space="preserve">VIN+</w:t>
-            </w:r>
-            <w:r>
-              <w:rPr>
-                <w:rFonts w:ascii="Arial" w:cs="Arial" w:eastAsia="Arial" w:hAnsi="Arial"/>
-                <w:sz w:val="18"/>
-                <w:szCs w:val="18"/>
-              </w:rPr>
-              <w:t xml:space="preserve"> · battery (−) → </w:t>
-            </w:r>
-            <w:r>
-              <w:rPr>
-                <w:rFonts w:ascii="Arial" w:cs="Arial" w:eastAsia="Arial" w:hAnsi="Arial"/>
-                <w:b/>
-                <w:bCs/>
-                <w:sz w:val="18"/>
-                <w:szCs w:val="18"/>
-              </w:rPr>
-              <w:t xml:space="preserve">VIN−</w:t>
-            </w:r>
-          </w:p>
-        </w:tc>
-      </w:tr>
-      <w:tr>
-        <w:trPr>
-          <w:cantSplit/>
-        </w:trPr>
-        <w:tc>
-          <w:tcPr>
-            <w:tcW w:type="dxa" w:w="2600"/>
-            <w:tcBorders>
-              <w:top w:val="single" w:color="B7C9BC" w:sz="4"/>
-              <w:left w:val="single" w:color="B7C9BC" w:sz="4"/>
-              <w:bottom w:val="single" w:color="B7C9BC" w:sz="4"/>
-              <w:right w:val="single" w:color="B7C9BC" w:sz="4"/>
-            </w:tcBorders>
-            <w:shd w:fill="F5F9F5" w:color="auto" w:val="clear"/>
-            <w:tcMar>
-              <w:top w:type="dxa" w:w="60"/>
-              <w:left w:type="dxa" w:w="100"/>
-              <w:bottom w:type="dxa" w:w="60"/>
-              <w:right w:type="dxa" w:w="100"/>
-            </w:tcMar>
-            <w:vAlign w:val="center"/>
-          </w:tcPr>
-          <w:p>
-            <w:r>
-              <w:rPr>
-                <w:rFonts w:ascii="Arial" w:cs="Arial" w:eastAsia="Arial" w:hAnsi="Arial"/>
-                <w:sz w:val="18"/>
-                <w:szCs w:val="18"/>
-              </w:rPr>
-              <w:t xml:space="preserve">Boost → ESP32</w:t>
-            </w:r>
-          </w:p>
-        </w:tc>
-        <w:tc>
-          <w:tcPr>
-            <w:tcW w:type="dxa" w:w="7306"/>
-            <w:tcBorders>
-              <w:top w:val="single" w:color="B7C9BC" w:sz="4"/>
-              <w:left w:val="single" w:color="B7C9BC" w:sz="4"/>
-              <w:bottom w:val="single" w:color="B7C9BC" w:sz="4"/>
-              <w:right w:val="single" w:color="B7C9BC" w:sz="4"/>
-            </w:tcBorders>
-            <w:shd w:fill="F5F9F5" w:color="auto" w:val="clear"/>
-            <w:tcMar>
-              <w:top w:type="dxa" w:w="60"/>
-              <w:left w:type="dxa" w:w="100"/>
-              <w:bottom w:type="dxa" w:w="60"/>
-              <w:right w:type="dxa" w:w="100"/>
-            </w:tcMar>
-            <w:vAlign w:val="center"/>
-          </w:tcPr>
-          <w:p>
-            <w:r>
-              <w:rPr>
-                <w:rFonts w:ascii="Arial" w:cs="Arial" w:eastAsia="Arial" w:hAnsi="Arial"/>
-                <w:sz w:val="18"/>
-                <w:szCs w:val="18"/>
-              </w:rPr>
-              <w:t xml:space="preserve">MT3608 </w:t>
-            </w:r>
-            <w:r>
-              <w:rPr>
-                <w:rFonts w:ascii="Arial" w:cs="Arial" w:eastAsia="Arial" w:hAnsi="Arial"/>
-                <w:b/>
-                <w:bCs/>
-                <w:sz w:val="18"/>
-                <w:szCs w:val="18"/>
-              </w:rPr>
-              <w:t xml:space="preserve">VOUT+ (5.1 V)</w:t>
-            </w:r>
-            <w:r>
-              <w:rPr>
-                <w:rFonts w:ascii="Arial" w:cs="Arial" w:eastAsia="Arial" w:hAnsi="Arial"/>
-                <w:sz w:val="18"/>
-                <w:szCs w:val="18"/>
-              </w:rPr>
-              <w:t xml:space="preserve"> → ESP32 </w:t>
-            </w:r>
-            <w:r>
-              <w:rPr>
-                <w:rFonts w:ascii="Arial" w:cs="Arial" w:eastAsia="Arial" w:hAnsi="Arial"/>
-                <w:b/>
-                <w:bCs/>
-                <w:sz w:val="18"/>
-                <w:szCs w:val="18"/>
-              </w:rPr>
-              <w:t xml:space="preserve">VIN</w:t>
-            </w:r>
-            <w:r>
-              <w:rPr>
-                <w:rFonts w:ascii="Arial" w:cs="Arial" w:eastAsia="Arial" w:hAnsi="Arial"/>
-                <w:sz w:val="18"/>
-                <w:szCs w:val="18"/>
-              </w:rPr>
-              <w:t xml:space="preserve"> · </w:t>
-            </w:r>
-            <w:r>
-              <w:rPr>
-                <w:rFonts w:ascii="Arial" w:cs="Arial" w:eastAsia="Arial" w:hAnsi="Arial"/>
-                <w:b/>
-                <w:bCs/>
-                <w:sz w:val="18"/>
-                <w:szCs w:val="18"/>
-              </w:rPr>
-              <w:t xml:space="preserve">VOUT−</w:t>
-            </w:r>
-            <w:r>
-              <w:rPr>
-                <w:rFonts w:ascii="Arial" w:cs="Arial" w:eastAsia="Arial" w:hAnsi="Arial"/>
-                <w:sz w:val="18"/>
-                <w:szCs w:val="18"/>
-              </w:rPr>
-              <w:t xml:space="preserve"> → GND</w:t>
-            </w:r>
-          </w:p>
-        </w:tc>
-      </w:tr>
-      <w:tr>
-        <w:trPr>
-          <w:cantSplit/>
-        </w:trPr>
-        <w:tc>
-          <w:tcPr>
-            <w:tcW w:type="dxa" w:w="2600"/>
-            <w:tcBorders>
-              <w:top w:val="single" w:color="B7C9BC" w:sz="4"/>
-              <w:left w:val="single" w:color="B7C9BC" w:sz="4"/>
-              <w:bottom w:val="single" w:color="B7C9BC" w:sz="4"/>
-              <w:right w:val="single" w:color="B7C9BC" w:sz="4"/>
-            </w:tcBorders>
-            <w:tcMar>
-              <w:top w:type="dxa" w:w="60"/>
-              <w:left w:type="dxa" w:w="100"/>
-              <w:bottom w:type="dxa" w:w="60"/>
-              <w:right w:type="dxa" w:w="100"/>
-            </w:tcMar>
-            <w:vAlign w:val="center"/>
-          </w:tcPr>
-          <w:p>
-            <w:r>
-              <w:rPr>
-                <w:rFonts w:ascii="Arial" w:cs="Arial" w:eastAsia="Arial" w:hAnsi="Arial"/>
-                <w:sz w:val="18"/>
-                <w:szCs w:val="18"/>
-              </w:rPr>
-              <w:t xml:space="preserve">Battery sensing</w:t>
-            </w:r>
-          </w:p>
-        </w:tc>
-        <w:tc>
-          <w:tcPr>
-            <w:tcW w:type="dxa" w:w="7306"/>
-            <w:tcBorders>
-              <w:top w:val="single" w:color="B7C9BC" w:sz="4"/>
-              <w:left w:val="single" w:color="B7C9BC" w:sz="4"/>
-              <w:bottom w:val="single" w:color="B7C9BC" w:sz="4"/>
-              <w:right w:val="single" w:color="B7C9BC" w:sz="4"/>
-            </w:tcBorders>
-            <w:tcMar>
-              <w:top w:type="dxa" w:w="60"/>
-              <w:left w:type="dxa" w:w="100"/>
-              <w:bottom w:type="dxa" w:w="60"/>
-              <w:right w:type="dxa" w:w="100"/>
-            </w:tcMar>
-            <w:vAlign w:val="center"/>
-          </w:tcPr>
-          <w:p>
-            <w:r>
-              <w:rPr>
-                <w:rFonts w:ascii="Arial" w:cs="Arial" w:eastAsia="Arial" w:hAnsi="Arial"/>
-                <w:sz w:val="18"/>
-                <w:szCs w:val="18"/>
-              </w:rPr>
-              <w:t xml:space="preserve">Battery (+) → 100 kΩ → </w:t>
-            </w:r>
-            <w:r>
-              <w:rPr>
-                <w:rFonts w:ascii="Arial" w:cs="Arial" w:eastAsia="Arial" w:hAnsi="Arial"/>
-                <w:b/>
-                <w:bCs/>
-                <w:sz w:val="18"/>
-                <w:szCs w:val="18"/>
-              </w:rPr>
-              <w:t xml:space="preserve">GPIO35</w:t>
-            </w:r>
-            <w:r>
-              <w:rPr>
-                <w:rFonts w:ascii="Arial" w:cs="Arial" w:eastAsia="Arial" w:hAnsi="Arial"/>
-                <w:sz w:val="18"/>
-                <w:szCs w:val="18"/>
-              </w:rPr>
-              <w:t xml:space="preserve"> → 100 kΩ → GND</w:t>
-            </w:r>
-          </w:p>
-        </w:tc>
-      </w:tr>
-      <w:tr>
-        <w:trPr>
-          <w:cantSplit/>
-        </w:trPr>
-        <w:tc>
-          <w:tcPr>
-            <w:tcW w:type="dxa" w:w="2600"/>
-            <w:tcBorders>
-              <w:top w:val="single" w:color="B7C9BC" w:sz="4"/>
-              <w:left w:val="single" w:color="B7C9BC" w:sz="4"/>
-              <w:bottom w:val="single" w:color="B7C9BC" w:sz="4"/>
-              <w:right w:val="single" w:color="B7C9BC" w:sz="4"/>
-            </w:tcBorders>
-            <w:shd w:fill="F5F9F5" w:color="auto" w:val="clear"/>
-            <w:tcMar>
-              <w:top w:type="dxa" w:w="60"/>
-              <w:left w:type="dxa" w:w="100"/>
-              <w:bottom w:type="dxa" w:w="60"/>
-              <w:right w:type="dxa" w:w="100"/>
-            </w:tcMar>
-            <w:vAlign w:val="center"/>
-          </w:tcPr>
-          <w:p>
-            <w:r>
-              <w:rPr>
-                <w:rFonts w:ascii="Arial" w:cs="Arial" w:eastAsia="Arial" w:hAnsi="Arial"/>
-                <w:sz w:val="18"/>
-                <w:szCs w:val="18"/>
-              </w:rPr>
-              <w:t xml:space="preserve">Panel sensing</w:t>
-            </w:r>
-          </w:p>
-        </w:tc>
-        <w:tc>
-          <w:tcPr>
-            <w:tcW w:type="dxa" w:w="7306"/>
-            <w:tcBorders>
-              <w:top w:val="single" w:color="B7C9BC" w:sz="4"/>
-              <w:left w:val="single" w:color="B7C9BC" w:sz="4"/>
-              <w:bottom w:val="single" w:color="B7C9BC" w:sz="4"/>
-              <w:right w:val="single" w:color="B7C9BC" w:sz="4"/>
-            </w:tcBorders>
-            <w:shd w:fill="F5F9F5" w:color="auto" w:val="clear"/>
-            <w:tcMar>
-              <w:top w:type="dxa" w:w="60"/>
-              <w:left w:type="dxa" w:w="100"/>
-              <w:bottom w:type="dxa" w:w="60"/>
-              <w:right w:type="dxa" w:w="100"/>
-            </w:tcMar>
-            <w:vAlign w:val="center"/>
-          </w:tcPr>
-          <w:p>
-            <w:r>
-              <w:rPr>
-                <w:rFonts w:ascii="Arial" w:cs="Arial" w:eastAsia="Arial" w:hAnsi="Arial"/>
-                <w:sz w:val="18"/>
-                <w:szCs w:val="18"/>
-              </w:rPr>
-              <w:t xml:space="preserve">Panel (+) → 100 kΩ → 100 kΩ → </w:t>
-            </w:r>
-            <w:r>
-              <w:rPr>
-                <w:rFonts w:ascii="Arial" w:cs="Arial" w:eastAsia="Arial" w:hAnsi="Arial"/>
-                <w:b/>
-                <w:bCs/>
-                <w:sz w:val="18"/>
-                <w:szCs w:val="18"/>
-              </w:rPr>
-              <w:t xml:space="preserve">GPIO39 (VN)</w:t>
-            </w:r>
-            <w:r>
-              <w:rPr>
-                <w:rFonts w:ascii="Arial" w:cs="Arial" w:eastAsia="Arial" w:hAnsi="Arial"/>
-                <w:sz w:val="18"/>
-                <w:szCs w:val="18"/>
-              </w:rPr>
-              <w:t xml:space="preserve"> → 100 kΩ → GND</w:t>
-            </w:r>
-          </w:p>
-        </w:tc>
-      </w:tr>
-    </w:tbl>
-    <w:p>
-      <w:pPr>
-        <w:pStyle w:val="ListParagraph"/>
-        <w:numPr>
-          <w:ilvl w:val="0"/>
-          <w:numId w:val="12"/>
-        </w:numPr>
-        <w:spacing w:after="40" w:before="40"/>
-      </w:pPr>
-      <w:r>
-        <w:rPr>
-          <w:rFonts w:ascii="Arial" w:cs="Arial" w:eastAsia="Arial" w:hAnsi="Arial"/>
-          <w:sz w:val="20"/>
-          <w:szCs w:val="20"/>
-        </w:rPr>
-        <w:t xml:space="preserve">Connect </w:t>
-      </w:r>
-      <w:r>
-        <w:rPr>
-          <w:rFonts w:ascii="Arial" w:cs="Arial" w:eastAsia="Arial" w:hAnsi="Arial"/>
-          <w:b/>
-          <w:bCs/>
-          <w:sz w:val="20"/>
-          <w:szCs w:val="20"/>
-        </w:rPr>
-        <w:t xml:space="preserve">only the batteries</w:t>
-      </w:r>
-      <w:r>
-        <w:rPr>
-          <w:rFonts w:ascii="Arial" w:cs="Arial" w:eastAsia="Arial" w:hAnsi="Arial"/>
-          <w:sz w:val="20"/>
-          <w:szCs w:val="20"/>
-        </w:rPr>
-        <w:t xml:space="preserve"> to the MT3608 and turn its small screw until the multimeter shows </w:t>
-      </w:r>
-      <w:r>
-        <w:rPr>
-          <w:rFonts w:ascii="Arial" w:cs="Arial" w:eastAsia="Arial" w:hAnsi="Arial"/>
-          <w:b/>
-          <w:bCs/>
-          <w:sz w:val="20"/>
-          <w:szCs w:val="20"/>
-        </w:rPr>
-        <w:t xml:space="preserve">5.1 V</w:t>
-      </w:r>
-      <w:r>
-        <w:rPr>
-          <w:rFonts w:ascii="Arial" w:cs="Arial" w:eastAsia="Arial" w:hAnsi="Arial"/>
-          <w:sz w:val="20"/>
-          <w:szCs w:val="20"/>
-        </w:rPr>
-        <w:t xml:space="preserve"> at VOUT.</w:t>
-      </w:r>
-    </w:p>
-    <w:p>
-      <w:pPr>
-        <w:pStyle w:val="ListParagraph"/>
-        <w:numPr>
-          <w:ilvl w:val="0"/>
-          <w:numId w:val="12"/>
-        </w:numPr>
-        <w:spacing w:after="40" w:before="40"/>
-      </w:pPr>
-      <w:r>
-        <w:rPr>
-          <w:rFonts w:ascii="Arial" w:cs="Arial" w:eastAsia="Arial" w:hAnsi="Arial"/>
-          <w:sz w:val="20"/>
-          <w:szCs w:val="20"/>
-        </w:rPr>
-        <w:t xml:space="preserve">Wire the panel, charger, batteries, switch and the two dividers as in the table.</w:t>
-      </w:r>
-    </w:p>
-    <w:p>
-      <w:pPr>
-        <w:pStyle w:val="ListParagraph"/>
-        <w:numPr>
-          <w:ilvl w:val="0"/>
-          <w:numId w:val="12"/>
-        </w:numPr>
-        <w:spacing w:after="40" w:before="40"/>
-      </w:pPr>
-      <w:r>
-        <w:rPr>
-          <w:rFonts w:ascii="Arial" w:cs="Arial" w:eastAsia="Arial" w:hAnsi="Arial"/>
-          <w:sz w:val="20"/>
-          <w:szCs w:val="20"/>
-        </w:rPr>
-        <w:t xml:space="preserve">In </w:t>
-      </w:r>
-      <w:r>
-        <w:rPr>
-          <w:rFonts w:ascii="Consolas" w:cs="Consolas" w:eastAsia="Consolas" w:hAnsi="Consolas"/>
-          <w:color w:val="1D4F7A"/>
-          <w:sz w:val="20"/>
-          <w:szCs w:val="20"/>
-        </w:rPr>
-        <w:t xml:space="preserve">config.h</w:t>
-      </w:r>
-      <w:r>
-        <w:rPr>
-          <w:rFonts w:ascii="Arial" w:cs="Arial" w:eastAsia="Arial" w:hAnsi="Arial"/>
-          <w:sz w:val="20"/>
-          <w:szCs w:val="20"/>
-        </w:rPr>
-        <w:t xml:space="preserve"> set </w:t>
-      </w:r>
-      <w:r>
-        <w:rPr>
-          <w:rFonts w:ascii="Consolas" w:cs="Consolas" w:eastAsia="Consolas" w:hAnsi="Consolas"/>
-          <w:color w:val="1D4F7A"/>
-          <w:sz w:val="20"/>
-          <w:szCs w:val="20"/>
-        </w:rPr>
-        <w:t xml:space="preserve">#define SOLAR_ENABLED 1</w:t>
-      </w:r>
-      <w:r>
-        <w:rPr>
-          <w:rFonts w:ascii="Arial" w:cs="Arial" w:eastAsia="Arial" w:hAnsi="Arial"/>
-          <w:sz w:val="20"/>
-          <w:szCs w:val="20"/>
-        </w:rPr>
-        <w:t xml:space="preserve"> and upload with the USB cable. </w:t>
-      </w:r>
-      <w:r>
-        <w:rPr>
-          <w:rFonts w:ascii="Arial" w:cs="Arial" w:eastAsia="Arial" w:hAnsi="Arial"/>
-          <w:b/>
-          <w:bCs/>
-          <w:sz w:val="20"/>
-          <w:szCs w:val="20"/>
-        </w:rPr>
-        <w:t xml:space="preserve">Unplug the USB cable</w:t>
-      </w:r>
-      <w:r>
-        <w:rPr>
-          <w:rFonts w:ascii="Arial" w:cs="Arial" w:eastAsia="Arial" w:hAnsi="Arial"/>
-          <w:sz w:val="20"/>
-          <w:szCs w:val="20"/>
-        </w:rPr>
-        <w:t xml:space="preserve">, then connect the MT3608 to VIN/GND and switch on.</w:t>
-      </w:r>
-    </w:p>
-    <w:p>
-      <w:pPr>
-        <w:pStyle w:val="ListParagraph"/>
-        <w:numPr>
-          <w:ilvl w:val="0"/>
-          <w:numId w:val="12"/>
-        </w:numPr>
-        <w:spacing w:after="40" w:before="40"/>
-      </w:pPr>
-      <w:r>
-        <w:rPr>
-          <w:rFonts w:ascii="Arial" w:cs="Arial" w:eastAsia="Arial" w:hAnsi="Arial"/>
-          <w:sz w:val="20"/>
-          <w:szCs w:val="20"/>
-        </w:rPr>
-        <w:t xml:space="preserve">Compare the battery voltage on the multimeter with the Serial Monitor line </w:t>
-      </w:r>
-      <w:r>
-        <w:rPr>
-          <w:rFonts w:ascii="Consolas" w:cs="Consolas" w:eastAsia="Consolas" w:hAnsi="Consolas"/>
-          <w:color w:val="1D4F7A"/>
-          <w:sz w:val="20"/>
-          <w:szCs w:val="20"/>
-        </w:rPr>
-        <w:t xml:space="preserve">power: battery=…</w:t>
-      </w:r>
-      <w:r>
-        <w:rPr>
-          <w:rFonts w:ascii="Arial" w:cs="Arial" w:eastAsia="Arial" w:hAnsi="Arial"/>
-          <w:sz w:val="20"/>
-          <w:szCs w:val="20"/>
-        </w:rPr>
-        <w:t xml:space="preserve">. If it differs by more than 0.05 V, adjust </w:t>
-      </w:r>
-      <w:r>
-        <w:rPr>
-          <w:rFonts w:ascii="Consolas" w:cs="Consolas" w:eastAsia="Consolas" w:hAnsi="Consolas"/>
-          <w:color w:val="1D4F7A"/>
-          <w:sz w:val="20"/>
-          <w:szCs w:val="20"/>
-        </w:rPr>
-        <w:t xml:space="preserve">BATTERY_DIVIDER</w:t>
-      </w:r>
-      <w:r>
-        <w:rPr>
-          <w:rFonts w:ascii="Arial" w:cs="Arial" w:eastAsia="Arial" w:hAnsi="Arial"/>
-          <w:sz w:val="20"/>
-          <w:szCs w:val="20"/>
-        </w:rPr>
-        <w:t xml:space="preserve">.</w:t>
-      </w:r>
-    </w:p>
-    <w:p>
-      <w:pPr>
-        <w:pBdr>
-          <w:left w:val="single" w:color="C77700" w:sz="18" w:space="8"/>
-        </w:pBdr>
-        <w:shd w:fill="FFF4E0" w:color="auto" w:val="clear"/>
-        <w:spacing w:after="100" w:before="100"/>
-        <w:ind w:left="200"/>
-      </w:pPr>
-      <w:r>
-        <w:rPr>
-          <w:rFonts w:ascii="Arial" w:cs="Arial" w:eastAsia="Arial" w:hAnsi="Arial"/>
-          <w:sz w:val="20"/>
-          <w:szCs w:val="20"/>
-        </w:rPr>
-        <w:t xml:space="preserve">Never connect the USB cable and the MT3608 at the same time. Use protected 18650 cells and keep the charger and batteries inside the box.</w:t>
-      </w:r>
-    </w:p>
-    <w:p>
-      <w:pPr>
-        <w:spacing w:after="60" w:before="60"/>
-      </w:pPr>
-      <w:r>
-        <w:rPr>
-          <w:rFonts w:ascii="Arial" w:cs="Arial" w:eastAsia="Arial" w:hAnsi="Arial"/>
-          <w:b/>
-          <w:bCs/>
-          <w:sz w:val="20"/>
-          <w:szCs w:val="20"/>
-        </w:rPr>
-        <w:t xml:space="preserve">Check:</w:t>
-      </w:r>
-      <w:r>
-        <w:rPr>
-          <w:rFonts w:ascii="Arial" w:cs="Arial" w:eastAsia="Arial" w:hAnsi="Arial"/>
-          <w:sz w:val="20"/>
-          <w:szCs w:val="20"/>
-        </w:rPr>
-        <w:t xml:space="preserve"> in the sun the apps show 🔋 battery % and “Charging from the sun ☀️”; covering the panel shows “Not charging now”.</w:t>
-      </w:r>
-    </w:p>
-    <w:p>
-      <w:pPr>
-        <w:pStyle w:val="Heading2"/>
-        <w:spacing w:after="100" w:before="240"/>
-      </w:pPr>
-      <w:r>
-        <w:rPr>
-          <w:rFonts w:ascii="Arial" w:cs="Arial" w:eastAsia="Arial" w:hAnsi="Arial"/>
-          <w:b/>
-          <w:bCs/>
-          <w:color w:val="2F7D4F"/>
-          <w:sz w:val="26"/>
-          <w:szCs w:val="26"/>
-        </w:rPr>
-        <w:t xml:space="preserve">Step 12: Test everything</w:t>
+        <w:t xml:space="preserve">Step 11: Test everything</w:t>
       </w:r>
     </w:p>
     <w:p>
@@ -7697,7 +6289,7 @@
           <w:sz w:val="20"/>
           <w:szCs w:val="20"/>
         </w:rPr>
-        <w:t xml:space="preserve">Turn the Wi-Fi off → the melodies still work; the apps show “Offline”.</w:t>
+        <w:t xml:space="preserve">Turn the Wi-Fi off → the face and melodies still work; the apps show “Offline”.</w:t>
       </w:r>
     </w:p>
     <w:p>
@@ -7715,7 +6307,41 @@
           <w:sz w:val="20"/>
           <w:szCs w:val="20"/>
         </w:rPr>
-        <w:t xml:space="preserve">Cover the solar panel → the apps show “Not charging now”; leave it outside for 24 h → battery chart rises in the day.</w:t>
+        <w:t xml:space="preserve">Full test table: </w:t>
+      </w:r>
+      <w:r>
+        <w:rPr>
+          <w:rFonts w:ascii="Consolas" w:cs="Consolas" w:eastAsia="Consolas" w:hAnsi="Consolas"/>
+          <w:color w:val="1D4F7A"/>
+          <w:sz w:val="20"/>
+          <w:szCs w:val="20"/>
+        </w:rPr>
+        <w:t xml:space="preserve">docs/08-testing-calibration.md</w:t>
+      </w:r>
+      <w:r>
+        <w:rPr>
+          <w:rFonts w:ascii="Arial" w:cs="Arial" w:eastAsia="Arial" w:hAnsi="Arial"/>
+          <w:sz w:val="20"/>
+          <w:szCs w:val="20"/>
+        </w:rPr>
+        <w:t xml:space="preserve">.</w:t>
+      </w:r>
+    </w:p>
+    <w:p>
+      <w:pPr>
+        <w:pStyle w:val="Heading2"/>
+        <w:spacing w:after="100" w:before="240"/>
+      </w:pPr>
+      <w:r>
+        <w:rPr>
+          <w:rFonts w:ascii="Arial" w:cs="Arial" w:eastAsia="Arial" w:hAnsi="Arial"/>
+          <w:b/>
+          <w:bCs/>
+          <w:color w:val="2F7D4F"/>
+          <w:sz w:val="26"/>
+          <w:szCs w:val="26"/>
+        </w:rPr>
+        <w:t xml:space="preserve">Step 12: Final assembly, report and presentation</w:t>
       </w:r>
     </w:p>
     <w:p>
@@ -7733,41 +6359,7 @@
           <w:sz w:val="20"/>
           <w:szCs w:val="20"/>
         </w:rPr>
-        <w:t xml:space="preserve">Full test table: </w:t>
-      </w:r>
-      <w:r>
-        <w:rPr>
-          <w:rFonts w:ascii="Consolas" w:cs="Consolas" w:eastAsia="Consolas" w:hAnsi="Consolas"/>
-          <w:color w:val="1D4F7A"/>
-          <w:sz w:val="20"/>
-          <w:szCs w:val="20"/>
-        </w:rPr>
-        <w:t xml:space="preserve">docs/08-testing-calibration.md</w:t>
-      </w:r>
-      <w:r>
-        <w:rPr>
-          <w:rFonts w:ascii="Arial" w:cs="Arial" w:eastAsia="Arial" w:hAnsi="Arial"/>
-          <w:sz w:val="20"/>
-          <w:szCs w:val="20"/>
-        </w:rPr>
-        <w:t xml:space="preserve">.</w:t>
-      </w:r>
-    </w:p>
-    <w:p>
-      <w:pPr>
-        <w:pStyle w:val="Heading2"/>
-        <w:spacing w:after="100" w:before="240"/>
-      </w:pPr>
-      <w:r>
-        <w:rPr>
-          <w:rFonts w:ascii="Arial" w:cs="Arial" w:eastAsia="Arial" w:hAnsi="Arial"/>
-          <w:b/>
-          <w:bCs/>
-          <w:color w:val="2F7D4F"/>
-          <w:sz w:val="26"/>
-          <w:szCs w:val="26"/>
-        </w:rPr>
-        <w:t xml:space="preserve">Step 13: Final assembly, report and presentation</w:t>
+        <w:t xml:space="preserve">Move the circuit to a small perfboard or mini breadboard inside a box fixed to the pot: holes for the buzzer and the USB cable; DHT22 and BH1750 outside the box.</w:t>
       </w:r>
     </w:p>
     <w:p>
@@ -7785,25 +6377,7 @@
           <w:sz w:val="20"/>
           <w:szCs w:val="20"/>
         </w:rPr>
-        <w:t xml:space="preserve">Move the circuit to a small perfboard or mini breadboard inside a box fixed to the pot, together with the charger, batteries and boost converter; DHT22 and BH1750 outside the box.</w:t>
-      </w:r>
-    </w:p>
-    <w:p>
-      <w:pPr>
-        <w:pStyle w:val="ListParagraph"/>
-        <w:numPr>
-          <w:ilvl w:val="0"/>
-          <w:numId w:val="2"/>
-        </w:numPr>
-        <w:spacing w:after="30" w:before="30"/>
-      </w:pPr>
-      <w:r>
-        <w:rPr>
-          <w:rFonts w:ascii="Arial" w:cs="Arial" w:eastAsia="Arial" w:hAnsi="Arial"/>
-          <w:sz w:val="20"/>
-          <w:szCs w:val="20"/>
-        </w:rPr>
-        <w:t xml:space="preserve">Place the solar panel outside the box, facing the sun. The battery runs the plant ≈ 39 hours without sun.</w:t>
+        <w:t xml:space="preserve">Power it from the power bank (≈ 2–3 days with 10,000 mAh) or a USB phone charger.</w:t>
       </w:r>
     </w:p>
     <w:p>
@@ -8663,7 +7237,7 @@
                 <w:sz w:val="18"/>
                 <w:szCs w:val="18"/>
               </w:rPr>
-              <w:t xml:space="preserve"> starts the sensors, the power monitor, the buzzer and Wi-Fi. </w:t>
+              <w:t xml:space="preserve"> starts the screen, sensors, buzzer and Wi-Fi. </w:t>
             </w:r>
             <w:r>
               <w:rPr>
@@ -8680,7 +7254,7 @@
                 <w:sz w:val="18"/>
                 <w:szCs w:val="18"/>
               </w:rPr>
-              <w:t xml:space="preserve"> reads the sensors and the battery every 2 s, decides the mood, plays melodies, uploads to Firebase every 30 s (2 min in power-saving mode), handles the button</w:t>
+              <w:t xml:space="preserve"> reads sensors every 2 s, decides the mood, plays melodies, uploads to Firebase every 30 s, draws the face, handles the button</w:t>
             </w:r>
           </w:p>
         </w:tc>
@@ -8782,25 +7356,7 @@
                 <w:sz w:val="18"/>
                 <w:szCs w:val="18"/>
               </w:rPr>
-              <w:t xml:space="preserve">: Wi-Fi name/password, Firebase API key, database URL, device account, PLANT_ID, timing, soil calibration, </w:t>
-            </w:r>
-            <w:r>
-              <w:rPr>
-                <w:rFonts w:ascii="Arial" w:cs="Arial" w:eastAsia="Arial" w:hAnsi="Arial"/>
-                <w:b/>
-                <w:bCs/>
-                <w:sz w:val="18"/>
-                <w:szCs w:val="18"/>
-              </w:rPr>
-              <w:t xml:space="preserve">solar settings</w:t>
-            </w:r>
-            <w:r>
-              <w:rPr>
-                <w:rFonts w:ascii="Arial" w:cs="Arial" w:eastAsia="Arial" w:hAnsi="Arial"/>
-                <w:sz w:val="18"/>
-                <w:szCs w:val="18"/>
-              </w:rPr>
-              <w:t xml:space="preserve"> (SOLAR_ENABLED, dividers, low-battery level), time zone</w:t>
+              <w:t xml:space="preserve">: Wi-Fi name/password, Firebase API key, database URL, device account, PLANT_ID, timing, soil calibration, time zone</w:t>
             </w:r>
           </w:p>
         </w:tc>
@@ -8893,7 +7449,7 @@
                 <w:sz w:val="18"/>
                 <w:szCs w:val="18"/>
               </w:rPr>
-              <w:t xml:space="preserve">Which ESP32 pin each module uses (soil 34, battery 35, panel 39, DHT 4, buzzer 25, button 13, I2C 21/22)</w:t>
+              <w:t xml:space="preserve">Which ESP32 pin each module uses (soil 34, DHT 4, buzzer 25, button 13, I2C 21/22)</w:t>
             </w:r>
           </w:p>
         </w:tc>
@@ -9202,217 +7758,7 @@
                 <w:sz w:val="18"/>
                 <w:szCs w:val="18"/>
               </w:rPr>
-              <w:t xml:space="preserve">The current plant state (readings, power, mood, Wi-Fi) shared with the cloud upload</w:t>
-            </w:r>
-          </w:p>
-        </w:tc>
-        <w:tc>
-          <w:tcPr>
-            <w:tcW w:type="dxa" w:w="1600"/>
-            <w:tcBorders>
-              <w:top w:val="single" w:color="B7C9BC" w:sz="4"/>
-              <w:left w:val="single" w:color="B7C9BC" w:sz="4"/>
-              <w:bottom w:val="single" w:color="B7C9BC" w:sz="4"/>
-              <w:right w:val="single" w:color="B7C9BC" w:sz="4"/>
-            </w:tcBorders>
-            <w:shd w:fill="F5F9F5" w:color="auto" w:val="clear"/>
-            <w:tcMar>
-              <w:top w:type="dxa" w:w="60"/>
-              <w:left w:type="dxa" w:w="100"/>
-              <w:bottom w:type="dxa" w:w="60"/>
-              <w:right w:type="dxa" w:w="100"/>
-            </w:tcMar>
-            <w:vAlign w:val="center"/>
-          </w:tcPr>
-          <w:p>
-            <w:r>
-              <w:rPr>
-                <w:rFonts w:ascii="Arial" w:cs="Arial" w:eastAsia="Arial" w:hAnsi="Arial"/>
-                <w:sz w:val="18"/>
-                <w:szCs w:val="18"/>
-              </w:rPr>
-              <w:t xml:space="preserve">No</w:t>
-            </w:r>
-          </w:p>
-        </w:tc>
-      </w:tr>
-      <w:tr>
-        <w:trPr>
-          <w:cantSplit/>
-        </w:trPr>
-        <w:tc>
-          <w:tcPr>
-            <w:tcW w:type="dxa" w:w="2300"/>
-            <w:tcBorders>
-              <w:top w:val="single" w:color="B7C9BC" w:sz="4"/>
-              <w:left w:val="single" w:color="B7C9BC" w:sz="4"/>
-              <w:bottom w:val="single" w:color="B7C9BC" w:sz="4"/>
-              <w:right w:val="single" w:color="B7C9BC" w:sz="4"/>
-            </w:tcBorders>
-            <w:tcMar>
-              <w:top w:type="dxa" w:w="60"/>
-              <w:left w:type="dxa" w:w="100"/>
-              <w:bottom w:type="dxa" w:w="60"/>
-              <w:right w:type="dxa" w:w="100"/>
-            </w:tcMar>
-            <w:vAlign w:val="center"/>
-          </w:tcPr>
-          <w:p>
-            <w:r>
-              <w:rPr>
-                <w:rFonts w:ascii="Consolas" w:cs="Consolas" w:eastAsia="Consolas" w:hAnsi="Consolas"/>
-                <w:color w:val="1D4F7A"/>
-                <w:sz w:val="18"/>
-                <w:szCs w:val="18"/>
-              </w:rPr>
-              <w:t xml:space="preserve">power.h</w:t>
-            </w:r>
-            <w:r>
-              <w:rPr>
-                <w:rFonts w:ascii="Arial" w:cs="Arial" w:eastAsia="Arial" w:hAnsi="Arial"/>
-                <w:sz w:val="18"/>
-                <w:szCs w:val="18"/>
-              </w:rPr>
-              <w:t xml:space="preserve"> / </w:t>
-            </w:r>
-            <w:r>
-              <w:rPr>
-                <w:rFonts w:ascii="Consolas" w:cs="Consolas" w:eastAsia="Consolas" w:hAnsi="Consolas"/>
-                <w:color w:val="1D4F7A"/>
-                <w:sz w:val="18"/>
-                <w:szCs w:val="18"/>
-              </w:rPr>
-              <w:t xml:space="preserve">power.cpp</w:t>
-            </w:r>
-          </w:p>
-        </w:tc>
-        <w:tc>
-          <w:tcPr>
-            <w:tcW w:type="dxa" w:w="6006"/>
-            <w:tcBorders>
-              <w:top w:val="single" w:color="B7C9BC" w:sz="4"/>
-              <w:left w:val="single" w:color="B7C9BC" w:sz="4"/>
-              <w:bottom w:val="single" w:color="B7C9BC" w:sz="4"/>
-              <w:right w:val="single" w:color="B7C9BC" w:sz="4"/>
-            </w:tcBorders>
-            <w:tcMar>
-              <w:top w:type="dxa" w:w="60"/>
-              <w:left w:type="dxa" w:w="100"/>
-              <w:bottom w:type="dxa" w:w="60"/>
-              <w:right w:type="dxa" w:w="100"/>
-            </w:tcMar>
-            <w:vAlign w:val="center"/>
-          </w:tcPr>
-          <w:p>
-            <w:r>
-              <w:rPr>
-                <w:rFonts w:ascii="Arial" w:cs="Arial" w:eastAsia="Arial" w:hAnsi="Arial"/>
-                <w:b/>
-                <w:bCs/>
-                <w:sz w:val="18"/>
-                <w:szCs w:val="18"/>
-              </w:rPr>
-              <w:t xml:space="preserve">Solar part:</w:t>
-            </w:r>
-            <w:r>
-              <w:rPr>
-                <w:rFonts w:ascii="Arial" w:cs="Arial" w:eastAsia="Arial" w:hAnsi="Arial"/>
-                <w:sz w:val="18"/>
-                <w:szCs w:val="18"/>
-              </w:rPr>
-              <w:t xml:space="preserve"> reads the battery voltage (GPIO35) and the panel voltage (GPIO39) through the dividers</w:t>
-            </w:r>
-          </w:p>
-        </w:tc>
-        <w:tc>
-          <w:tcPr>
-            <w:tcW w:type="dxa" w:w="1600"/>
-            <w:tcBorders>
-              <w:top w:val="single" w:color="B7C9BC" w:sz="4"/>
-              <w:left w:val="single" w:color="B7C9BC" w:sz="4"/>
-              <w:bottom w:val="single" w:color="B7C9BC" w:sz="4"/>
-              <w:right w:val="single" w:color="B7C9BC" w:sz="4"/>
-            </w:tcBorders>
-            <w:tcMar>
-              <w:top w:type="dxa" w:w="60"/>
-              <w:left w:type="dxa" w:w="100"/>
-              <w:bottom w:type="dxa" w:w="60"/>
-              <w:right w:type="dxa" w:w="100"/>
-            </w:tcMar>
-            <w:vAlign w:val="center"/>
-          </w:tcPr>
-          <w:p>
-            <w:r>
-              <w:rPr>
-                <w:rFonts w:ascii="Arial" w:cs="Arial" w:eastAsia="Arial" w:hAnsi="Arial"/>
-                <w:sz w:val="18"/>
-                <w:szCs w:val="18"/>
-              </w:rPr>
-              <w:t xml:space="preserve">No</w:t>
-            </w:r>
-          </w:p>
-        </w:tc>
-      </w:tr>
-      <w:tr>
-        <w:trPr>
-          <w:cantSplit/>
-        </w:trPr>
-        <w:tc>
-          <w:tcPr>
-            <w:tcW w:type="dxa" w:w="2300"/>
-            <w:tcBorders>
-              <w:top w:val="single" w:color="B7C9BC" w:sz="4"/>
-              <w:left w:val="single" w:color="B7C9BC" w:sz="4"/>
-              <w:bottom w:val="single" w:color="B7C9BC" w:sz="4"/>
-              <w:right w:val="single" w:color="B7C9BC" w:sz="4"/>
-            </w:tcBorders>
-            <w:shd w:fill="F5F9F5" w:color="auto" w:val="clear"/>
-            <w:tcMar>
-              <w:top w:type="dxa" w:w="60"/>
-              <w:left w:type="dxa" w:w="100"/>
-              <w:bottom w:type="dxa" w:w="60"/>
-              <w:right w:type="dxa" w:w="100"/>
-            </w:tcMar>
-            <w:vAlign w:val="center"/>
-          </w:tcPr>
-          <w:p>
-            <w:r>
-              <w:rPr>
-                <w:rFonts w:ascii="Consolas" w:cs="Consolas" w:eastAsia="Consolas" w:hAnsi="Consolas"/>
-                <w:color w:val="1D4F7A"/>
-                <w:sz w:val="18"/>
-                <w:szCs w:val="18"/>
-              </w:rPr>
-              <w:t xml:space="preserve">power_calc.h</w:t>
-            </w:r>
-          </w:p>
-        </w:tc>
-        <w:tc>
-          <w:tcPr>
-            <w:tcW w:type="dxa" w:w="6006"/>
-            <w:tcBorders>
-              <w:top w:val="single" w:color="B7C9BC" w:sz="4"/>
-              <w:left w:val="single" w:color="B7C9BC" w:sz="4"/>
-              <w:bottom w:val="single" w:color="B7C9BC" w:sz="4"/>
-              <w:right w:val="single" w:color="B7C9BC" w:sz="4"/>
-            </w:tcBorders>
-            <w:shd w:fill="F5F9F5" w:color="auto" w:val="clear"/>
-            <w:tcMar>
-              <w:top w:type="dxa" w:w="60"/>
-              <w:left w:type="dxa" w:w="100"/>
-              <w:bottom w:type="dxa" w:w="60"/>
-              <w:right w:type="dxa" w:w="100"/>
-            </w:tcMar>
-            <w:vAlign w:val="center"/>
-          </w:tcPr>
-          <w:p>
-            <w:r>
-              <w:rPr>
-                <w:rFonts w:ascii="Arial" w:cs="Arial" w:eastAsia="Arial" w:hAnsi="Arial"/>
-                <w:sz w:val="18"/>
-                <w:szCs w:val="18"/>
-              </w:rPr>
-              <w:t xml:space="preserve">Battery % from voltage, “is charging”, power-saving mode below 15 % (tested on a PC)</w:t>
+              <w:t xml:space="preserve">The current plant state (readings, mood, Wi-Fi) shared with the cloud upload</w:t>
             </w:r>
           </w:p>
         </w:tc>
@@ -11626,7 +9972,7 @@
                 <w:sz w:val="18"/>
                 <w:szCs w:val="18"/>
               </w:rPr>
-              <w:t xml:space="preserve">Main screen with 3 tabs: Plant (emoji + values + battery/solar + Play/Mute), History (chart incl. battery), Diary</w:t>
+              <w:t xml:space="preserve">Main screen with 3 tabs: Plant (emoji + values + Play/Mute), History (chart), Diary</w:t>
             </w:r>
           </w:p>
         </w:tc>
@@ -12401,7 +10747,7 @@
                 <w:sz w:val="18"/>
                 <w:szCs w:val="18"/>
               </w:rPr>
-              <w:t xml:space="preserve">Automatic tests of the mood logic and the solar battery calculations on a PC (47 checks)</w:t>
+              <w:t xml:space="preserve">Automatic tests of the mood logic on a PC (33 checks)</w:t>
             </w:r>
           </w:p>
         </w:tc>
@@ -12573,7 +10919,7 @@
                 <w:sz w:val="18"/>
                 <w:szCs w:val="18"/>
               </w:rPr>
-              <w:t xml:space="preserve">docs/12</w:t>
+              <w:t xml:space="preserve">docs/10</w:t>
             </w:r>
             <w:r>
               <w:rPr>
@@ -12609,35 +10955,7 @@
                 <w:sz w:val="18"/>
                 <w:szCs w:val="18"/>
               </w:rPr>
-              <w:t xml:space="preserve">Chapters: requirements, components, wiring, Firebase, firmware, web, Android, testing, plan, report outline, </w:t>
-            </w:r>
-            <w:r>
-              <w:rPr>
-                <w:rFonts w:ascii="Arial" w:cs="Arial" w:eastAsia="Arial" w:hAnsi="Arial"/>
-                <w:b/>
-                <w:bCs/>
-                <w:sz w:val="18"/>
-                <w:szCs w:val="18"/>
-              </w:rPr>
-              <w:t xml:space="preserve">solar power</w:t>
-            </w:r>
-            <w:r>
-              <w:rPr>
-                <w:rFonts w:ascii="Arial" w:cs="Arial" w:eastAsia="Arial" w:hAnsi="Arial"/>
-                <w:sz w:val="18"/>
-                <w:szCs w:val="18"/>
-              </w:rPr>
-              <w:t xml:space="preserve">, </w:t>
-            </w:r>
-            <w:r>
-              <w:rPr>
-                <w:rFonts w:ascii="Arial" w:cs="Arial" w:eastAsia="Arial" w:hAnsi="Arial"/>
-                <w:b/>
-                <w:bCs/>
-                <w:sz w:val="18"/>
-                <w:szCs w:val="18"/>
-              </w:rPr>
-              <w:t xml:space="preserve">future AI</w:t>
+              <w:t xml:space="preserve">Chapters: requirements, components, wiring, Firebase, firmware, web, Android, testing, plan, report outline</w:t>
             </w:r>
           </w:p>
         </w:tc>
@@ -12820,7 +11138,7 @@
                 <w:sz w:val="18"/>
                 <w:szCs w:val="18"/>
               </w:rPr>
-              <w:t xml:space="preserve">Component lists (main part + separate solar part) in Arabic + English with codes, prices and buy links</w:t>
+              <w:t xml:space="preserve">Component list in Arabic + English with expected prices</w:t>
             </w:r>
           </w:p>
         </w:tc>
@@ -14053,7 +12371,7 @@
                 <w:sz w:val="18"/>
                 <w:szCs w:val="18"/>
               </w:rPr>
-              <w:t xml:space="preserve">Latest readings + mood + battery / solar + time</w:t>
+              <w:t xml:space="preserve">Latest readings + mood + time</w:t>
             </w:r>
           </w:p>
         </w:tc>
@@ -14534,128 +12852,6 @@
                 <w:szCs w:val="18"/>
               </w:rPr>
               <w:t xml:space="preserve">Melody number 1–9 to play</w:t>
-            </w:r>
-          </w:p>
-        </w:tc>
-      </w:tr>
-      <w:tr>
-        <w:trPr>
-          <w:cantSplit/>
-        </w:trPr>
-        <w:tc>
-          <w:tcPr>
-            <w:tcW w:type="dxa" w:w="2500"/>
-            <w:tcBorders>
-              <w:top w:val="single" w:color="B7C9BC" w:sz="4"/>
-              <w:left w:val="single" w:color="B7C9BC" w:sz="4"/>
-              <w:bottom w:val="single" w:color="B7C9BC" w:sz="4"/>
-              <w:right w:val="single" w:color="B7C9BC" w:sz="4"/>
-            </w:tcBorders>
-            <w:shd w:fill="F5F9F5" w:color="auto" w:val="clear"/>
-            <w:tcMar>
-              <w:top w:type="dxa" w:w="60"/>
-              <w:left w:type="dxa" w:w="100"/>
-              <w:bottom w:type="dxa" w:w="60"/>
-              <w:right w:type="dxa" w:w="100"/>
-            </w:tcMar>
-            <w:vAlign w:val="center"/>
-          </w:tcPr>
-          <w:p>
-            <w:r>
-              <w:rPr>
-                <w:rFonts w:ascii="Consolas" w:cs="Consolas" w:eastAsia="Consolas" w:hAnsi="Consolas"/>
-                <w:color w:val="1D4F7A"/>
-                <w:sz w:val="18"/>
-                <w:szCs w:val="18"/>
-              </w:rPr>
-              <w:t xml:space="preserve">plants/plant01/ai</w:t>
-            </w:r>
-          </w:p>
-        </w:tc>
-        <w:tc>
-          <w:tcPr>
-            <w:tcW w:type="dxa" w:w="2400"/>
-            <w:tcBorders>
-              <w:top w:val="single" w:color="B7C9BC" w:sz="4"/>
-              <w:left w:val="single" w:color="B7C9BC" w:sz="4"/>
-              <w:bottom w:val="single" w:color="B7C9BC" w:sz="4"/>
-              <w:right w:val="single" w:color="B7C9BC" w:sz="4"/>
-            </w:tcBorders>
-            <w:shd w:fill="F5F9F5" w:color="auto" w:val="clear"/>
-            <w:tcMar>
-              <w:top w:type="dxa" w:w="60"/>
-              <w:left w:type="dxa" w:w="100"/>
-              <w:bottom w:type="dxa" w:w="60"/>
-              <w:right w:type="dxa" w:w="100"/>
-            </w:tcMar>
-            <w:vAlign w:val="center"/>
-          </w:tcPr>
-          <w:p>
-            <w:r>
-              <w:rPr>
-                <w:rFonts w:ascii="Arial" w:cs="Arial" w:eastAsia="Arial" w:hAnsi="Arial"/>
-                <w:sz w:val="18"/>
-                <w:szCs w:val="18"/>
-              </w:rPr>
-              <w:t xml:space="preserve">Future AI part (chapter 12)</w:t>
-            </w:r>
-          </w:p>
-        </w:tc>
-        <w:tc>
-          <w:tcPr>
-            <w:tcW w:type="dxa" w:w="2400"/>
-            <w:tcBorders>
-              <w:top w:val="single" w:color="B7C9BC" w:sz="4"/>
-              <w:left w:val="single" w:color="B7C9BC" w:sz="4"/>
-              <w:bottom w:val="single" w:color="B7C9BC" w:sz="4"/>
-              <w:right w:val="single" w:color="B7C9BC" w:sz="4"/>
-            </w:tcBorders>
-            <w:shd w:fill="F5F9F5" w:color="auto" w:val="clear"/>
-            <w:tcMar>
-              <w:top w:type="dxa" w:w="60"/>
-              <w:left w:type="dxa" w:w="100"/>
-              <w:bottom w:type="dxa" w:w="60"/>
-              <w:right w:type="dxa" w:w="100"/>
-            </w:tcMar>
-            <w:vAlign w:val="center"/>
-          </w:tcPr>
-          <w:p>
-            <w:r>
-              <w:rPr>
-                <w:rFonts w:ascii="Arial" w:cs="Arial" w:eastAsia="Arial" w:hAnsi="Arial"/>
-                <w:sz w:val="18"/>
-                <w:szCs w:val="18"/>
-              </w:rPr>
-              <w:t xml:space="preserve">Web, Android (future)</w:t>
-            </w:r>
-          </w:p>
-        </w:tc>
-        <w:tc>
-          <w:tcPr>
-            <w:tcW w:type="dxa" w:w="2606"/>
-            <w:tcBorders>
-              <w:top w:val="single" w:color="B7C9BC" w:sz="4"/>
-              <w:left w:val="single" w:color="B7C9BC" w:sz="4"/>
-              <w:bottom w:val="single" w:color="B7C9BC" w:sz="4"/>
-              <w:right w:val="single" w:color="B7C9BC" w:sz="4"/>
-            </w:tcBorders>
-            <w:shd w:fill="F5F9F5" w:color="auto" w:val="clear"/>
-            <w:tcMar>
-              <w:top w:type="dxa" w:w="60"/>
-              <w:left w:type="dxa" w:w="100"/>
-              <w:bottom w:type="dxa" w:w="60"/>
-              <w:right w:type="dxa" w:w="100"/>
-            </w:tcMar>
-            <w:vAlign w:val="center"/>
-          </w:tcPr>
-          <w:p>
-            <w:r>
-              <w:rPr>
-                <w:rFonts w:ascii="Arial" w:cs="Arial" w:eastAsia="Arial" w:hAnsi="Arial"/>
-                <w:sz w:val="18"/>
-                <w:szCs w:val="18"/>
-              </w:rPr>
-              <w:t xml:space="preserve">Reserved: predictions and AI messages</w:t>
             </w:r>
           </w:p>
         </w:tc>
@@ -14996,18 +13192,6 @@
       </w:pPr>
     </w:lvl>
   </w:abstractNum>
-  <w:abstractNum w:abstractNumId="12" w15:restartNumberingAfterBreak="0">
-    <w:multiLevelType w:val="hybridMultilevel"/>
-    <w:lvl w:ilvl="0" w15:tentative="1">
-      <w:start w:val="1"/>
-      <w:numFmt w:val="decimal"/>
-      <w:lvlText w:val="%1."/>
-      <w:lvlJc w:val="left"/>
-      <w:pPr>
-        <w:ind w:left="500" w:hanging="300"/>
-      </w:pPr>
-    </w:lvl>
-  </w:abstractNum>
   <w:num w:numId="1">
     <w:abstractNumId w:val="1"/>
     <w:lvlOverride w:ilvl="0">
@@ -15070,12 +13254,6 @@
   </w:num>
   <w:num w:numId="11">
     <w:abstractNumId w:val="11"/>
-    <w:lvlOverride w:ilvl="0">
-      <w:startOverride w:val="1"/>
-    </w:lvlOverride>
-  </w:num>
-  <w:num w:numId="12">
-    <w:abstractNumId w:val="12"/>
     <w:lvlOverride w:ilvl="0">
       <w:startOverride w:val="1"/>
     </w:lvlOverride>

</xml_diff>